<commit_message>
Comparisons with Macro Variables and Comments addressed
</commit_message>
<xml_diff>
--- a/docs/documentation/01_diagnostic_review.docx
+++ b/docs/documentation/01_diagnostic_review.docx
@@ -52,7 +52,7 @@
         </w:p>
       </w:sdtContent>
     </w:sdt>
-    <w:bookmarkStart w:id="21" w:name="introduction"/>
+    <w:bookmarkStart w:id="20" w:name="introduction"/>
     <w:p>
       <w:pPr>
         <w:pStyle w:val="Heading1"/>
@@ -108,7 +108,7 @@
       <w:tr>
         <w:tc>
           <w:tcPr/>
-          <w:bookmarkStart w:id="20" w:name="tbl-all-seea-accounts"/>
+          <w:bookmarkStart w:id="19" w:name="tbl-all-seea-accounts"/>
           <w:p>
             <w:pPr>
               <w:jc w:val="center"/>
@@ -2114,7 +2114,7 @@
               </w:tc>
             </w:tr>
           </w:tbl>
-          <w:bookmarkEnd w:id="20"/>
+          <w:bookmarkEnd w:id="19"/>
         </w:tc>
       </w:tr>
     </w:tbl>
@@ -2126,8 +2126,8 @@
         <w:t xml:space="preserve">This work aims to review the NCA data produced for Eastern and Southern Africa and prepare relevant applications that can inform current World Bank priorities and the usability of the data for planning and policy. We conducted a review and comparative analysis of the most recent natural capital accounts (from 2015 onward) prepared by countries in Eastern and Southern Africa, including the Democratic Republic of Congo, Ethiopia, Kenya, Madagascar, Mauritius, Rwanda, Uganda, South Africa, and Zambia.</w:t>
       </w:r>
     </w:p>
-    <w:bookmarkEnd w:id="21"/>
-    <w:bookmarkStart w:id="33" w:name="regional-assessment"/>
+    <w:bookmarkEnd w:id="20"/>
+    <w:bookmarkStart w:id="32" w:name="regional-assessment"/>
     <w:p>
       <w:pPr>
         <w:pStyle w:val="Heading1"/>
@@ -2152,7 +2152,7 @@
         <w:t xml:space="preserve">Accounts are grouped into three broad categories: the SEEA CF covers material and monetary flow and asset accounts; the SEEA EA covers ecosystem extent, condition, services, and monetary asset accounts; and Thematic Accounts cover specialised topics such as forests, ocean, and protected areas.</w:t>
       </w:r>
     </w:p>
-    <w:bookmarkStart w:id="26" w:name="implementation-status"/>
+    <w:bookmarkStart w:id="25" w:name="implementation-status"/>
     <w:p>
       <w:pPr>
         <w:pStyle w:val="Heading2"/>
@@ -2227,7 +2227,7 @@
       <w:tr>
         <w:tc>
           <w:tcPr/>
-          <w:bookmarkStart w:id="25" w:name="fig-stage"/>
+          <w:bookmarkStart w:id="24" w:name="fig-stage"/>
           <w:p>
             <w:pPr>
               <w:pStyle w:val="Compact"/>
@@ -2238,18 +2238,18 @@
                 <wp:inline>
                   <wp:extent cx="5943600" cy="5094514"/>
                   <wp:effectExtent b="0" l="0" r="0" t="0"/>
-                  <wp:docPr descr="" title="" id="23" name="Picture"/>
+                  <wp:docPr descr="" title="" id="22" name="Picture"/>
                   <a:graphic>
                     <a:graphicData uri="http://schemas.openxmlformats.org/drawingml/2006/picture">
                       <pic:pic>
                         <pic:nvPicPr>
-                          <pic:cNvPr descr="01_diagnostic_review_files/figure-docx/fig-stage-1.png" id="24" name="Picture"/>
+                          <pic:cNvPr descr="01_diagnostic_review_files/figure-docx/fig-stage-1.png" id="23" name="Picture"/>
                           <pic:cNvPicPr>
                             <a:picLocks noChangeArrowheads="1" noChangeAspect="1"/>
                           </pic:cNvPicPr>
                         </pic:nvPicPr>
                         <pic:blipFill>
-                          <a:blip r:embed="rId22"/>
+                          <a:blip r:embed="rId21"/>
                           <a:stretch>
                             <a:fillRect/>
                           </a:stretch>
@@ -2289,12 +2289,12 @@
               <w:t xml:space="preserve">Figure 1: AFE countries by SEEA implementation stage and number of compiled accounts. Countries are sorted by compiled account count; non-implementing countries are shown in grey.</w:t>
             </w:r>
           </w:p>
-          <w:bookmarkEnd w:id="25"/>
+          <w:bookmarkEnd w:id="24"/>
         </w:tc>
       </w:tr>
     </w:tbl>
-    <w:bookmarkEnd w:id="26"/>
-    <w:bookmarkStart w:id="32" w:name="account-coverage"/>
+    <w:bookmarkEnd w:id="25"/>
+    <w:bookmarkStart w:id="31" w:name="account-coverage"/>
     <w:p>
       <w:pPr>
         <w:pStyle w:val="Heading2"/>
@@ -2324,7 +2324,7 @@
       <w:tr>
         <w:tc>
           <w:tcPr/>
-          <w:bookmarkStart w:id="30" w:name="fig-heatmap"/>
+          <w:bookmarkStart w:id="29" w:name="fig-heatmap"/>
           <w:p>
             <w:pPr>
               <w:pStyle w:val="Compact"/>
@@ -2335,18 +2335,18 @@
                 <wp:inline>
                   <wp:extent cx="5943600" cy="4622800"/>
                   <wp:effectExtent b="0" l="0" r="0" t="0"/>
-                  <wp:docPr descr="" title="" id="28" name="Picture"/>
+                  <wp:docPr descr="" title="" id="27" name="Picture"/>
                   <a:graphic>
                     <a:graphicData uri="http://schemas.openxmlformats.org/drawingml/2006/picture">
                       <pic:pic>
                         <pic:nvPicPr>
-                          <pic:cNvPr descr="01_diagnostic_review_files/figure-docx/fig-heatmap-1.png" id="29" name="Picture"/>
+                          <pic:cNvPr descr="01_diagnostic_review_files/figure-docx/fig-heatmap-1.png" id="28" name="Picture"/>
                           <pic:cNvPicPr>
                             <a:picLocks noChangeArrowheads="1" noChangeAspect="1"/>
                           </pic:cNvPicPr>
                         </pic:nvPicPr>
                         <pic:blipFill>
-                          <a:blip r:embed="rId27"/>
+                          <a:blip r:embed="rId26"/>
                           <a:stretch>
                             <a:fillRect/>
                           </a:stretch>
@@ -2386,7 +2386,7 @@
               <w:t xml:space="preserve">Figure 2: Account compilation status across the 11 implementing AFE countries, grouped by account category. Countries are ordered left to right by total number of compiled accounts; accounts within each group are ordered by frequency of compilation.</w:t>
             </w:r>
           </w:p>
-          <w:bookmarkEnd w:id="30"/>
+          <w:bookmarkEnd w:id="29"/>
         </w:tc>
       </w:tr>
     </w:tbl>
@@ -2422,7 +2422,7 @@
       <w:tr>
         <w:tc>
           <w:tcPr/>
-          <w:bookmarkStart w:id="31" w:name="tbl-group-summary"/>
+          <w:bookmarkStart w:id="30" w:name="tbl-group-summary"/>
           <w:p>
             <w:pPr>
               <w:jc w:val="center"/>
@@ -2848,28 +2848,116 @@
               </w:tc>
             </w:tr>
           </w:tbl>
-          <w:bookmarkEnd w:id="31"/>
+          <w:bookmarkEnd w:id="30"/>
         </w:tc>
       </w:tr>
     </w:tbl>
+    <w:bookmarkEnd w:id="31"/>
     <w:bookmarkEnd w:id="32"/>
+    <w:bookmarkStart w:id="45" w:name="general-findings-and-policy-insights"/>
+    <w:p>
+      <w:pPr>
+        <w:pStyle w:val="Heading1"/>
+      </w:pPr>
+      <w:r>
+        <w:t xml:space="preserve">3. General findings and policy insights</w:t>
+      </w:r>
+    </w:p>
+    <w:bookmarkStart w:id="33" w:name="water-accounts"/>
+    <w:p>
+      <w:pPr>
+        <w:pStyle w:val="Heading2"/>
+      </w:pPr>
+      <w:r>
+        <w:t xml:space="preserve">3.1 Water accounts</w:t>
+      </w:r>
+    </w:p>
+    <w:p>
+      <w:pPr>
+        <w:pStyle w:val="FirstParagraph"/>
+      </w:pPr>
+      <w:r>
+        <w:t xml:space="preserve">Water accounts are the most widely compiled component of SEEA implementation in the AFE region and the most directly actionable for policy. Six countries have compiled physical supply and use tables for water, and Rwanda has gone further to produce monetary supply and use tables, the only such account in Africa, linking water flows to GDP through sector-level water productivity estimates. Rwanda’s monetary accounts reveal that agriculture accounts for over 96 percent of total freshwater abstraction but achieves a water productivity of only 118 Rwf per cubic metre (118 Rwf/m³), compared to 6,236 Rwf/m³ for mining and 9,300-11,600 Rwf/m³ for services; GDP grew 25 percent while water use grew only 10 percent between 2012 and 2015, a decoupling signal that would be invisible in standard national accounts</w:t>
+      </w:r>
+      <w:r>
+        <w:t xml:space="preserve"> </w:t>
+      </w:r>
+      <w:r>
+        <w:t xml:space="preserve">(Government of Rwanda, 2019b)</w:t>
+      </w:r>
+      <w:r>
+        <w:t xml:space="preserve">. This means that the economy requires progressively less water to produce the same amount of GDP, which suggests that the economy is becoming more efficient in using water. Uganda’s tenth-iteration water accounts further extend this approach. National water productivity reached UGX 5,557 per m³ consumed in 2024 (84 percent above the 2015 baseline) but oil sector abstraction grew 113.9 percent year-on-year, signalling an emerging demand that the time-series accounts are uniquely positioned to track</w:t>
+      </w:r>
+      <w:r>
+        <w:t xml:space="preserve"> </w:t>
+      </w:r>
+      <w:r>
+        <w:t xml:space="preserve">(Uganda Bureau of Statistics, 2025)</w:t>
+      </w:r>
+      <w:r>
+        <w:t xml:space="preserve">.</w:t>
+      </w:r>
+    </w:p>
+    <w:p>
+      <w:pPr>
+        <w:pStyle w:val="BodyText"/>
+      </w:pPr>
+      <w:r>
+        <w:t xml:space="preserve">A consistent finding across physical water accounts is that national-level aggregates conceal stark spatial heterogeneity. Kenya’s accounts document a tenfold range in per-capita water availability across basins, from 8 m³ per person per year in Lake Victoria South to 91 m³ in the Tana basin, while the Rift Valley shows groundwater abstraction exceeding 100 percent of sustainable yield</w:t>
+      </w:r>
+      <w:r>
+        <w:t xml:space="preserve"> </w:t>
+      </w:r>
+      <w:r>
+        <w:t xml:space="preserve">(World Bank &amp; Prime Africa Consult, 2025)</w:t>
+      </w:r>
+      <w:r>
+        <w:t xml:space="preserve">. South Africa’s Strategic Water Source Area (SWSA) accounts demonstrate that three of the 22 SWSAs, which together supply approximately two thirds of national economic activity from just 8.2 percent of land area, have already fallen below the 60 percent natural land cover threshold necessary for functional water production</w:t>
+      </w:r>
+      <w:r>
+        <w:t xml:space="preserve"> </w:t>
+      </w:r>
+      <w:r>
+        <w:t xml:space="preserve">(Statistics South Africa, 2023)</w:t>
+      </w:r>
+      <w:r>
+        <w:t xml:space="preserve">. Zambia frames water not only as a production input but as a macroeconomic vulnerability, because Lake Kariba fell below 15 percent of capacity in 2016 and again in 2024, in each case triggering nationwide load-shedding, while the 2023/24 El Niño drought simultaneously crippled hydropower generation and destroyed the maize harvest, illustrating the dual pathway through which hydrological shocks propagate into the economy</w:t>
+      </w:r>
+      <w:r>
+        <w:t xml:space="preserve"> </w:t>
+      </w:r>
+      <w:r>
+        <w:t xml:space="preserve">(Chisanga et al., 2026)</w:t>
+      </w:r>
+      <w:r>
+        <w:t xml:space="preserve">.</w:t>
+      </w:r>
+    </w:p>
+    <w:p>
+      <w:pPr>
+        <w:pStyle w:val="BodyText"/>
+      </w:pPr>
+      <w:r>
+        <w:t xml:space="preserve">Distribution losses and infrastructure condition are a recurring theme across reviewed accounts. Mauritius, which maintains the most institutionalized water accounting programme in the region (fifth consecutive edition), records a rate of 64.6 percent of unaccounted-for water in the Central Water Authority network, which was up from 56.4 percent in 2013, meaning nearly two-thirds of treated potable water is lost before reaching end users, despite 99.8 percent national access to safely managed drinking water</w:t>
+      </w:r>
+      <w:r>
+        <w:t xml:space="preserve"> </w:t>
+      </w:r>
+      <w:r>
+        <w:t xml:space="preserve">(Statistics Mauritius, 2024)</w:t>
+      </w:r>
+      <w:r>
+        <w:t xml:space="preserve">. Rwanda’s Water and Sanitation Corporation (WASAC) utility loses 41 percent of output in distribution losses (US$8.7 million per year in foregone revenue) and Uganda’s supply chain records distribution losses of 34.8 percent. Taken together, these figures, directly readable from water supply and use tables, provide the economic argument for infrastructure investment.</w:t>
+      </w:r>
+    </w:p>
     <w:bookmarkEnd w:id="33"/>
-    <w:bookmarkStart w:id="46" w:name="general-findings-and-policy-insights"/>
-    <w:p>
-      <w:pPr>
-        <w:pStyle w:val="Heading1"/>
-      </w:pPr>
-      <w:r>
-        <w:t xml:space="preserve">3. General findings and policy insights</w:t>
-      </w:r>
-    </w:p>
-    <w:bookmarkStart w:id="34" w:name="water-accounts"/>
+    <w:bookmarkStart w:id="34" w:name="land-accounts"/>
     <w:p>
       <w:pPr>
         <w:pStyle w:val="Heading2"/>
       </w:pPr>
       <w:r>
-        <w:t xml:space="preserve">3.1 Water accounts</w:t>
+        <w:t xml:space="preserve">3.2 Land accounts</w:t>
       </w:r>
     </w:p>
     <w:p>
@@ -2877,7 +2965,263 @@
         <w:pStyle w:val="FirstParagraph"/>
       </w:pPr>
       <w:r>
-        <w:t xml:space="preserve">Water accounts are the most widely compiled component of SEEA implementation in the AFE region and the most directly actionable for policy. Six countries have compiled physical supply and use tables for water, and Rwanda has gone further to produce monetary supply and use tables, the only such account in Africa, linking water flows to GDP through sector-level water productivity estimates. Rwanda’s monetary accounts reveal that agriculture accounts for over 96 percent of total freshwater abstraction but achieves a water productivity of only 118 Rwf per cubic metre (118 Rwf/m³), compared to 6,236 Rwf/m³ for mining and 9,300-11,600 Rwf/m³ for services; GDP grew 25 percent while water use grew only 10 percent between 2012 and 2015, a decoupling signal that would be invisible in standard national accounts</w:t>
+        <w:t xml:space="preserve">Land accounts are the most universal entry point into SEEA implementation, because every country in this review has compiled at least one form of land cover or land use change account. The consistent finding throughout the implementations suggests accelerating cropland expansion at the expense of natural vegetation, but the policy implications depend critically on whether accounts track conversion pathways rather than just net change. In Ethiopia, cropland expanded from 21.7 to 25.9 million hectares between 2013 and 2022, which is a 20 percent increase, while built-up area grew 50 percent, yet the accounts caution that an observed 22 percent increase in forest cover over the same period reflects definitional and source-data differences as much as any ecological recovery</w:t>
+      </w:r>
+      <w:r>
+        <w:t xml:space="preserve"> </w:t>
+      </w:r>
+      <w:r>
+        <w:t xml:space="preserve">(Federal Democratic Republic of Ethiopia, 2026)</w:t>
+      </w:r>
+      <w:r>
+        <w:t xml:space="preserve">. Rwanda presents the sharpest land transition in the region, where cropland rose from 24.2 to 51.7 percent of national territory between 1990 and 2015 as sparse forest lost 673,137 hectares and average farm parcels shrank to 0.184 hectares. This land fragmentation threshold limits mechanization and economic transformation</w:t>
+      </w:r>
+      <w:r>
+        <w:t xml:space="preserve"> </w:t>
+      </w:r>
+      <w:r>
+        <w:t xml:space="preserve">(Government of Rwanda, 2018)</w:t>
+      </w:r>
+      <w:r>
+        <w:t xml:space="preserve">. The intensity of land use change in Rwanda is reflected in formal land market data, where transaction prices averaged 35 million Rwf per hectare in urban areas.</w:t>
+      </w:r>
+    </w:p>
+    <w:p>
+      <w:pPr>
+        <w:pStyle w:val="BodyText"/>
+      </w:pPr>
+      <w:r>
+        <w:t xml:space="preserve">South Africa’s accounts occupy the most technically advanced position in the region, combining ecosystem extent indices, classification hierarchies, and turnover metrics over three decades. A central finding is that while natural land nationally remained broadly stable (+0.8 percent), pivot irrigation expanded 221 percent between 1990 and 2018, the mine footprint grew 15.9 percent, and 18 percent of ecosystem types have already crossed the 60 percent natural cover threshold associated with ecosystem dysfunction</w:t>
+      </w:r>
+      <w:r>
+        <w:t xml:space="preserve"> </w:t>
+      </w:r>
+      <w:r>
+        <w:t xml:space="preserve">(Statistics South Africa, 2020)</w:t>
+      </w:r>
+      <w:r>
+        <w:t xml:space="preserve">. Kenya’s accounts contribute a methodologically important approach to transition analysis. Rather than presenting static totals, the land accounts compute a spatial backbone for county-level disaggregation and map conversion flows. These show a net forest loss of 342,793 hectares across 1990-2024, making it possible to identify where interventions such as restoration, conservation employment, or zoning changes would be most effective</w:t>
+      </w:r>
+      <w:r>
+        <w:t xml:space="preserve"> </w:t>
+      </w:r>
+      <w:r>
+        <w:t xml:space="preserve">(Turpie, Wilson, Hickinbotham, et al., 2025)</w:t>
+      </w:r>
+      <w:r>
+        <w:t xml:space="preserve">. Zambia’s accounts add a sub-national degradation lens, with the National Ecosystem Degradation Index (NEDI) showing that Eastern Province (5.25 percent) is degrading at nearly four times the national average (1.44 percent), driven by a woodland-to-cropland conversion pattern distinct from more stable provinces in the north-west</w:t>
+      </w:r>
+      <w:r>
+        <w:t xml:space="preserve"> </w:t>
+      </w:r>
+      <w:r>
+        <w:t xml:space="preserve">(Chisanga et al., 2026)</w:t>
+      </w:r>
+      <w:r>
+        <w:t xml:space="preserve">. Across the region, the key advancement needed is the addition of monetary land accounts: currently, no country has compiled formal monetary values for land assets within the SEEA framework, limiting the ability to link land conversion to GDP or wealth accounts.</w:t>
+      </w:r>
+    </w:p>
+    <w:bookmarkEnd w:id="34"/>
+    <w:bookmarkStart w:id="35" w:name="energy-accounts"/>
+    <w:p>
+      <w:pPr>
+        <w:pStyle w:val="Heading2"/>
+      </w:pPr>
+      <w:r>
+        <w:t xml:space="preserve">3.3 Energy accounts</w:t>
+      </w:r>
+    </w:p>
+    <w:p>
+      <w:pPr>
+        <w:pStyle w:val="FirstParagraph"/>
+      </w:pPr>
+      <w:r>
+        <w:t xml:space="preserve">Energy accounts remain the least compiled component in the AFE review, but where they exist they reveal a structural tension between physical and monetary energy realities that is directly relevant to the energy transition. Kenya’s monetary energy supply and use tables, which are among the first in Sub-Saharan Africa, show that biomass dominates total primary energy supply in physical terms (1.2 million TJ) but that household monetary expenditures are concentrated on electricity and petroleum products (total supply value KES 580.5 billion; household spending KES 749.8 billion), with biomass essentially unpriced in market terms</w:t>
+      </w:r>
+      <w:r>
+        <w:t xml:space="preserve"> </w:t>
+      </w:r>
+      <w:r>
+        <w:t xml:space="preserve">(World Bank &amp; Prime Africa Consult, 2025)</w:t>
+      </w:r>
+      <w:r>
+        <w:t xml:space="preserve">. This divergence between physical and monetary accounts is policy-critical, because it means that energy subsidies, fuel taxes, and electricity tariffs are calibrated to a monetized minority of total energy use, while the majority (rural biomass) remains outside the price and fiscal system.</w:t>
+      </w:r>
+    </w:p>
+    <w:p>
+      <w:pPr>
+        <w:pStyle w:val="BodyText"/>
+      </w:pPr>
+      <w:r>
+        <w:t xml:space="preserve">South Africa’s accounts represent the region’s most developed energy time series, with coal supplying 72.2 percent of total domestic energy but oil being 93.1 percent import-dependent, creating structural resilience asymmetries</w:t>
+      </w:r>
+      <w:r>
+        <w:t xml:space="preserve"> </w:t>
+      </w:r>
+      <w:r>
+        <w:t xml:space="preserve">(Statistics South Africa, 2025)</w:t>
+      </w:r>
+      <w:r>
+        <w:t xml:space="preserve">. Mining and quarrying consumes 1.21 TJ per million Rand of gross value added, taking the spot as the most energy-intensive sector, and household biofuels account for 46.5 percent of residential energy, a share that has barely changed over the decade of accounts available. The biomass-forest nexus is especially pronounced for the DRC (94 percent of national energy from biomass), Uganda (78 percent), and Zambia (78 percent), where fuelwood harvesting is a direct driver of deforestation quantified in the forest and ecosystem accounts. DRC’s forest accounts document a 709 percent increase in fuelwood harvesting in forest-farm mosaic areas over 2000-2020, making the energy-land connection explicit in physical terms and providing a basis for costing energy transition investments</w:t>
+      </w:r>
+      <w:r>
+        <w:t xml:space="preserve"> </w:t>
+      </w:r>
+      <w:r>
+        <w:t xml:space="preserve">(Turpie, Wilson, Brühl, et al., 2025)</w:t>
+      </w:r>
+      <w:r>
+        <w:t xml:space="preserve">.</w:t>
+      </w:r>
+    </w:p>
+    <w:bookmarkEnd w:id="35"/>
+    <w:bookmarkStart w:id="36" w:name="ecosystem-accounts"/>
+    <w:p>
+      <w:pPr>
+        <w:pStyle w:val="Heading2"/>
+      </w:pPr>
+      <w:r>
+        <w:t xml:space="preserve">3.4 Ecosystem accounts</w:t>
+      </w:r>
+    </w:p>
+    <w:p>
+      <w:pPr>
+        <w:pStyle w:val="FirstParagraph"/>
+      </w:pPr>
+      <w:r>
+        <w:t xml:space="preserve">Ecosystem accounts are the most analytically powerful component of SEEA but also the most demanding to compile, and the AFE region shows a clear gradient from comprehensive forest accounts in the DRC to largely physical land-ecosystem hybrids in Ethiopia and Madagascar. Where monetary ecosystem service valuations have been produced, they reveal contributions to economic welfare that national accounts systematically miss. Kenya’s monetary ecosystem service accounts estimate total services at KSh 247 billion per year, which is equivalent to 1.8 percent of GDP, with livestock grazing being the dominant service (KSh 185 billion), followed by nature-based tourism (KSh 38 billion) and sediment retention (KSh 24 billion)</w:t>
+      </w:r>
+      <w:r>
+        <w:t xml:space="preserve"> </w:t>
+      </w:r>
+      <w:r>
+        <w:t xml:space="preserve">(Turpie, Wilson, Hickinbotham, et al., 2025)</w:t>
+      </w:r>
+      <w:r>
+        <w:t xml:space="preserve">. South Africa’s biodiversity economy accounts estimate that biodiversity tourism contributed R27.7 billion to GDP (0.4-0.5 percent) and supported 91,836 direct jobs in 2019, figures that can be tracked over time to assess the economic case for conservation and mixed agroforestry systems</w:t>
+      </w:r>
+      <w:r>
+        <w:t xml:space="preserve"> </w:t>
+      </w:r>
+      <w:r>
+        <w:t xml:space="preserve">(Statistics South Africa, 2024)</w:t>
+      </w:r>
+      <w:r>
+        <w:t xml:space="preserve">.</w:t>
+      </w:r>
+    </w:p>
+    <w:p>
+      <w:pPr>
+        <w:pStyle w:val="BodyText"/>
+      </w:pPr>
+      <w:r>
+        <w:t xml:space="preserve">The DRC’s accounts illustrate both the ceiling of what is currently achievable and the challenge of translating global ecological value into national incentive. Total forest ecosystem services were valued at US$706 billion per year in 2020, including global climate regulation at the social cost of carbon (US$79.86/tonne CO₂), but the domestically captured portion, excluding carbon externalities priced globally, was only US$3.3 billion per year</w:t>
+      </w:r>
+      <w:r>
+        <w:t xml:space="preserve"> </w:t>
+      </w:r>
+      <w:r>
+        <w:t xml:space="preserve">(Turpie, Wilson, Brühl, et al., 2025)</w:t>
+      </w:r>
+      <w:r>
+        <w:t xml:space="preserve">. The gap between global and domestic value is the economic explanation for continued deforestation. The deforestation rate doubled from 0.5 to 0.8 percent per year between 2000 and 2020, and forest depletion costs grew 113 percent between 2010 and 2020, yet these losses accrue to livelihoods too diffuse and informal to be captured in national accounts. The accounts also document that bushmeat extraction is 64 percent above sustainable yield, which is a physical condition indicator with direct food security implications, and that the total forest asset value declined from US$12.0 trillion in 2000 to US$10.3 trillion in 2020; a national wealth loss of US$1.7 trillion that would appear in a SEEA-compliant balance sheet.</w:t>
+      </w:r>
+    </w:p>
+    <w:p>
+      <w:pPr>
+        <w:pStyle w:val="BodyText"/>
+      </w:pPr>
+      <w:r>
+        <w:t xml:space="preserve">Physical ecosystem accounts in Ethiopia and Rwanda demonstrate how regulating services, which are often omitted from monetary analyses, can be quantified at hydrological scales relevant to investment decisions. Ethiopia’s accounts estimate that 29.7 billion tonnes of soil erosion was avoided annually by existing land cover, but that baseflow declined by 1.3 percent and flood mitigation capacity by 2.7 percent over the accounting period, and that Addis Ababa’s rapid urbanization reduced catchment water yield by 2,691 m³ per hectare</w:t>
+      </w:r>
+      <w:r>
+        <w:t xml:space="preserve"> </w:t>
+      </w:r>
+      <w:r>
+        <w:t xml:space="preserve">(Rutebuka et al., 2025)</w:t>
+      </w:r>
+      <w:r>
+        <w:t xml:space="preserve">. Rwanda’s ecosystem accounts track soil erosion increasing 54 percent, sediment export, 123 percent, and quickflow, 35 percent, between 1990 and 2015. These are quantified degradation trends driven by the same cropland expansion documented in the land accounts, while baseflow declined 11 percent nationally and 29-32 percent in peri-urban districts</w:t>
+      </w:r>
+      <w:r>
+        <w:t xml:space="preserve"> </w:t>
+      </w:r>
+      <w:r>
+        <w:t xml:space="preserve">(Government of Rwanda, 2019a)</w:t>
+      </w:r>
+      <w:r>
+        <w:t xml:space="preserve">. These accounts close the feedback loop between land use change and hydrological service provision in a way that land accounts alone cannot.</w:t>
+      </w:r>
+    </w:p>
+    <w:bookmarkEnd w:id="36"/>
+    <w:bookmarkStart w:id="44" w:name="X140e3db80294dff0d7fa8d95000122aedbfe09f"/>
+    <w:p>
+      <w:pPr>
+        <w:pStyle w:val="Heading2"/>
+      </w:pPr>
+      <w:r>
+        <w:t xml:space="preserve">3.5 Common Data Gaps and Systemic Recommendations</w:t>
+      </w:r>
+    </w:p>
+    <w:p>
+      <w:pPr>
+        <w:pStyle w:val="FirstParagraph"/>
+      </w:pPr>
+      <w:r>
+        <w:t xml:space="preserve">A detailed review of the reports underpinning the Annex reveals that data gaps and institutional constraints follow recurring patterns across countries, but with important country-specific dimensions that inform where targeted support would yield the greatest returns. The following subsections organize these findings around six themes.</w:t>
+      </w:r>
+    </w:p>
+    <w:bookmarkStart w:id="37" w:name="data-infrastructure-and-monitoring-gaps"/>
+    <w:p>
+      <w:pPr>
+        <w:pStyle w:val="Heading3"/>
+      </w:pPr>
+      <w:r>
+        <w:t xml:space="preserve">3.5.1 Data Infrastructure and Monitoring Gaps</w:t>
+      </w:r>
+    </w:p>
+    <w:p>
+      <w:pPr>
+        <w:pStyle w:val="FirstParagraph"/>
+      </w:pPr>
+      <w:r>
+        <w:t xml:space="preserve">Measurement infrastructure for the primary inputs to SEEA accounts remains underdeveloped across the region. In Zambia, the water accounts explicitly acknowledge that a fully SEEA-Water-compliant national account has not yet been institutionalized, with groundwater abstraction</w:t>
+      </w:r>
+      <w:r>
+        <w:t xml:space="preserve"> </w:t>
+      </w:r>
+      <w:r>
+        <w:t xml:space="preserve">“largely unmetered”</w:t>
+      </w:r>
+      <w:r>
+        <w:t xml:space="preserve"> </w:t>
+      </w:r>
+      <w:r>
+        <w:t xml:space="preserve">and monitoring networks</w:t>
+      </w:r>
+      <w:r>
+        <w:t xml:space="preserve"> </w:t>
+      </w:r>
+      <w:r>
+        <w:t xml:space="preserve">“remaining sparse”</w:t>
+      </w:r>
+      <w:r>
+        <w:t xml:space="preserve"> </w:t>
+      </w:r>
+      <w:r>
+        <w:t xml:space="preserve">(Chisanga et al., 2026)</w:t>
+      </w:r>
+      <w:r>
+        <w:t xml:space="preserve">. Kenya identifies the Rift Valley basin as a groundwater stress hotspot where the use-to-availability ratio exceeds 100 percent, yet no remediation monitoring is in place. The accounts also state that water quality accounts, covering nutrient pollution, dissolved oxygen, and fluoride, are urgently needed but not yet compiled</w:t>
+      </w:r>
+      <w:r>
+        <w:t xml:space="preserve"> </w:t>
+      </w:r>
+      <w:r>
+        <w:t xml:space="preserve">(World Bank &amp; Prime Africa Consult, 2025)</w:t>
+      </w:r>
+      <w:r>
+        <w:t xml:space="preserve">. Rwanda projects demand growing tenfold by 2040 driven by irrigation, yet the current monitoring network was designed for far lower abstraction rates, creating a foreseeable data gap at the moment when it would be most policy-critical</w:t>
       </w:r>
       <w:r>
         <w:t xml:space="preserve"> </w:t>
@@ -2886,7 +3230,25 @@
         <w:t xml:space="preserve">(Government of Rwanda, 2019b)</w:t>
       </w:r>
       <w:r>
-        <w:t xml:space="preserve">. This means that the economy requires progressively less water to produce the same amount of GDP, which suggests that the economy is becoming more efficient in using water. Uganda’s tenth-iteration water accounts further extend this approach. National water productivity reached UGX 5,557 per m³ consumed in 2024 (84 percent above the 2015 baseline) but oil sector abstraction grew 113.9 percent year-on-year, signalling an emerging demand that the time-series accounts are uniquely positioned to track</w:t>
+        <w:t xml:space="preserve">. Distribution losses, which are a key diagnostic for infrastructure investment, are substantial but inconsistently tracked. For example, Mauritius records 64.6 percent unaccounted-for water in the CWA network, worsening from 56.4 percent in 2013, yet no monetary cost-of-leakage calculation has been compiled</w:t>
+      </w:r>
+      <w:r>
+        <w:t xml:space="preserve"> </w:t>
+      </w:r>
+      <w:r>
+        <w:t xml:space="preserve">(Statistics Mauritius, 2024)</w:t>
+      </w:r>
+      <w:r>
+        <w:t xml:space="preserve">; the Water And Sanitation Corporation (WASAC) in Rwanda achieves only 75 percent cost recovery, with non-revenue water at 41 percent (US$8.7 million per year)</w:t>
+      </w:r>
+      <w:r>
+        <w:t xml:space="preserve"> </w:t>
+      </w:r>
+      <w:r>
+        <w:t xml:space="preserve">(Government of Rwanda, 2019b)</w:t>
+      </w:r>
+      <w:r>
+        <w:t xml:space="preserve">; and Uganda’s supply chain records distribution losses of 34.8 percent in a system where daily consumption per-household is already well below basic-needs thresholds</w:t>
       </w:r>
       <w:r>
         <w:t xml:space="preserve"> </w:t>
@@ -2895,728 +3257,372 @@
         <w:t xml:space="preserve">(Uganda Bureau of Statistics, 2025)</w:t>
       </w:r>
       <w:r>
+        <w:t xml:space="preserve">. In the DRC, poverty and inequality data remain outdated, with the most recent Gini coefficient (42.1) dating from 2012 and poverty headcount from 2004, while gross national savings data for 2000 are simply absent, preventing the calculation of adjusted net savings for that year</w:t>
+      </w:r>
+      <w:r>
+        <w:t xml:space="preserve"> </w:t>
+      </w:r>
+      <w:r>
+        <w:t xml:space="preserve">(Turpie, Wilson, Brühl, et al., 2025)</w:t>
+      </w:r>
+      <w:r>
+        <w:t xml:space="preserve">. Energy monitoring in DRC, Uganda, and Zambia all face the same structural gap, related to informal and subsistence biomass flows, which represent 78 percent of national energy in Uganda and Zambia and 94 percent in the DRC. In all three cases, these are estimated rather than measured, introducing material uncertainty into energy and forest supply-use balances</w:t>
+      </w:r>
+      <w:r>
+        <w:t xml:space="preserve"> </w:t>
+      </w:r>
+      <w:r>
+        <w:t xml:space="preserve">(Chisanga et al., 2026; Turpie, Wilson, Brühl, et al., 2025; Uganda Bureau of Statistics, 2020)</w:t>
+      </w:r>
+      <w:r>
         <w:t xml:space="preserve">.</w:t>
       </w:r>
     </w:p>
+    <w:bookmarkEnd w:id="37"/>
+    <w:bookmarkStart w:id="38" w:name="X62a9d9108090f6afabb2e2ac0a65809a10abb3a"/>
+    <w:p>
+      <w:pPr>
+        <w:pStyle w:val="Heading3"/>
+      </w:pPr>
+      <w:r>
+        <w:t xml:space="preserve">3.5.2 Classification and Cross-Country Comparability</w:t>
+      </w:r>
+    </w:p>
+    <w:p>
+      <w:pPr>
+        <w:pStyle w:val="FirstParagraph"/>
+      </w:pPr>
+      <w:r>
+        <w:t xml:space="preserve">The forest cover data across the region illustrate the depth of the classification problem. Ethiopia’s accounts document a 22 percent increase in total forest cover between 2013 and 2022. However, the report explicitly cautions that</w:t>
+      </w:r>
+      <w:r>
+        <w:t xml:space="preserve"> </w:t>
+      </w:r>
+      <w:r>
+        <w:t xml:space="preserve">“differences in data sources, forest definitions, and canopy cover sensitivity to rainfall make it difficult to apportion change between ecological dynamics and reclassification,”</w:t>
+      </w:r>
+      <w:r>
+        <w:t xml:space="preserve"> </w:t>
+      </w:r>
+      <w:r>
+        <w:t xml:space="preserve">putting into question whether observed gains represent true restoration or methodological nuances</w:t>
+      </w:r>
+      <w:r>
+        <w:t xml:space="preserve"> </w:t>
+      </w:r>
+      <w:r>
+        <w:t xml:space="preserve">(Federal Democratic Republic of Ethiopia, 2026)</w:t>
+      </w:r>
+      <w:r>
+        <w:t xml:space="preserve">. Zambia’s ecosystem extent accounts use MODIS satellite data with classification boundaries that differ from national land cover data, so that some biome extent totals exceed what would be expected from the national territory, and the accounts interpret percentage changes as more reliable than absolute areas</w:t>
+      </w:r>
+      <w:r>
+        <w:t xml:space="preserve"> </w:t>
+      </w:r>
+      <w:r>
+        <w:t xml:space="preserve">(Chisanga et al., 2026)</w:t>
+      </w:r>
+      <w:r>
+        <w:t xml:space="preserve">. The DRC uses fifteen ecosystem types including forest-farm mosaic as a distinct class; this level of granularity enables important policy insights. For example, a mosaic expansion of 83 percent in 2000-2010 and 96 percent in 2010-2020 reveal an important agricultural frontier dynamic. However, at the same time it makes comparison with neighbouring countries’ simpler classification schemes difficult</w:t>
+      </w:r>
+      <w:r>
+        <w:t xml:space="preserve"> </w:t>
+      </w:r>
+      <w:r>
+        <w:t xml:space="preserve">(Turpie, Wilson, Brühl, et al., 2025)</w:t>
+      </w:r>
+      <w:r>
+        <w:t xml:space="preserve">. Madagascar, Ethiopia, and Zambia all rely on remotely sensed vegetation indices as primary condition indicators, without consistent field validation or cross-country calibration of thresholds. Kenya’s ecosystem condition accounts find that no forest ecosystem achieves a condition score above 60 percent nationally. This is a finding that may reflect genuine degradation but also the choice of reference state and indicator sensitivity</w:t>
+      </w:r>
+      <w:r>
+        <w:t xml:space="preserve"> </w:t>
+      </w:r>
+      <w:r>
+        <w:t xml:space="preserve">(Turpie, Wilson, Hickinbotham, et al., 2025)</w:t>
+      </w:r>
+      <w:r>
+        <w:t xml:space="preserve">. Harmonizing forest and land cover classification systems across the AFE region, even through common reporting categories alongside national definitions, would substantially improve the analytical value of cross-country comparison.</w:t>
+      </w:r>
+    </w:p>
+    <w:bookmarkEnd w:id="38"/>
+    <w:bookmarkStart w:id="39" w:name="monetary-valuation-gaps"/>
+    <w:p>
+      <w:pPr>
+        <w:pStyle w:val="Heading3"/>
+      </w:pPr>
+      <w:r>
+        <w:t xml:space="preserve">3.5.3 Monetary Valuation Gaps</w:t>
+      </w:r>
+    </w:p>
+    <w:p>
+      <w:pPr>
+        <w:pStyle w:val="FirstParagraph"/>
+      </w:pPr>
+      <w:r>
+        <w:t xml:space="preserve">The absence of monetary ecosystem service accounts remains the most consequential gap for the policy applications that national capital accounting is intended to support. Ethiopia’s accounts are fully physical across all seven ecosystem services, with monetary valuation explicitly deferred to a future phase</w:t>
+      </w:r>
+      <w:r>
+        <w:t xml:space="preserve"> </w:t>
+      </w:r>
+      <w:r>
+        <w:t xml:space="preserve">(Rutebuka et al., 2025)</w:t>
+      </w:r>
+      <w:r>
+        <w:t xml:space="preserve">. Madagascar likewise has no monetary accounts. The economic analysis of hydropower losses, agricultural productivity costs, and carbon opportunity costs was computed as part of a companion report with no official publication</w:t>
+      </w:r>
+      <w:r>
+        <w:t xml:space="preserve"> </w:t>
+      </w:r>
+      <w:r>
+        <w:t xml:space="preserve">(Vogl et al., 2022)</w:t>
+      </w:r>
+      <w:r>
+        <w:t xml:space="preserve">. Rwanda’s ecosystem accounts cover soil erosion, sediment export, water yield, and quickflow in physical units only, despite Rwanda being one of two countries in the region with monetary water supply and use tables</w:t>
+      </w:r>
+      <w:r>
+        <w:t xml:space="preserve"> </w:t>
+      </w:r>
+      <w:r>
+        <w:t xml:space="preserve">(Government of Rwanda, 2019a)</w:t>
+      </w:r>
+      <w:r>
+        <w:t xml:space="preserve">. In Zambia, the only monetary ecosystem services estimate available is the net present value of carbon stock loss, which amounts to USD 46 million over 2018-2023, while the Bangweulu wetlands ecosystem services (US$11.7 million per year) and the fish production sector (US$422.6 million in 2023) remain outside the formal NCA monetary framework</w:t>
+      </w:r>
+      <w:r>
+        <w:t xml:space="preserve"> </w:t>
+      </w:r>
+      <w:r>
+        <w:t xml:space="preserve">(Chisanga et al., 2026)</w:t>
+      </w:r>
+      <w:r>
+        <w:t xml:space="preserve">. The DRC’s forest accounts, while the most comprehensive in the region for forest ecosystems, illustrate the valuation challenge. The total monetary value of forest ecosystem services including global climate regulation was US$706 billion per year in 2020, which is a figure that includes the social cost of carbon at US$79.86 per tonne CO₂, but the domestically captured benefit (excluding carbon externalities) was only US$3.3 billion per year, creating a vast gap between global value and national incentives</w:t>
+      </w:r>
+      <w:r>
+        <w:t xml:space="preserve"> </w:t>
+      </w:r>
+      <w:r>
+        <w:t xml:space="preserve">(Turpie, Wilson, Brühl, et al., 2025)</w:t>
+      </w:r>
+      <w:r>
+        <w:t xml:space="preserve">. Across the region, the most consistently missing services in monetary terms are pollination, which is absent everywhere, freshwater provisioning to households, which remains unpriced, flood damage avoided, which is proposed but not compiled, and the contribution of forests to agricultural production through rainfall maintenance and soil protection.</w:t>
+      </w:r>
+    </w:p>
+    <w:bookmarkEnd w:id="39"/>
+    <w:bookmarkStart w:id="40" w:name="spatial-disaggregation-needs"/>
+    <w:p>
+      <w:pPr>
+        <w:pStyle w:val="Heading3"/>
+      </w:pPr>
+      <w:r>
+        <w:t xml:space="preserve">3.5.4 Spatial Disaggregation Needs</w:t>
+      </w:r>
+    </w:p>
+    <w:p>
+      <w:pPr>
+        <w:pStyle w:val="FirstParagraph"/>
+      </w:pPr>
+      <w:r>
+        <w:t xml:space="preserve">National-level aggregates systematically mask the localized pressures that are most relevant to investment targeting. Kenya’s water accounts reveal a tenfold range in per-capita water availability across basins. From 8 m³ per person per year in Lake Victoria South to 91 m³ per person per year in Tana basin, which is a difference that is invisible in any national-level figure</w:t>
+      </w:r>
+      <w:r>
+        <w:t xml:space="preserve"> </w:t>
+      </w:r>
+      <w:r>
+        <w:t xml:space="preserve">(World Bank &amp; Prime Africa Consult, 2025)</w:t>
+      </w:r>
+      <w:r>
+        <w:t xml:space="preserve">. Zambia’s provincial disaggregation shows that Eastern Province’s ecosystem degradation index (NEDI = 5.25 percent) is nearly four times the national average (1.44 percent), with distinct conversion patterns, such as woodland-to-cropland, that differ fundamentally from those in the more stable North-Western Province (NEDI = 0.12 percent)</w:t>
+      </w:r>
+      <w:r>
+        <w:t xml:space="preserve"> </w:t>
+      </w:r>
+      <w:r>
+        <w:t xml:space="preserve">(Chisanga et al., 2026)</w:t>
+      </w:r>
+      <w:r>
+        <w:t xml:space="preserve">. South Africa’s Strategic Water Source Areas (SWSA) accounts demonstrate that three specific catchments have already fallen below the 60 percent natural land threshold considered necessary for functional water production. This is a finding with direct implications for Gauteng’s water security, which would be invisible in a national land cover account showing stable natural vegetation</w:t>
+      </w:r>
+      <w:r>
+        <w:t xml:space="preserve"> </w:t>
+      </w:r>
+      <w:r>
+        <w:t xml:space="preserve">(Statistics South Africa, 2023)</w:t>
+      </w:r>
+      <w:r>
+        <w:t xml:space="preserve">. Rwanda’s ecosystem accounts document that baseflow declined in every district between 1990 and 2015, with the largest losses in peri-urban Kigali (Kicukiro with 32 percent and Ngoma with 29 percent), yet the national aggregate shows only an 11 percent decline</w:t>
+      </w:r>
+      <w:r>
+        <w:t xml:space="preserve"> </w:t>
+      </w:r>
+      <w:r>
+        <w:t xml:space="preserve">(Government of Rwanda, 2019a)</w:t>
+      </w:r>
+      <w:r>
+        <w:t xml:space="preserve">. For the DRC, provincial disaggregation reveals that Kwilu province lost 720,000 hectares of lowland forest, representing the largest absolute loss in the country, while Kinshasa province lost 67 percent of its forest cover, suggesting that proximity to population centers drives deforestation patterns that differ from remote interior dynamics</w:t>
+      </w:r>
+      <w:r>
+        <w:t xml:space="preserve"> </w:t>
+      </w:r>
+      <w:r>
+        <w:t xml:space="preserve">(Turpie, Wilson, Brühl, et al., 2025)</w:t>
+      </w:r>
+      <w:r>
+        <w:t xml:space="preserve">. The consistent message is that national accounts need to be complemented by sub-national or catchment-level disaggregation to serve as decision tools for sector investment, conservation targeting, or early warning systems.</w:t>
+      </w:r>
+    </w:p>
+    <w:bookmarkEnd w:id="40"/>
+    <w:bookmarkStart w:id="41" w:name="institutionalization-and-continuity"/>
+    <w:p>
+      <w:pPr>
+        <w:pStyle w:val="Heading3"/>
+      </w:pPr>
+      <w:r>
+        <w:t xml:space="preserve">3.5.5 Institutionalization and Continuity</w:t>
+      </w:r>
+    </w:p>
+    <w:p>
+      <w:pPr>
+        <w:pStyle w:val="FirstParagraph"/>
+      </w:pPr>
+      <w:r>
+        <w:t xml:space="preserve">The most persistent structural challenge is the transition from one-off project-funded accounts to permanent, institutionalized statistical products with public budget provisioning. The DRC’s forest accounts state directly that</w:t>
+      </w:r>
+      <w:r>
+        <w:t xml:space="preserve"> </w:t>
+      </w:r>
+      <w:r>
+        <w:t xml:space="preserve">“the DRC needs to ensure the institutionalization of data-systems”</w:t>
+      </w:r>
+      <w:r>
+        <w:t xml:space="preserve"> </w:t>
+      </w:r>
+      <w:r>
+        <w:t xml:space="preserve">and that</w:t>
+      </w:r>
+      <w:r>
+        <w:t xml:space="preserve"> </w:t>
+      </w:r>
+      <w:r>
+        <w:t xml:space="preserve">“the future compilation of natural capital accounts should ideally be led by the national statistics agency, working in partnership with the relevant financial, environmental, and sectoral ministries”</w:t>
+      </w:r>
+      <w:r>
+        <w:t xml:space="preserve"> </w:t>
+      </w:r>
+      <w:r>
+        <w:t xml:space="preserve">(Turpie, Wilson, Brühl, et al., 2025)</w:t>
+      </w:r>
+      <w:r>
+        <w:t xml:space="preserve">. Zambia’s water accounts acknowledge that institutionalization within the formal statistical system remains incomplete. Uganda’s forest accounts project that the sustainable wood supply will be fully depleted by approximately 2025 under business-as-usual conditions, yet there is no standing mechanism within the national statistical system to trigger a policy response based on findings of the accounts. Currently, the accounts represent a research output rather than an operational monitoring tool</w:t>
+      </w:r>
+      <w:r>
+        <w:t xml:space="preserve"> </w:t>
+      </w:r>
+      <w:r>
+        <w:t xml:space="preserve">(Uganda Bureau of Statistics, 2020)</w:t>
+      </w:r>
+      <w:r>
+        <w:t xml:space="preserve">. Against this background, Mauritius stands as the most instructive positive example in the region, because its water accounts are in their fifth edition, updated regularly, produced by Statistics Mauritius in collaboration with three operational agencies (the Water Resources Unit, the Central Water Authority, and the Waste Management Authority), and are grounded in data systems that are maintained independently of any single project cycle</w:t>
+      </w:r>
+      <w:r>
+        <w:t xml:space="preserve"> </w:t>
+      </w:r>
+      <w:r>
+        <w:t xml:space="preserve">(Statistics Mauritius, 2024)</w:t>
+      </w:r>
+      <w:r>
+        <w:t xml:space="preserve">. Uganda’s water accounts, now in their tenth iteration spanning 2015-2024, provide a second model of systematic series maintenance. Ethiopia’s NCA Roadmap, developed alongside the first accounts, explicitly anticipates a transition to institutionalized production and frames the current work as a foundation rather than an endpoint</w:t>
+      </w:r>
+      <w:r>
+        <w:t xml:space="preserve"> </w:t>
+      </w:r>
+      <w:r>
+        <w:t xml:space="preserve">(Federal Democratic Republic of Ethiopia, 2026)</w:t>
+      </w:r>
+      <w:r>
+        <w:t xml:space="preserve">. These examples suggest that institutionalization depends less on technical capacity than on the establishment of formal inter-agency data-sharing agreements, clear mandates within the national statistical plan, and budget lines that are independent of donor project cycles.</w:t>
+      </w:r>
+    </w:p>
+    <w:bookmarkEnd w:id="41"/>
+    <w:bookmarkStart w:id="42" w:name="thematic-and-structural-gaps"/>
+    <w:p>
+      <w:pPr>
+        <w:pStyle w:val="Heading3"/>
+      </w:pPr>
+      <w:r>
+        <w:t xml:space="preserve">3.5.6 Thematic and Structural Gaps</w:t>
+      </w:r>
+    </w:p>
+    <w:p>
+      <w:pPr>
+        <w:pStyle w:val="FirstParagraph"/>
+      </w:pPr>
+      <w:r>
+        <w:t xml:space="preserve">Several categories of natural capital that are highly relevant to the AFE region are entirely absent from current account coverage. Marine and ocean accounts are compiled by no country in the region, despite the economic importance of Indian Ocean fisheries for Kenya, Tanzania, Madagascar, and Mozambique, and the formal significance of South Africa’s 200 km² EEZ. The only coastal ecosystem accounts in the region are South Africa’s experimental estuary accounts, which reveal that only 4 percent of assessed estuaries have good fish condition, sawfish are now extinct in South Africa, and dusky kob spawner biomass is below 2 percent of pristine levels</w:t>
+      </w:r>
+      <w:r>
+        <w:t xml:space="preserve"> </w:t>
+      </w:r>
+      <w:r>
+        <w:t xml:space="preserve">(</w:t>
+      </w:r>
+      <w:r>
+        <w:t xml:space="preserve">Niekerk et al.</w:t>
+      </w:r>
+      <w:r>
+        <w:t xml:space="preserve">, 2020)</w:t>
+      </w:r>
+      <w:r>
+        <w:t xml:space="preserve">. These are findings that suggest the absence of formal coastal accounts elsewhere is concealing analogous, if unquantified, degradation trends. Biodiversity accounts are present only in experimental form in South Africa (biodiversity tourism, 2013-2019) and the DRC (IBIS-model biodiversity status index, declining from 68.8 to 61.4 percent between 2000 and 2020). Kenya documents that wildlife populations have fallen to 27.3 percent of their 1977-1980 levels and are projected below 10 percent by 2050 under business-as-usual</w:t>
+      </w:r>
+      <w:r>
+        <w:t xml:space="preserve"> </w:t>
+      </w:r>
+      <w:r>
+        <w:t xml:space="preserve">(Turpie, Wilson, Hickinbotham, et al., 2025)</w:t>
+      </w:r>
+      <w:r>
+        <w:t xml:space="preserve">. Mineral accounts are absent across the entire AFE region, despite South Africa’s mine footprint growing 15.9 percent (1990-2014), Zambia’s Copperbelt generating documented water quality hotspots from acid mine drainage, and the DRC deriving substantial government revenue from mining activities while forest depletion accelerates. Fisheries and aquaculture accounts are similarly absent, while Zambia’s fish production sector is valued at US$422.6 million (2023) with aquaculture growing 112 percent over five years. Nevertheless, no formal ecosystem account frames this activity within a natural capital balance</w:t>
+      </w:r>
+      <w:r>
+        <w:t xml:space="preserve"> </w:t>
+      </w:r>
+      <w:r>
+        <w:t xml:space="preserve">(Chisanga et al., 2026)</w:t>
+      </w:r>
+      <w:r>
+        <w:t xml:space="preserve">.</w:t>
+      </w:r>
+    </w:p>
+    <w:bookmarkEnd w:id="42"/>
+    <w:bookmarkStart w:id="43" w:name="priority-areas-for-capacity-development"/>
+    <w:p>
+      <w:pPr>
+        <w:pStyle w:val="Heading3"/>
+      </w:pPr>
+      <w:r>
+        <w:t xml:space="preserve">3.5.7 Priority Areas for Capacity Development</w:t>
+      </w:r>
+    </w:p>
+    <w:p>
+      <w:pPr>
+        <w:pStyle w:val="FirstParagraph"/>
+      </w:pPr>
+      <w:r>
+        <w:t xml:space="preserve">The review of country-level accounts reveals a clear two-tier structure in AFE’s natural capital accounting. A leading group, consisting of Kenya, South Africa, Uganda, and Zambia, has built programmes spanning multiple account types and framework components, and represents the natural candidates for peer learning, south-south knowledge exchange, and cross-border data harmonization on shared basins and ecosystems. A second tier, consisting of Ethiopia, Madagascar, and Mauritius, has made substantive starts but remains largely anchored in physical Central Framework accounts, suggesting that targeted support to expand into monetary valuation and ecosystem accounting would yield the highest marginal returns for existing institutional investments.</w:t>
+      </w:r>
+    </w:p>
     <w:p>
       <w:pPr>
         <w:pStyle w:val="BodyText"/>
       </w:pPr>
       <w:r>
-        <w:t xml:space="preserve">A consistent finding across physical water accounts is that national-level aggregates conceal stark spatial heterogeneity. Kenya’s accounts document a tenfold range in per-capita water availability across basins, from 8 m³ per person per year in Lake Victoria South to 91 m³ in the Tana basin, while the Rift Valley shows groundwater abstraction exceeding 100 percent of sustainable yield</w:t>
-      </w:r>
-      <w:r>
-        <w:t xml:space="preserve"> </w:t>
-      </w:r>
-      <w:r>
-        <w:t xml:space="preserve">(World Bank &amp; Prime Africa Consult, 2025)</w:t>
-      </w:r>
-      <w:r>
-        <w:t xml:space="preserve">. South Africa’s Strategic Water Source Area (SWSA) accounts demonstrate that three of the 22 SWSAs, which together supply approximately two thirds of national economic activity from just 8.2 percent of land area, have already fallen below the 60 percent natural land cover threshold necessary for functional water production</w:t>
-      </w:r>
-      <w:r>
-        <w:t xml:space="preserve"> </w:t>
-      </w:r>
-      <w:r>
-        <w:t xml:space="preserve">(Statistics South Africa, 2023)</w:t>
-      </w:r>
-      <w:r>
-        <w:t xml:space="preserve">. Zambia frames water not only as a production input but as a macroeconomic vulnerability, because Lake Kariba fell below 15 percent of capacity in 2016 and again in 2024, in each case triggering nationwide load-shedding, while the 2023/24 El Niño drought simultaneously crippled hydropower generation and destroyed the maize harvest, illustrating the dual pathway through which hydrological shocks propagate into the economy</w:t>
-      </w:r>
-      <w:r>
-        <w:t xml:space="preserve"> </w:t>
-      </w:r>
-      <w:r>
-        <w:t xml:space="preserve">(Chisanga et al., 2026)</w:t>
-      </w:r>
-      <w:r>
-        <w:t xml:space="preserve">.</w:t>
-      </w:r>
-    </w:p>
-    <w:p>
-      <w:pPr>
-        <w:pStyle w:val="BodyText"/>
-      </w:pPr>
-      <w:r>
-        <w:t xml:space="preserve">Distribution losses and infrastructure condition are a recurring theme across reviewed accounts. Mauritius, which maintains the most institutionalized water accounting programme in the region (fifth consecutive edition), records a rate of 64.6 percent of unaccounted-for water in the Central Water Authority network, which was up from 56.4 percent in 2013, meaning nearly two-thirds of treated potable water is lost before reaching end users, despite 99.8 percent national access to safely managed drinking water</w:t>
-      </w:r>
-      <w:r>
-        <w:t xml:space="preserve"> </w:t>
-      </w:r>
-      <w:r>
-        <w:t xml:space="preserve">(Statistics Mauritius, 2024)</w:t>
-      </w:r>
-      <w:r>
-        <w:t xml:space="preserve">. Rwanda’s Water and Sanitation Corporation (WASAC) utility loses 41 percent of output in distribution losses (US$8.7 million per year in foregone revenue) and Uganda’s supply chain records distribution losses of 34.8 percent. Taken together, these figures, directly readable from water supply and use tables, provide the economic argument for infrastructure investment.</w:t>
-      </w:r>
-    </w:p>
-    <w:bookmarkEnd w:id="34"/>
-    <w:bookmarkStart w:id="35" w:name="land-accounts"/>
-    <w:p>
-      <w:pPr>
-        <w:pStyle w:val="Heading2"/>
-      </w:pPr>
-      <w:r>
-        <w:t xml:space="preserve">3.2 Land accounts</w:t>
-      </w:r>
-    </w:p>
-    <w:p>
-      <w:pPr>
-        <w:pStyle w:val="FirstParagraph"/>
-      </w:pPr>
-      <w:r>
-        <w:t xml:space="preserve">Land accounts are the most universal entry point into SEEA implementation, because every country in this review has compiled at least one form of land cover or land use change account. The consistent finding throughout the implementations suggests accelerating cropland expansion at the expense of natural vegetation, but the policy implications depend critically on whether accounts track conversion pathways rather than just net change. In Ethiopia, cropland expanded from 21.7 to 25.9 million hectares between 2013 and 2022, which is a 20 percent increase, while built-up area grew 50 percent, yet the accounts caution that an observed 22 percent increase in forest cover over the same period reflects definitional and source-data differences as much as any ecological recovery</w:t>
-      </w:r>
-      <w:r>
-        <w:t xml:space="preserve"> </w:t>
-      </w:r>
-      <w:r>
-        <w:t xml:space="preserve">(Federal Democratic Republic of Ethiopia, 2026)</w:t>
-      </w:r>
-      <w:r>
-        <w:t xml:space="preserve">. Rwanda presents the sharpest land transition in the region, where cropland rose from 24.2 to 51.7 percent of national territory between 1990 and 2015 as sparse forest lost 673,137 hectares and average farm parcels shrank to 0.184 hectares. This land fragmentation threshold limits mechanization and economic transformation</w:t>
-      </w:r>
-      <w:r>
-        <w:t xml:space="preserve"> </w:t>
-      </w:r>
-      <w:r>
-        <w:t xml:space="preserve">(Government of Rwanda, 2018)</w:t>
-      </w:r>
-      <w:r>
-        <w:t xml:space="preserve">. The intensity of land use change in Rwanda is reflected in formal land market data, where transaction prices averaged 35 million Rwf per hectare in urban areas.</w:t>
-      </w:r>
-    </w:p>
-    <w:p>
-      <w:pPr>
-        <w:pStyle w:val="BodyText"/>
-      </w:pPr>
-      <w:r>
-        <w:t xml:space="preserve">South Africa’s accounts occupy the most technically advanced position in the region, combining ecosystem extent indices, classification hierarchies, and turnover metrics over three decades. A central finding is that while natural land nationally remained broadly stable (+0.8 percent), pivot irrigation expanded 221 percent between 1990 and 2018, the mine footprint grew 15.9 percent, and 18 percent of ecosystem types have already crossed the 60 percent natural cover threshold associated with ecosystem dysfunction</w:t>
-      </w:r>
-      <w:r>
-        <w:t xml:space="preserve"> </w:t>
-      </w:r>
-      <w:r>
-        <w:t xml:space="preserve">(Statistics South Africa, 2020)</w:t>
-      </w:r>
-      <w:r>
-        <w:t xml:space="preserve">. Kenya’s accounts contribute a methodologically important approach to transition analysis. Rather than presenting static totals, the land accounts compute a spatial backbone for county-level disaggregation and map conversion flows. These show a net forest loss of 342,793 hectares across 1990-2024, making it possible to identify where interventions such as restoration, conservation employment, or zoning changes would be most effective</w:t>
-      </w:r>
-      <w:r>
-        <w:t xml:space="preserve"> </w:t>
-      </w:r>
-      <w:r>
-        <w:t xml:space="preserve">(Turpie, Wilson, Hickinbotham, et al., 2025)</w:t>
-      </w:r>
-      <w:r>
-        <w:t xml:space="preserve">. Zambia’s accounts add a sub-national degradation lens, with the National Ecosystem Degradation Index (NEDI) showing that Eastern Province (5.25 percent) is degrading at nearly four times the national average (1.44 percent), driven by a woodland-to-cropland conversion pattern distinct from more stable provinces in the north-west</w:t>
-      </w:r>
-      <w:r>
-        <w:t xml:space="preserve"> </w:t>
-      </w:r>
-      <w:r>
-        <w:t xml:space="preserve">(Chisanga et al., 2026)</w:t>
-      </w:r>
-      <w:r>
-        <w:t xml:space="preserve">. Across the region, the key advancement needed is the addition of monetary land accounts: currently, no country has compiled formal monetary values for land assets within the SEEA framework, limiting the ability to link land conversion to GDP or wealth accounts.</w:t>
-      </w:r>
-    </w:p>
-    <w:bookmarkEnd w:id="35"/>
-    <w:bookmarkStart w:id="36" w:name="energy-accounts"/>
-    <w:p>
-      <w:pPr>
-        <w:pStyle w:val="Heading2"/>
-      </w:pPr>
-      <w:r>
-        <w:t xml:space="preserve">3.3 Energy accounts</w:t>
-      </w:r>
-    </w:p>
-    <w:p>
-      <w:pPr>
-        <w:pStyle w:val="FirstParagraph"/>
-      </w:pPr>
-      <w:r>
-        <w:t xml:space="preserve">Energy accounts remain the least compiled component in the AFE review, but where they exist they reveal a structural tension between physical and monetary energy realities that is directly relevant to the energy transition. Kenya’s monetary energy supply and use tables, which are among the first in Sub-Saharan Africa, show that biomass dominates total primary energy supply in physical terms (1.2 million TJ) but that household monetary expenditures are concentrated on electricity and petroleum products (total supply value KES 580.5 billion; household spending KES 749.8 billion), with biomass essentially unpriced in market terms</w:t>
-      </w:r>
-      <w:r>
-        <w:t xml:space="preserve"> </w:t>
-      </w:r>
-      <w:r>
-        <w:t xml:space="preserve">(World Bank &amp; Prime Africa Consult, 2025)</w:t>
-      </w:r>
-      <w:r>
-        <w:t xml:space="preserve">. This divergence between physical and monetary accounts is policy-critical, because it means that energy subsidies, fuel taxes, and electricity tariffs are calibrated to a monetized minority of total energy use, while the majority (rural biomass) remains outside the price and fiscal system.</w:t>
-      </w:r>
-    </w:p>
-    <w:p>
-      <w:pPr>
-        <w:pStyle w:val="BodyText"/>
-      </w:pPr>
-      <w:r>
-        <w:t xml:space="preserve">South Africa’s accounts represent the region’s most developed energy time series, with coal supplying 72.2 percent of total domestic energy but oil being 93.1 percent import-dependent, creating structural resilience asymmetries</w:t>
-      </w:r>
-      <w:r>
-        <w:t xml:space="preserve"> </w:t>
-      </w:r>
-      <w:r>
-        <w:t xml:space="preserve">(Statistics South Africa, 2025)</w:t>
-      </w:r>
-      <w:r>
-        <w:t xml:space="preserve">. Mining and quarrying consumes 1.21 TJ per million Rand of gross value added, taking the spot as the most energy-intensive sector, and household biofuels account for 46.5 percent of residential energy, a share that has barely changed over the decade of accounts available. The biomass-forest nexus is especially pronounced for the DRC (94 percent of national energy from biomass), Uganda (78 percent), and Zambia (78 percent), where fuelwood harvesting is a direct driver of deforestation quantified in the forest and ecosystem accounts. DRC’s forest accounts document a 709 percent increase in fuelwood harvesting in forest-farm mosaic areas over 2000-2020, making the energy-land connection explicit in physical terms and providing a basis for costing energy transition investments</w:t>
-      </w:r>
-      <w:r>
-        <w:t xml:space="preserve"> </w:t>
-      </w:r>
-      <w:r>
-        <w:t xml:space="preserve">(Turpie, Wilson, Brühl, et al., 2025)</w:t>
-      </w:r>
-      <w:r>
-        <w:t xml:space="preserve">.</w:t>
-      </w:r>
-    </w:p>
-    <w:bookmarkEnd w:id="36"/>
-    <w:bookmarkStart w:id="37" w:name="ecosystem-accounts"/>
-    <w:p>
-      <w:pPr>
-        <w:pStyle w:val="Heading2"/>
-      </w:pPr>
-      <w:r>
-        <w:t xml:space="preserve">3.4 Ecosystem accounts</w:t>
-      </w:r>
-    </w:p>
-    <w:p>
-      <w:pPr>
-        <w:pStyle w:val="FirstParagraph"/>
-      </w:pPr>
-      <w:r>
-        <w:t xml:space="preserve">Ecosystem accounts are the most analytically powerful component of SEEA but also the most demanding to compile, and the AFE region shows a clear gradient from comprehensive forest accounts in the DRC to largely physical land-ecosystem hybrids in Ethiopia and Madagascar. Where monetary ecosystem service valuations have been produced, they reveal contributions to economic welfare that national accounts systematically miss. Kenya’s monetary ecosystem service accounts estimate total services at KSh 247 billion per year, which is equivalent to 1.8 percent of GDP, with livestock grazing being the dominant service (KSh 185 billion), followed by nature-based tourism (KSh 38 billion) and sediment retention (KSh 24 billion)</w:t>
-      </w:r>
-      <w:r>
-        <w:t xml:space="preserve"> </w:t>
-      </w:r>
-      <w:r>
-        <w:t xml:space="preserve">(Turpie, Wilson, Hickinbotham, et al., 2025)</w:t>
-      </w:r>
-      <w:r>
-        <w:t xml:space="preserve">. South Africa’s biodiversity economy accounts estimate that biodiversity tourism contributed R27.7 billion to GDP (0.4-0.5 percent) and supported 91,836 direct jobs in 2019, figures that can be tracked over time to assess the economic case for conservation and mixed agroforestry systems</w:t>
-      </w:r>
-      <w:r>
-        <w:t xml:space="preserve"> </w:t>
-      </w:r>
-      <w:r>
-        <w:t xml:space="preserve">(Statistics South Africa, 2024)</w:t>
-      </w:r>
-      <w:r>
-        <w:t xml:space="preserve">.</w:t>
-      </w:r>
-    </w:p>
-    <w:p>
-      <w:pPr>
-        <w:pStyle w:val="BodyText"/>
-      </w:pPr>
-      <w:r>
-        <w:t xml:space="preserve">The DRC’s accounts illustrate both the ceiling of what is currently achievable and the challenge of translating global ecological value into national incentive. Total forest ecosystem services were valued at US$706 billion per year in 2020, including global climate regulation at the social cost of carbon (US$79.86/tonne CO₂), but the domestically captured portion, excluding carbon externalities priced globally, was only US$3.3 billion per year</w:t>
-      </w:r>
-      <w:r>
-        <w:t xml:space="preserve"> </w:t>
-      </w:r>
-      <w:r>
-        <w:t xml:space="preserve">(Turpie, Wilson, Brühl, et al., 2025)</w:t>
-      </w:r>
-      <w:r>
-        <w:t xml:space="preserve">. The gap between global and domestic value is the economic explanation for continued deforestation. The deforestation rate doubled from 0.5 to 0.8 percent per year between 2000 and 2020, and forest depletion costs grew 113 percent between 2010 and 2020, yet these losses accrue to livelihoods too diffuse and informal to be captured in national accounts. The accounts also document that bushmeat extraction is 64 percent above sustainable yield, which is a physical condition indicator with direct food security implications, and that the total forest asset value declined from US$12.0 trillion in 2000 to US$10.3 trillion in 2020; a national wealth loss of US$1.7 trillion that would appear in a SEEA-compliant balance sheet.</w:t>
-      </w:r>
-    </w:p>
-    <w:p>
-      <w:pPr>
-        <w:pStyle w:val="BodyText"/>
-      </w:pPr>
-      <w:r>
-        <w:t xml:space="preserve">Physical ecosystem accounts in Ethiopia and Rwanda demonstrate how regulating services, which are often omitted from monetary analyses, can be quantified at hydrological scales relevant to investment decisions. Ethiopia’s accounts estimate that 29.7 billion tonnes of soil erosion was avoided annually by existing land cover, but that baseflow declined by 1.3 percent and flood mitigation capacity by 2.7 percent over the accounting period, and that Addis Ababa’s rapid urbanization reduced catchment water yield by 2,691 m³ per hectare</w:t>
-      </w:r>
-      <w:r>
-        <w:t xml:space="preserve"> </w:t>
-      </w:r>
-      <w:r>
-        <w:t xml:space="preserve">(Rutebuka et al., 2025)</w:t>
-      </w:r>
-      <w:r>
-        <w:t xml:space="preserve">. Rwanda’s ecosystem accounts track soil erosion increasing 54 percent, sediment export, 123 percent, and quickflow, 35 percent, between 1990 and 2015. These are quantified degradation trends driven by the same cropland expansion documented in the land accounts, while baseflow declined 11 percent nationally and 29-32 percent in peri-urban districts</w:t>
-      </w:r>
-      <w:r>
-        <w:t xml:space="preserve"> </w:t>
-      </w:r>
-      <w:r>
-        <w:t xml:space="preserve">(Government of Rwanda, 2019a)</w:t>
-      </w:r>
-      <w:r>
-        <w:t xml:space="preserve">. These accounts close the feedback loop between land use change and hydrological service provision in a way that land accounts alone cannot.</w:t>
-      </w:r>
-    </w:p>
-    <w:bookmarkEnd w:id="37"/>
-    <w:bookmarkStart w:id="45" w:name="X140e3db80294dff0d7fa8d95000122aedbfe09f"/>
-    <w:p>
-      <w:pPr>
-        <w:pStyle w:val="Heading2"/>
-      </w:pPr>
-      <w:r>
-        <w:t xml:space="preserve">3.5 Common Data Gaps and Systemic Recommendations</w:t>
-      </w:r>
-    </w:p>
-    <w:p>
-      <w:pPr>
-        <w:pStyle w:val="FirstParagraph"/>
-      </w:pPr>
-      <w:r>
-        <w:t xml:space="preserve">A detailed review of the reports underpinning the Annex reveals that data gaps and institutional constraints follow recurring patterns across countries, but with important country-specific dimensions that inform where targeted support would yield the greatest returns. The following subsections organize these findings around six themes.</w:t>
-      </w:r>
-    </w:p>
-    <w:bookmarkStart w:id="38" w:name="data-infrastructure-and-monitoring-gaps"/>
-    <w:p>
-      <w:pPr>
-        <w:pStyle w:val="Heading3"/>
-      </w:pPr>
-      <w:r>
-        <w:t xml:space="preserve">3.5.1 Data Infrastructure and Monitoring Gaps</w:t>
-      </w:r>
-    </w:p>
-    <w:p>
-      <w:pPr>
-        <w:pStyle w:val="FirstParagraph"/>
-      </w:pPr>
-      <w:r>
-        <w:t xml:space="preserve">Measurement infrastructure for the primary inputs to SEEA accounts remains underdeveloped across the region. In Zambia, the water accounts explicitly acknowledge that a fully SEEA-Water-compliant national account has not yet been institutionalized, with groundwater abstraction</w:t>
-      </w:r>
-      <w:r>
-        <w:t xml:space="preserve"> </w:t>
-      </w:r>
-      <w:r>
-        <w:t xml:space="preserve">“largely unmetered”</w:t>
-      </w:r>
-      <w:r>
-        <w:t xml:space="preserve"> </w:t>
-      </w:r>
-      <w:r>
-        <w:t xml:space="preserve">and monitoring networks</w:t>
-      </w:r>
-      <w:r>
-        <w:t xml:space="preserve"> </w:t>
-      </w:r>
-      <w:r>
-        <w:t xml:space="preserve">“remaining sparse”</w:t>
-      </w:r>
-      <w:r>
-        <w:t xml:space="preserve"> </w:t>
-      </w:r>
-      <w:r>
-        <w:t xml:space="preserve">(Chisanga et al., 2026)</w:t>
-      </w:r>
-      <w:r>
-        <w:t xml:space="preserve">. Kenya identifies the Rift Valley basin as a groundwater stress hotspot where the use-to-availability ratio exceeds 100 percent, yet no remediation monitoring is in place. The accounts also state that water quality accounts, covering nutrient pollution, dissolved oxygen, and fluoride, are urgently needed but not yet compiled</w:t>
-      </w:r>
-      <w:r>
-        <w:t xml:space="preserve"> </w:t>
-      </w:r>
-      <w:r>
-        <w:t xml:space="preserve">(World Bank &amp; Prime Africa Consult, 2025)</w:t>
-      </w:r>
-      <w:r>
-        <w:t xml:space="preserve">. Rwanda projects demand growing tenfold by 2040 driven by irrigation, yet the current monitoring network was designed for far lower abstraction rates, creating a foreseeable data gap at the moment when it would be most policy-critical</w:t>
-      </w:r>
-      <w:r>
-        <w:t xml:space="preserve"> </w:t>
-      </w:r>
-      <w:r>
-        <w:t xml:space="preserve">(Government of Rwanda, 2019b)</w:t>
-      </w:r>
-      <w:r>
-        <w:t xml:space="preserve">. Distribution losses, which are a key diagnostic for infrastructure investment, are substantial but inconsistently tracked. For example, Mauritius records 64.6 percent unaccounted-for water in the CWA network, worsening from 56.4 percent in 2013, yet no monetary cost-of-leakage calculation has been compiled</w:t>
-      </w:r>
-      <w:r>
-        <w:t xml:space="preserve"> </w:t>
-      </w:r>
-      <w:r>
-        <w:t xml:space="preserve">(Statistics Mauritius, 2024)</w:t>
-      </w:r>
-      <w:r>
-        <w:t xml:space="preserve">; the Water And Sanitation Corporation (WASAC) in Rwanda achieves only 75 percent cost recovery, with non-revenue water at 41 percent (US$8.7 million per year)</w:t>
-      </w:r>
-      <w:r>
-        <w:t xml:space="preserve"> </w:t>
-      </w:r>
-      <w:r>
-        <w:t xml:space="preserve">(Government of Rwanda, 2019b)</w:t>
-      </w:r>
-      <w:r>
-        <w:t xml:space="preserve">; and Uganda’s supply chain records distribution losses of 34.8 percent in a system where daily consumption per-household is already well below basic-needs thresholds</w:t>
-      </w:r>
-      <w:r>
-        <w:t xml:space="preserve"> </w:t>
-      </w:r>
-      <w:r>
-        <w:t xml:space="preserve">(Uganda Bureau of Statistics, 2025)</w:t>
-      </w:r>
-      <w:r>
-        <w:t xml:space="preserve">. In the DRC, poverty and inequality data remain outdated, with the most recent Gini coefficient (42.1) dating from 2012 and poverty headcount from 2004, while gross national savings data for 2000 are simply absent, preventing the calculation of adjusted net savings for that year</w:t>
-      </w:r>
-      <w:r>
-        <w:t xml:space="preserve"> </w:t>
-      </w:r>
-      <w:r>
-        <w:t xml:space="preserve">(Turpie, Wilson, Brühl, et al., 2025)</w:t>
-      </w:r>
-      <w:r>
-        <w:t xml:space="preserve">. Energy monitoring in DRC, Uganda, and Zambia all face the same structural gap, related to informal and subsistence biomass flows, which represent 78 percent of national energy in Uganda and Zambia and 94 percent in the DRC. In all three cases, these are estimated rather than measured, introducing material uncertainty into energy and forest supply-use balances</w:t>
-      </w:r>
-      <w:r>
-        <w:t xml:space="preserve"> </w:t>
-      </w:r>
-      <w:r>
-        <w:t xml:space="preserve">(Chisanga et al., 2026; Turpie, Wilson, Brühl, et al., 2025; Uganda Bureau of Statistics, 2020)</w:t>
-      </w:r>
-      <w:r>
-        <w:t xml:space="preserve">.</w:t>
-      </w:r>
-    </w:p>
-    <w:bookmarkEnd w:id="38"/>
-    <w:bookmarkStart w:id="39" w:name="X62a9d9108090f6afabb2e2ac0a65809a10abb3a"/>
-    <w:p>
-      <w:pPr>
-        <w:pStyle w:val="Heading3"/>
-      </w:pPr>
-      <w:r>
-        <w:t xml:space="preserve">3.5.2 Classification and Cross-Country Comparability</w:t>
-      </w:r>
-    </w:p>
-    <w:p>
-      <w:pPr>
-        <w:pStyle w:val="FirstParagraph"/>
-      </w:pPr>
-      <w:r>
-        <w:t xml:space="preserve">The forest cover data across the region illustrate the depth of the classification problem. Ethiopia’s accounts document a 22 percent increase in total forest cover between 2013 and 2022. However, the report explicitly cautions that</w:t>
-      </w:r>
-      <w:r>
-        <w:t xml:space="preserve"> </w:t>
-      </w:r>
-      <w:r>
-        <w:t xml:space="preserve">“differences in data sources, forest definitions, and canopy cover sensitivity to rainfall make it difficult to apportion change between ecological dynamics and reclassification,”</w:t>
-      </w:r>
-      <w:r>
-        <w:t xml:space="preserve"> </w:t>
-      </w:r>
-      <w:r>
-        <w:t xml:space="preserve">putting into question whether observed gains represent true restoration or methodological nuances</w:t>
-      </w:r>
-      <w:r>
-        <w:t xml:space="preserve"> </w:t>
-      </w:r>
-      <w:r>
-        <w:t xml:space="preserve">(Federal Democratic Republic of Ethiopia, 2026)</w:t>
-      </w:r>
-      <w:r>
-        <w:t xml:space="preserve">. Zambia’s ecosystem extent accounts use MODIS satellite data with classification boundaries that differ from national land cover data, so that some biome extent totals exceed what would be expected from the national territory, and the accounts interpret percentage changes as more reliable than absolute areas</w:t>
-      </w:r>
-      <w:r>
-        <w:t xml:space="preserve"> </w:t>
-      </w:r>
-      <w:r>
-        <w:t xml:space="preserve">(Chisanga et al., 2026)</w:t>
-      </w:r>
-      <w:r>
-        <w:t xml:space="preserve">. The DRC uses fifteen ecosystem types including forest-farm mosaic as a distinct class; this level of granularity enables important policy insights. For example, a mosaic expansion of 83 percent in 2000-2010 and 96 percent in 2010-2020 reveal an important agricultural frontier dynamic. However, at the same time it makes comparison with neighbouring countries’ simpler classification schemes difficult</w:t>
-      </w:r>
-      <w:r>
-        <w:t xml:space="preserve"> </w:t>
-      </w:r>
-      <w:r>
-        <w:t xml:space="preserve">(Turpie, Wilson, Brühl, et al., 2025)</w:t>
-      </w:r>
-      <w:r>
-        <w:t xml:space="preserve">. Madagascar, Ethiopia, and Zambia all rely on remotely sensed vegetation indices as primary condition indicators, without consistent field validation or cross-country calibration of thresholds. Kenya’s ecosystem condition accounts find that no forest ecosystem achieves a condition score above 60 percent nationally. This is a finding that may reflect genuine degradation but also the choice of reference state and indicator sensitivity</w:t>
-      </w:r>
-      <w:r>
-        <w:t xml:space="preserve"> </w:t>
-      </w:r>
-      <w:r>
-        <w:t xml:space="preserve">(Turpie, Wilson, Hickinbotham, et al., 2025)</w:t>
-      </w:r>
-      <w:r>
-        <w:t xml:space="preserve">. Harmonizing forest and land cover classification systems across the AFE region, even through common reporting categories alongside national definitions, would substantially improve the analytical value of cross-country comparison.</w:t>
-      </w:r>
-    </w:p>
-    <w:bookmarkEnd w:id="39"/>
-    <w:bookmarkStart w:id="40" w:name="monetary-valuation-gaps"/>
-    <w:p>
-      <w:pPr>
-        <w:pStyle w:val="Heading3"/>
-      </w:pPr>
-      <w:r>
-        <w:t xml:space="preserve">3.5.3 Monetary Valuation Gaps</w:t>
-      </w:r>
-    </w:p>
-    <w:p>
-      <w:pPr>
-        <w:pStyle w:val="FirstParagraph"/>
-      </w:pPr>
-      <w:r>
-        <w:t xml:space="preserve">The absence of monetary ecosystem service accounts remains the most consequential gap for the policy applications that national capital accounting is intended to support. Ethiopia’s accounts are fully physical across all seven ecosystem services, with monetary valuation explicitly deferred to a future phase</w:t>
-      </w:r>
-      <w:r>
-        <w:t xml:space="preserve"> </w:t>
-      </w:r>
-      <w:r>
-        <w:t xml:space="preserve">(Rutebuka et al., 2025)</w:t>
-      </w:r>
-      <w:r>
-        <w:t xml:space="preserve">. Madagascar likewise has no monetary accounts. The economic analysis of hydropower losses, agricultural productivity costs, and carbon opportunity costs was computed as part of a companion report with no official publication</w:t>
-      </w:r>
-      <w:r>
-        <w:t xml:space="preserve"> </w:t>
-      </w:r>
-      <w:r>
-        <w:t xml:space="preserve">(Vogl et al., 2022)</w:t>
-      </w:r>
-      <w:r>
-        <w:t xml:space="preserve">. Rwanda’s ecosystem accounts cover soil erosion, sediment export, water yield, and quickflow in physical units only, despite Rwanda being one of two countries in the region with monetary water supply and use tables</w:t>
-      </w:r>
-      <w:r>
-        <w:t xml:space="preserve"> </w:t>
-      </w:r>
-      <w:r>
-        <w:t xml:space="preserve">(Government of Rwanda, 2019a)</w:t>
-      </w:r>
-      <w:r>
-        <w:t xml:space="preserve">. In Zambia, the only monetary ecosystem services estimate available is the net present value of carbon stock loss, which amounts to USD 46 million over 2018-2023, while the Bangweulu wetlands ecosystem services (US$11.7 million per year) and the fish production sector (US$422.6 million in 2023) remain outside the formal NCA monetary framework</w:t>
-      </w:r>
-      <w:r>
-        <w:t xml:space="preserve"> </w:t>
-      </w:r>
-      <w:r>
-        <w:t xml:space="preserve">(Chisanga et al., 2026)</w:t>
-      </w:r>
-      <w:r>
-        <w:t xml:space="preserve">. The DRC’s forest accounts, while the most comprehensive in the region for forest ecosystems, illustrate the valuation challenge. The total monetary value of forest ecosystem services including global climate regulation was US$706 billion per year in 2020, which is a figure that includes the social cost of carbon at US$79.86 per tonne CO₂, but the domestically captured benefit (excluding carbon externalities) was only US$3.3 billion per year, creating a vast gap between global value and national incentives</w:t>
-      </w:r>
-      <w:r>
-        <w:t xml:space="preserve"> </w:t>
-      </w:r>
-      <w:r>
-        <w:t xml:space="preserve">(Turpie, Wilson, Brühl, et al., 2025)</w:t>
-      </w:r>
-      <w:r>
-        <w:t xml:space="preserve">. Across the region, the most consistently missing services in monetary terms are pollination, which is absent everywhere, freshwater provisioning to households, which remains unpriced, flood damage avoided, which is proposed but not compiled, and the contribution of forests to agricultural production through rainfall maintenance and soil protection.</w:t>
-      </w:r>
-    </w:p>
-    <w:bookmarkEnd w:id="40"/>
-    <w:bookmarkStart w:id="41" w:name="spatial-disaggregation-needs"/>
-    <w:p>
-      <w:pPr>
-        <w:pStyle w:val="Heading3"/>
-      </w:pPr>
-      <w:r>
-        <w:t xml:space="preserve">3.5.4 Spatial Disaggregation Needs</w:t>
-      </w:r>
-    </w:p>
-    <w:p>
-      <w:pPr>
-        <w:pStyle w:val="FirstParagraph"/>
-      </w:pPr>
-      <w:r>
-        <w:t xml:space="preserve">National-level aggregates systematically mask the localized pressures that are most relevant to investment targeting. Kenya’s water accounts reveal a tenfold range in per-capita water availability across basins. From 8 m³ per person per year in Lake Victoria South to 91 m³ per person per year in Tana basin, which is a difference that is invisible in any national-level figure</w:t>
-      </w:r>
-      <w:r>
-        <w:t xml:space="preserve"> </w:t>
-      </w:r>
-      <w:r>
-        <w:t xml:space="preserve">(World Bank &amp; Prime Africa Consult, 2025)</w:t>
-      </w:r>
-      <w:r>
-        <w:t xml:space="preserve">. Zambia’s provincial disaggregation shows that Eastern Province’s ecosystem degradation index (NEDI = 5.25 percent) is nearly four times the national average (1.44 percent), with distinct conversion patterns, such as woodland-to-cropland, that differ fundamentally from those in the more stable North-Western Province (NEDI = 0.12 percent)</w:t>
-      </w:r>
-      <w:r>
-        <w:t xml:space="preserve"> </w:t>
-      </w:r>
-      <w:r>
-        <w:t xml:space="preserve">(Chisanga et al., 2026)</w:t>
-      </w:r>
-      <w:r>
-        <w:t xml:space="preserve">. South Africa’s Strategic Water Source Areas (SWSA) accounts demonstrate that three specific catchments have already fallen below the 60 percent natural land threshold considered necessary for functional water production. This is a finding with direct implications for Gauteng’s water security, which would be invisible in a national land cover account showing stable natural vegetation</w:t>
-      </w:r>
-      <w:r>
-        <w:t xml:space="preserve"> </w:t>
-      </w:r>
-      <w:r>
-        <w:t xml:space="preserve">(Statistics South Africa, 2023)</w:t>
-      </w:r>
-      <w:r>
-        <w:t xml:space="preserve">. Rwanda’s ecosystem accounts document that baseflow declined in every district between 1990 and 2015, with the largest losses in peri-urban Kigali (Kicukiro with 32 percent and Ngoma with 29 percent), yet the national aggregate shows only an 11 percent decline</w:t>
-      </w:r>
-      <w:r>
-        <w:t xml:space="preserve"> </w:t>
-      </w:r>
-      <w:r>
-        <w:t xml:space="preserve">(Government of Rwanda, 2019a)</w:t>
-      </w:r>
-      <w:r>
-        <w:t xml:space="preserve">. For the DRC, provincial disaggregation reveals that Kwilu province lost 720,000 hectares of lowland forest, representing the largest absolute loss in the country, while Kinshasa province lost 67 percent of its forest cover, suggesting that proximity to population centers drives deforestation patterns that differ from remote interior dynamics</w:t>
-      </w:r>
-      <w:r>
-        <w:t xml:space="preserve"> </w:t>
-      </w:r>
-      <w:r>
-        <w:t xml:space="preserve">(Turpie, Wilson, Brühl, et al., 2025)</w:t>
-      </w:r>
-      <w:r>
-        <w:t xml:space="preserve">. The consistent message is that national accounts need to be complemented by sub-national or catchment-level disaggregation to serve as decision tools for sector investment, conservation targeting, or early warning systems.</w:t>
-      </w:r>
-    </w:p>
-    <w:bookmarkEnd w:id="41"/>
-    <w:bookmarkStart w:id="42" w:name="institutionalization-and-continuity"/>
-    <w:p>
-      <w:pPr>
-        <w:pStyle w:val="Heading3"/>
-      </w:pPr>
-      <w:r>
-        <w:t xml:space="preserve">3.5.5 Institutionalization and Continuity</w:t>
-      </w:r>
-    </w:p>
-    <w:p>
-      <w:pPr>
-        <w:pStyle w:val="FirstParagraph"/>
-      </w:pPr>
-      <w:r>
-        <w:t xml:space="preserve">The most persistent structural challenge is the transition from one-off project-funded accounts to permanent, institutionalized statistical products with public budget provisioning. The DRC’s forest accounts state directly that</w:t>
-      </w:r>
-      <w:r>
-        <w:t xml:space="preserve"> </w:t>
-      </w:r>
-      <w:r>
-        <w:t xml:space="preserve">“the DRC needs to ensure the institutionalization of data-systems”</w:t>
-      </w:r>
-      <w:r>
-        <w:t xml:space="preserve"> </w:t>
-      </w:r>
-      <w:r>
-        <w:t xml:space="preserve">and that</w:t>
-      </w:r>
-      <w:r>
-        <w:t xml:space="preserve"> </w:t>
-      </w:r>
-      <w:r>
-        <w:t xml:space="preserve">“the future compilation of natural capital accounts should ideally be led by the national statistics agency, working in partnership with the relevant financial, environmental, and sectoral ministries”</w:t>
-      </w:r>
-      <w:r>
-        <w:t xml:space="preserve"> </w:t>
-      </w:r>
-      <w:r>
-        <w:t xml:space="preserve">(Turpie, Wilson, Brühl, et al., 2025)</w:t>
-      </w:r>
-      <w:r>
-        <w:t xml:space="preserve">. Zambia’s water accounts acknowledge that institutionalization within the formal statistical system remains incomplete. Uganda’s forest accounts project that the sustainable wood supply will be fully depleted by approximately 2025 under business-as-usual conditions, yet there is no standing mechanism within the national statistical system to trigger a policy response based on findings of the accounts. Currently, the accounts represent a research output rather than an operational monitoring tool</w:t>
-      </w:r>
-      <w:r>
-        <w:t xml:space="preserve"> </w:t>
-      </w:r>
-      <w:r>
-        <w:t xml:space="preserve">(Uganda Bureau of Statistics, 2020)</w:t>
-      </w:r>
-      <w:r>
-        <w:t xml:space="preserve">. Against this background, Mauritius stands as the most instructive positive example in the region, because its water accounts are in their fifth edition, updated regularly, produced by Statistics Mauritius in collaboration with three operational agencies (the Water Resources Unit, the Central Water Authority, and the Waste Management Authority), and are grounded in data systems that are maintained independently of any single project cycle</w:t>
-      </w:r>
-      <w:r>
-        <w:t xml:space="preserve"> </w:t>
-      </w:r>
-      <w:r>
-        <w:t xml:space="preserve">(Statistics Mauritius, 2024)</w:t>
-      </w:r>
-      <w:r>
-        <w:t xml:space="preserve">. Uganda’s water accounts, now in their tenth iteration spanning 2015-2024, provide a second model of systematic series maintenance. Ethiopia’s NCA Roadmap, developed alongside the first accounts, explicitly anticipates a transition to institutionalized production and frames the current work as a foundation rather than an endpoint</w:t>
-      </w:r>
-      <w:r>
-        <w:t xml:space="preserve"> </w:t>
-      </w:r>
-      <w:r>
-        <w:t xml:space="preserve">(Federal Democratic Republic of Ethiopia, 2026)</w:t>
-      </w:r>
-      <w:r>
-        <w:t xml:space="preserve">. These examples suggest that institutionalization depends less on technical capacity than on the establishment of formal inter-agency data-sharing agreements, clear mandates within the national statistical plan, and budget lines that are independent of donor project cycles.</w:t>
-      </w:r>
-    </w:p>
-    <w:bookmarkEnd w:id="42"/>
-    <w:bookmarkStart w:id="43" w:name="thematic-and-structural-gaps"/>
-    <w:p>
-      <w:pPr>
-        <w:pStyle w:val="Heading3"/>
-      </w:pPr>
-      <w:r>
-        <w:t xml:space="preserve">3.5.6 Thematic and Structural Gaps</w:t>
-      </w:r>
-    </w:p>
-    <w:p>
-      <w:pPr>
-        <w:pStyle w:val="FirstParagraph"/>
-      </w:pPr>
-      <w:r>
-        <w:t xml:space="preserve">Several categories of natural capital that are highly relevant to the AFE region are entirely absent from current account coverage. Marine and ocean accounts are compiled by no country in the region, despite the economic importance of Indian Ocean fisheries for Kenya, Tanzania, Madagascar, and Mozambique, and the formal significance of South Africa’s 200 km² EEZ. The only coastal ecosystem accounts in the region are South Africa’s experimental estuary accounts, which reveal that only 4 percent of assessed estuaries have good fish condition, sawfish are now extinct in South Africa, and dusky kob spawner biomass is below 2 percent of pristine levels</w:t>
-      </w:r>
-      <w:r>
-        <w:t xml:space="preserve"> </w:t>
-      </w:r>
-      <w:r>
-        <w:t xml:space="preserve">(Niekerk et al., 2020)</w:t>
-      </w:r>
-      <w:r>
-        <w:t xml:space="preserve">. These are findings that suggest the absence of formal coastal accounts elsewhere is concealing analogous, if unquantified, degradation trends. Biodiversity accounts are present only in experimental form in South Africa (biodiversity tourism, 2013-2019) and the DRC (IBIS-model biodiversity status index, declining from 68.8 to 61.4 percent between 2000 and 2020). Kenya documents that wildlife populations have fallen to 27.3 percent of their 1977-1980 levels and are projected below 10 percent by 2050 under business-as-usual</w:t>
-      </w:r>
-      <w:r>
-        <w:t xml:space="preserve"> </w:t>
-      </w:r>
-      <w:r>
-        <w:t xml:space="preserve">(Turpie, Wilson, Hickinbotham, et al., 2025)</w:t>
-      </w:r>
-      <w:r>
-        <w:t xml:space="preserve">. Mineral accounts are absent across the entire AFE region, despite South Africa’s mine footprint growing 15.9 percent (1990-2014), Zambia’s Copperbelt generating documented water quality hotspots from acid mine drainage, and the DRC deriving substantial government revenue from mining activities while forest depletion accelerates. Fisheries and aquaculture accounts are similarly absent, while Zambia’s fish production sector is valued at US$422.6 million (2023) with aquaculture growing 112 percent over five years. Nevertheless, no formal ecosystem account frames this activity within a natural capital balance</w:t>
-      </w:r>
-      <w:r>
-        <w:t xml:space="preserve"> </w:t>
-      </w:r>
-      <w:r>
-        <w:t xml:space="preserve">(Chisanga et al., 2026)</w:t>
-      </w:r>
-      <w:r>
-        <w:t xml:space="preserve">.</w:t>
+        <w:t xml:space="preserve">The most important gaps, measured by their potential to change policy decisions, lie in monetary accounts. The capacity and statistical infrastructure requirements for full monetary ecosystem service valuation are substantially higher than for physical accounts, but the policy arguments they enable; for example,cost-benefit comparisons with infrastructure alternatives, pricing of water and forest services, fiscal case for conservation investment; are more powerful in turn. Within ecosystem accounts, condition accounts and monetary ecosystem services accounts are the priority extensions for countries already compiling extent accounts. Thematically, ocean and coastal accounts, biodiversity accounts, and mineral accounts are essentially absent from the region and represent a new frontier of potential account development, particularly relevant to the region’s coastal states and mineral-resource-dependent economies.</w:t>
       </w:r>
     </w:p>
     <w:bookmarkEnd w:id="43"/>
-    <w:bookmarkStart w:id="44" w:name="priority-areas-for-capacity-development"/>
-    <w:p>
-      <w:pPr>
-        <w:pStyle w:val="Heading3"/>
-      </w:pPr>
-      <w:r>
-        <w:t xml:space="preserve">3.5.7 Priority Areas for Capacity Development</w:t>
-      </w:r>
-    </w:p>
-    <w:p>
-      <w:pPr>
-        <w:pStyle w:val="FirstParagraph"/>
-      </w:pPr>
-      <w:r>
-        <w:t xml:space="preserve">The review of country-level accounts reveals a clear two-tier structure in AFE’s natural capital accounting. A leading group, consisting of Kenya, South Africa, Uganda, and Zambia, has built programmes spanning multiple account types and framework components, and represents the natural candidates for peer learning, south-south knowledge exchange, and cross-border data harmonization on shared basins and ecosystems. A second tier, consisting of Ethiopia, Madagascar, and Mauritius, has made substantive starts but remains largely anchored in physical Central Framework accounts, suggesting that targeted support to expand into monetary valuation and ecosystem accounting would yield the highest marginal returns for existing institutional investments.</w:t>
-      </w:r>
-    </w:p>
-    <w:p>
-      <w:pPr>
-        <w:pStyle w:val="BodyText"/>
-      </w:pPr>
-      <w:r>
-        <w:t xml:space="preserve">The most important gaps, measured by their potential to change policy decisions, lie in monetary accounts. The capacity and statistical infrastructure requirements for full monetary ecosystem service valuation are substantially higher than for physical accounts, but the policy arguments they enable; for example,cost-benefit comparisons with infrastructure alternatives, pricing of water and forest services, fiscal case for conservation investment; are more powerful in turn. Within ecosystem accounts, condition accounts and monetary ecosystem services accounts are the priority extensions for countries already compiling extent accounts. Thematically, ocean and coastal accounts, biodiversity accounts, and mineral accounts are essentially absent from the region and represent a new frontier of potential account development, particularly relevant to the region’s coastal states and mineral-resource-dependent economies.</w:t>
-      </w:r>
-    </w:p>
     <w:bookmarkEnd w:id="44"/>
     <w:bookmarkEnd w:id="45"/>
-    <w:bookmarkEnd w:id="46"/>
-    <w:bookmarkStart w:id="115" w:name="X76bb7b6852bedb331065c4666ebe34b0116b55b"/>
+    <w:bookmarkStart w:id="114" w:name="X76bb7b6852bedb331065c4666ebe34b0116b55b"/>
     <w:p>
       <w:pPr>
         <w:pStyle w:val="Heading1"/>
@@ -3647,7 +3653,7 @@
         <w:t xml:space="preserve">. Where monetary valuation of ecosystem services has not yet been completed, this is noted explicitly together with the magnitude of the physical flows involved and available economic proxy data, to indicate the scale of what remains to be valued. The annex is intended as a reference for analysis.</w:t>
       </w:r>
     </w:p>
-    <w:bookmarkStart w:id="51" w:name="sec-annex-drc"/>
+    <w:bookmarkStart w:id="50" w:name="sec-annex-drc"/>
     <w:p>
       <w:pPr>
         <w:pStyle w:val="Heading2"/>
@@ -3673,7 +3679,7 @@
         <w:t xml:space="preserve">. The accounts are restricted to forest ecosystems, reflecting the DRC’s status as the custodian of the world’s second-largest tropical forest biome. They were produced by Anchor Environmental Consultants under the leadership of Dr Jane Turpie, with World Bank project leadership from Kanta Kumari Rigaud, Tsegaye Ginbo Gatiso, and colleagues, and with financial support from CAFI and the Climate Investment Funds. The macroeconomic context is stark. Results show that the forestry sector contributes approximately 9 percent of GDP (down from 11 percent in 1990). Moreover, 94 percent of the country’s total energy supply comes from forest biomass (98.8 percent of household energy), and approximately 90 percent of logging activity in 2014 was informal, small-scale, or illegal. With a population of approximately 96 million in 2020 and a poverty headcount of 63.9 percent (2012 data), the DRC’s forests simultaneously constitute its largest natural capital asset and the primary energy source for tens of millions of households.</w:t>
       </w:r>
     </w:p>
-    <w:bookmarkStart w:id="47" w:name="X390aa371f10c3290f270da966dde7e6a15dd654"/>
+    <w:bookmarkStart w:id="46" w:name="X390aa371f10c3290f270da966dde7e6a15dd654"/>
     <w:p>
       <w:pPr>
         <w:pStyle w:val="Heading3"/>
@@ -3699,35 +3705,35 @@
         <w:t xml:space="preserve">. Lowland forest, which is the dominant class, covered 104,336,681 ha (45.2 percent) in 2000 and declined to 97,467,643 ha (42.3 percent) by 2020, a net loss of 6,869,000 ha (6.6 percent) over two decades. Submontane forest fell from 3,096,792 to 2,884,494 ha (−6.9 percent) and montane forest from 1,900,909 to 1,612,987 ha (−15.1 percent). Total forest cover lost across all types between 2000 and 2020 was 11,568,000 ha. The rate of loss accelerated sharply, reflecting an annual deforestation rate of approximately 0.5 percent per year in the first decade (2000-2010), and rising to above 0.8 percent per year in the second decade (2010-2020), more than doubling. The most revealing transition is the expansion of forest-farm mosaic-degraded, mixed-use agricultural-forest landscapes, that changed from 2,777,041 ha (1.2 percent) in 2000 to 9,970,589 ha (4.3 percent) in 2020 (+259 percent over 20 years), with growth of 83 percent in the first decade and 96 percent in the second. Cropland expanded from 1,451,609 ha (0.6 percent) to 3,592,903 ha (1.6 percent), a 147 percent increase. Human-transformed ecosystems collectively grew from 2.2 to 6.8 percent of national land cover. At the provincial level, Kwilu suffered the largest absolute lowland forest loss (720,000 ha, 2000-2020), while Kinshasa province lost 67 percent of its forest cover and Kasai Oriental 50 percent, documenting the acute forest pressure around urban centres and agricultural frontier zones.</w:t>
       </w:r>
     </w:p>
+    <w:bookmarkEnd w:id="46"/>
+    <w:bookmarkStart w:id="47" w:name="X5445ab3e3f9820c4b07e75e5f5eb89a15b68430"/>
+    <w:p>
+      <w:pPr>
+        <w:pStyle w:val="Heading3"/>
+      </w:pPr>
+      <w:r>
+        <w:t xml:space="preserve">4.1.2 Ecosystem Condition Accounts (SEEA Ecosystem Accounting)</w:t>
+      </w:r>
+    </w:p>
+    <w:p>
+      <w:pPr>
+        <w:pStyle w:val="FirstParagraph"/>
+      </w:pPr>
+      <w:r>
+        <w:t xml:space="preserve">The condition accounts track biodiversity status using the IBIS (Integrated Biodiversity Assessment System) model, which estimates the percentage of original species populations remaining given observed habitat change. National biodiversity status declined from 68.8 percent in 2000 to 65.5 percent in 2010 and 61.4 percent in 2020, indicating a continued erosion of ecological integrity even in a country where over 60 percent of territory remains forested. Lowland forest, which is the biologically richest category, fell from 69.2 to 61.4 percent. Carbon condition tells a different story, where net carbon retention increased by 2.6 percent (2000-2010) and 2.4 percent (2010-2020) due to a CO₂ fertilization effect on biomass accumulation in intact forests, even as total forest area declined. The accounts call attention to an acute overexploitation in the bushmeat sub-sector. Extraction rates were 60 percent above sustainable yield in 2000 and had risen to 64 percent above sustainable yield by 2020</w:t>
+      </w:r>
+      <w:r>
+        <w:t xml:space="preserve"> </w:t>
+      </w:r>
+      <w:r>
+        <w:t xml:space="preserve">(Turpie, Wilson, Brühl, et al., 2025)</w:t>
+      </w:r>
+      <w:r>
+        <w:t xml:space="preserve">. Bushmeat income represents approximately 32 percent of annual household income in some forest-dependent communities such as the Rubi-Tele Hunting Domain, making its overexploitation both an ecological risk and a livelihood vulnerability.</w:t>
+      </w:r>
+    </w:p>
     <w:bookmarkEnd w:id="47"/>
-    <w:bookmarkStart w:id="48" w:name="X5445ab3e3f9820c4b07e75e5f5eb89a15b68430"/>
-    <w:p>
-      <w:pPr>
-        <w:pStyle w:val="Heading3"/>
-      </w:pPr>
-      <w:r>
-        <w:t xml:space="preserve">4.1.2 Ecosystem Condition Accounts (SEEA Ecosystem Accounting)</w:t>
-      </w:r>
-    </w:p>
-    <w:p>
-      <w:pPr>
-        <w:pStyle w:val="FirstParagraph"/>
-      </w:pPr>
-      <w:r>
-        <w:t xml:space="preserve">The condition accounts track biodiversity status using the IBIS (Integrated Biodiversity Assessment System) model, which estimates the percentage of original species populations remaining given observed habitat change. National biodiversity status declined from 68.8 percent in 2000 to 65.5 percent in 2010 and 61.4 percent in 2020, indicating a continued erosion of ecological integrity even in a country where over 60 percent of territory remains forested. Lowland forest, which is the biologically richest category, fell from 69.2 to 61.4 percent. Carbon condition tells a different story, where net carbon retention increased by 2.6 percent (2000-2010) and 2.4 percent (2010-2020) due to a CO₂ fertilization effect on biomass accumulation in intact forests, even as total forest area declined. The accounts call attention to an acute overexploitation in the bushmeat sub-sector. Extraction rates were 60 percent above sustainable yield in 2000 and had risen to 64 percent above sustainable yield by 2020</w:t>
-      </w:r>
-      <w:r>
-        <w:t xml:space="preserve"> </w:t>
-      </w:r>
-      <w:r>
-        <w:t xml:space="preserve">(Turpie, Wilson, Brühl, et al., 2025)</w:t>
-      </w:r>
-      <w:r>
-        <w:t xml:space="preserve">. Bushmeat income represents approximately 32 percent of annual household income in some forest-dependent communities such as the Rubi-Tele Hunting Domain, making its overexploitation both an ecological risk and a livelihood vulnerability.</w:t>
-      </w:r>
-    </w:p>
-    <w:bookmarkEnd w:id="48"/>
-    <w:bookmarkStart w:id="49" w:name="X7eedb630186cdb71c7df3d4350fb17758ba688d"/>
+    <w:bookmarkStart w:id="48" w:name="X7eedb630186cdb71c7df3d4350fb17758ba688d"/>
     <w:p>
       <w:pPr>
         <w:pStyle w:val="Heading3"/>
@@ -3802,8 +3808,8 @@
         <w:t xml:space="preserve">). Excluding the global carbon externality, the domestically captured value was CDF 9,434 billion (US$3,345 million) per year in 2020, consisting of timber US$1,597 million; other wild resources (bushmeat, wild plants, other) US$476 million; sediment retention services US$709 million; and nature-based tourism US$20 million. Sediment export, an ecosystem disservice, increased approximately 71 percent between 2000 and 2020, reflecting watershed degradation from forest conversion. Fuelwood harvesting from forest-farm mosaics increased 709 percent between 2000 and 2020 as the agricultural frontier expanded, reflecting both population pressure and the near-total dependence of households on biomass for energy.</w:t>
       </w:r>
     </w:p>
-    <w:bookmarkEnd w:id="49"/>
-    <w:bookmarkStart w:id="50" w:name="Xae7c622cee37879a7cc2130a5ddbdc5155202bc"/>
+    <w:bookmarkEnd w:id="48"/>
+    <w:bookmarkStart w:id="49" w:name="Xae7c622cee37879a7cc2130a5ddbdc5155202bc"/>
     <w:p>
       <w:pPr>
         <w:pStyle w:val="Heading3"/>
@@ -3856,15 +3862,126 @@
         <w:t xml:space="preserve">). Forest depletion increased from CDF 818,896 million in 2000 to CDF 2,256,000 million in 2020, equivalent to a 113 percent increase in the 2010-2020 decade alone, eroding the apparent GDP and GNI growth. The accounts calculate that taking into account trajectories of unsustainable harvesting, the forest asset value in 2020 was CDF 19,583 billion (US$6.9 billion) less than it would have been if all harvests had been sustainable. Oil production is projected to decline permanently from 2026 onward, making the development of carbon finance, REDD+, and sustainable forest economy mechanisms an increasingly urgent fiscal priority for the DRC government. The accounts explicitly call for institutionalizing NCA compilation within the Institut National de la Statistique and for developing five-yearly update cycles to track trends in this rapidly changing landscape.</w:t>
       </w:r>
     </w:p>
+    <w:bookmarkEnd w:id="49"/>
     <w:bookmarkEnd w:id="50"/>
+    <w:bookmarkStart w:id="54" w:name="ethiopia"/>
+    <w:p>
+      <w:pPr>
+        <w:pStyle w:val="Heading2"/>
+      </w:pPr>
+      <w:r>
+        <w:t xml:space="preserve">4.2 Ethiopia</w:t>
+      </w:r>
+    </w:p>
+    <w:p>
+      <w:pPr>
+        <w:pStyle w:val="FirstParagraph"/>
+      </w:pPr>
+      <w:r>
+        <w:t xml:space="preserve">Ethiopia has compiled four SEEA accounts, comprising physical and monetary asset accounts for land (SEEA Central Framework), and ecosystem extent and ecosystem condition accounts (SEEA Ecosystem Accounting). These were produced through a government-led Technical Working Group supported by the World Bank and the United Nations Statistics Division, bringing Ethiopia into the SEEA implementation programme. The accounts cover the period 2013 to 2022 and are disaggregated to the level of regions and major river basins, including the Abay (Blue Nile) and Awash basins. Monetary valuation of ecosystem services has not yet been undertaken. The ecosystem service accounts are presented in physical units only, and monetary ecosystem asset accounts remain a next step identified in Ethiopia’s NCA Roadmap.</w:t>
+      </w:r>
+    </w:p>
+    <w:bookmarkStart w:id="51" w:name="X081bbdc0a4eadfea53e0d27d84fe103d624dede"/>
+    <w:p>
+      <w:pPr>
+        <w:pStyle w:val="Heading3"/>
+      </w:pPr>
+      <w:r>
+        <w:t xml:space="preserve">4.2.1 Land Asset Accounts (SEEA Central Framework)</w:t>
+      </w:r>
+    </w:p>
+    <w:p>
+      <w:pPr>
+        <w:pStyle w:val="FirstParagraph"/>
+      </w:pPr>
+      <w:r>
+        <w:t xml:space="preserve">The physical land asset accounts document Ethiopia’s land cover across 13 classes for 2013 and 2022, recorded in hectares at national level and for the Abay and Awash river basin case studies (Tables 4.1-4.4 in</w:t>
+      </w:r>
+      <w:r>
+        <w:t xml:space="preserve"> </w:t>
+      </w:r>
+      <w:r>
+        <w:t xml:space="preserve">Federal Democratic Republic of Ethiopia (2026)</w:t>
+      </w:r>
+      <w:r>
+        <w:t xml:space="preserve">). The most consequential change was the expansion of cropland. Annual cropland grew by 20 percent, from 21.7 million hectares to 25.9 million hectares, while perennial cropland, dominated by coffee, khat, enset, fruit trees, and sugarcane, expanded by 50 percent, from approximately 727,000 to 1.09 million hectares. Together, croplands now cover roughly 27 million hectares, accounting for nearly a quarter of Ethiopia’s total land area. This expansion came largely at the cost of shrublands, with open shrublands declining by 23 percent (approximately 7.7 million hectares) and closed shrublands by a similar margin. The built-up area grew by 50 percent, from 350,000 to 526,000 hectares, consistent with an industrial sector whose share of GDP rose from 12-15 percent in 2013 to 22-25 percent in 2022. Overall, only 52 percent of land cover remained in the same class across the two reference years, indicating a high rate of landscape change (Figure 4.1-4.2 in</w:t>
+      </w:r>
+      <w:r>
+        <w:t xml:space="preserve"> </w:t>
+      </w:r>
+      <w:r>
+        <w:t xml:space="preserve">Federal Democratic Republic of Ethiopia (2026)</w:t>
+      </w:r>
+      <w:r>
+        <w:t xml:space="preserve">).</w:t>
+      </w:r>
+    </w:p>
+    <w:p>
+      <w:pPr>
+        <w:pStyle w:val="BodyText"/>
+      </w:pPr>
+      <w:r>
+        <w:t xml:space="preserve">Forest cover presents a more complex picture. Total forest area, combining dense, moderate, and sparse forest, increased from 22.3 million to 27.2 million hectares, a gain of 4.9 million hectares (22 percent). Dense forest grew by 13 percent (1.6 million ha) and moderate forest by 45 percent (3.6 million ha), while sparse forest declined by 13 percent (0.3 million ha). These gains are partly attributable to restoration and afforestation efforts including the Green Legacy Initiative, though the report cautions that differences in data sources, forest definitions, and canopy cover sensitivity to rainfall make it difficult to apportion change between ecological dynamics and reclassification (Section 4.5,</w:t>
+      </w:r>
+      <w:r>
+        <w:t xml:space="preserve"> </w:t>
+      </w:r>
+      <w:r>
+        <w:t xml:space="preserve">Federal Democratic Republic of Ethiopia (2026)</w:t>
+      </w:r>
+      <w:r>
+        <w:t xml:space="preserve">). Irrespective of cause, forest cover recorded in the accounts represents a critical natural asset. Ethiopia’s forest sector is estimated to contribute approximately 13 percent of GDP when informal and subsistence uses are included</w:t>
+      </w:r>
+      <w:r>
+        <w:t xml:space="preserve"> </w:t>
+      </w:r>
+      <w:r>
+        <w:t xml:space="preserve">(UNEP, 2016)</w:t>
+      </w:r>
+      <w:r>
+        <w:t xml:space="preserve">, or around 6 percent on a formal sector basis</w:t>
+      </w:r>
+      <w:r>
+        <w:t xml:space="preserve"> </w:t>
+      </w:r>
+      <w:r>
+        <w:t xml:space="preserve">(MEFCC, 2017)</w:t>
+      </w:r>
+      <w:r>
+        <w:t xml:space="preserve">. In 2012-13, Ethiopian forests generated cash and in-kind economic benefits equivalent to USD 16.7 billion (approximately ETB 111 billion), underscoring the scale of forest dependency in the economy even before any formal monetization of ecosystem services.</w:t>
+      </w:r>
+    </w:p>
+    <w:p>
+      <w:pPr>
+        <w:pStyle w:val="BodyText"/>
+      </w:pPr>
+      <w:r>
+        <w:t xml:space="preserve">The monetary context for land extends well beyond the forest sector. Between 2013 and 2022, Ethiopia’s GDP grew from approximately USD 47.5 billion to USD 156 billion, which represents a near-tripling in nominal terms, while the agriculture, forestry, and fisheries aggregate expanded from USD 19.7 to USD 47.7 billion in nominal terms (or by 58 percent in real terms). Agriculture’s GDP share fell from approximately 43 percent to 35 percent, reflecting structural transformation, yet the sector continued to employ roughly 70 percent of the workforce. Coffee alone generates USD 1.4 billion in annual export earnings, representing 35 percent of total export revenue. Working against these gains, land degradation is estimated to reduce Ethiopia’s agricultural GDP by 2 to 6.75 percent annually</w:t>
+      </w:r>
+      <w:r>
+        <w:t xml:space="preserve"> </w:t>
+      </w:r>
+      <w:r>
+        <w:t xml:space="preserve">(</w:t>
+      </w:r>
+      <w:r>
+        <w:t xml:space="preserve">Nkonya et al.</w:t>
+      </w:r>
+      <w:r>
+        <w:t xml:space="preserve">, 2016)</w:t>
+      </w:r>
+      <w:r>
+        <w:t xml:space="preserve">, implying a foregone value in the range of USD 1-3 billion per year based on 2022 sector size. This gap between the potential and actual productivity of Ethiopian land, visible spatially in the accounts, is precisely the type of information that monetary land asset accounts are designed to formalize and communicate to economic planners. Completing the transition from physical to monetary land accounts would give Ethiopia a tool to benchmark the cost of degradation against the returns from restoration investments such as those supported under the Ethiopia Strategic Investment Framework for Sustainable Land Management (ESIF-II).</w:t>
+      </w:r>
+    </w:p>
     <w:bookmarkEnd w:id="51"/>
-    <w:bookmarkStart w:id="55" w:name="ethiopia"/>
-    <w:p>
-      <w:pPr>
-        <w:pStyle w:val="Heading2"/>
-      </w:pPr>
-      <w:r>
-        <w:t xml:space="preserve">4.2 Ethiopia</w:t>
+    <w:bookmarkStart w:id="52" w:name="X6298ff02da54ec4d880525fff9e726a84ede0ad"/>
+    <w:p>
+      <w:pPr>
+        <w:pStyle w:val="Heading3"/>
+      </w:pPr>
+      <w:r>
+        <w:t xml:space="preserve">4.2.2 Ecosystem Extent Accounts (SEEA Ecosystem Accounting)</w:t>
       </w:r>
     </w:p>
     <w:p>
@@ -3872,24 +3989,7 @@
         <w:pStyle w:val="FirstParagraph"/>
       </w:pPr>
       <w:r>
-        <w:t xml:space="preserve">Ethiopia has compiled four SEEA accounts, comprising physical and monetary asset accounts for land (SEEA Central Framework), and ecosystem extent and ecosystem condition accounts (SEEA Ecosystem Accounting). These were produced through a government-led Technical Working Group supported by the World Bank and the United Nations Statistics Division, bringing Ethiopia into the SEEA implementation programme. The accounts cover the period 2013 to 2022 and are disaggregated to the level of regions and major river basins, including the Abay (Blue Nile) and Awash basins. Monetary valuation of ecosystem services has not yet been undertaken. The ecosystem service accounts are presented in physical units only, and monetary ecosystem asset accounts remain a next step identified in Ethiopia’s NCA Roadmap.</w:t>
-      </w:r>
-    </w:p>
-    <w:bookmarkStart w:id="52" w:name="X081bbdc0a4eadfea53e0d27d84fe103d624dede"/>
-    <w:p>
-      <w:pPr>
-        <w:pStyle w:val="Heading3"/>
-      </w:pPr>
-      <w:r>
-        <w:t xml:space="preserve">4.2.1 Land Asset Accounts (SEEA Central Framework)</w:t>
-      </w:r>
-    </w:p>
-    <w:p>
-      <w:pPr>
-        <w:pStyle w:val="FirstParagraph"/>
-      </w:pPr>
-      <w:r>
-        <w:t xml:space="preserve">The physical land asset accounts document Ethiopia’s land cover across 13 classes for 2013 and 2022, recorded in hectares at national level and for the Abay and Awash river basin case studies (Tables 4.1-4.4 in</w:t>
+        <w:t xml:space="preserve">The ecosystem extent accounts use land cover data as a proxy for ecosystem type distribution, following standard practice at this stage of SEEA-EA implementation. At the national level, the accounts confirm that shrublands, open and closed combined, remain the single largest ecosystem group, covering over 36 million hectares in 2022 despite a decline from 46 million in 2013. Croplands constitute the second largest category at 27 million hectares, followed by forests at 27.2 million hectares. Grasslands cover approximately 12.3 million hectares and wetlands and water bodies together account for a modest 1.5 million hectares. The spatial backbone of these accounts enables sub-national disaggregation that is policy-relevant in a country as ecologically diverse as Ethiopia. The Abay (Blue Nile) basin, for example, is 43 percent annual cropland, more than double the national share, making it the agricultural heartland of the country and the principal basin for soil erosion risk and watershed management investment (Figure 4.13,</w:t>
       </w:r>
       <w:r>
         <w:t xml:space="preserve"> </w:t>
@@ -3898,16 +3998,7 @@
         <w:t xml:space="preserve">Federal Democratic Republic of Ethiopia (2026)</w:t>
       </w:r>
       <w:r>
-        <w:t xml:space="preserve">). The most consequential change was the expansion of cropland. Annual cropland grew by 20 percent, from 21.7 million hectares to 25.9 million hectares, while perennial cropland, dominated by coffee, khat, enset, fruit trees, and sugarcane, expanded by 50 percent, from approximately 727,000 to 1.09 million hectares. Together, croplands now cover roughly 27 million hectares, accounting for nearly a quarter of Ethiopia’s total land area. This expansion came largely at the cost of shrublands, with open shrublands declining by 23 percent (approximately 7.7 million hectares) and closed shrublands by a similar margin. The built-up area grew by 50 percent, from 350,000 to 526,000 hectares, consistent with an industrial sector whose share of GDP rose from 12-15 percent in 2013 to 22-25 percent in 2022. Overall, only 52 percent of land cover remained in the same class across the two reference years, indicating a high rate of landscape change (Figure 4.1-4.2 in</w:t>
-      </w:r>
-      <w:r>
-        <w:t xml:space="preserve"> </w:t>
-      </w:r>
-      <w:r>
-        <w:t xml:space="preserve">Federal Democratic Republic of Ethiopia (2026)</w:t>
-      </w:r>
-      <w:r>
-        <w:t xml:space="preserve">).</w:t>
+        <w:t xml:space="preserve">). The Awash basin, by contrast, has 26 percent bare land, three times the national share, and the almost complete disappearance of closed grassland (from 91,000 ha in 2013 to just 66 ha in 2022) shows the severity of land degradation pressures in this basin. Both basins have Landscape Stability Index scores below 0.56, indicating that nearly half of the land changed class over nine years, a rate of change that warrants targeted monitoring.</w:t>
       </w:r>
     </w:p>
     <w:p>
@@ -3915,90 +4006,11 @@
         <w:pStyle w:val="BodyText"/>
       </w:pPr>
       <w:r>
-        <w:t xml:space="preserve">Forest cover presents a more complex picture. Total forest area, combining dense, moderate, and sparse forest, increased from 22.3 million to 27.2 million hectares, a gain of 4.9 million hectares (22 percent). Dense forest grew by 13 percent (1.6 million ha) and moderate forest by 45 percent (3.6 million ha), while sparse forest declined by 13 percent (0.3 million ha). These gains are partly attributable to restoration and afforestation efforts including the Green Legacy Initiative, though the report cautions that differences in data sources, forest definitions, and canopy cover sensitivity to rainfall make it difficult to apportion change between ecological dynamics and reclassification (Section 4.5,</w:t>
-      </w:r>
-      <w:r>
-        <w:t xml:space="preserve"> </w:t>
-      </w:r>
-      <w:r>
-        <w:t xml:space="preserve">Federal Democratic Republic of Ethiopia (2026)</w:t>
-      </w:r>
-      <w:r>
-        <w:t xml:space="preserve">). Irrespective of cause, forest cover recorded in the accounts represents a critical natural asset. Ethiopia’s forest sector is estimated to contribute approximately 13 percent of GDP when informal and subsistence uses are included</w:t>
-      </w:r>
-      <w:r>
-        <w:t xml:space="preserve"> </w:t>
-      </w:r>
-      <w:r>
-        <w:t xml:space="preserve">(UNEP, 2016)</w:t>
-      </w:r>
-      <w:r>
-        <w:t xml:space="preserve">, or around 6 percent on a formal sector basis</w:t>
-      </w:r>
-      <w:r>
-        <w:t xml:space="preserve"> </w:t>
-      </w:r>
-      <w:r>
-        <w:t xml:space="preserve">(MEFCC, 2017)</w:t>
-      </w:r>
-      <w:r>
-        <w:t xml:space="preserve">. In 2012-13, Ethiopian forests generated cash and in-kind economic benefits equivalent to USD 16.7 billion (approximately ETB 111 billion), underscoring the scale of forest dependency in the economy even before any formal monetization of ecosystem services.</w:t>
-      </w:r>
-    </w:p>
-    <w:p>
-      <w:pPr>
-        <w:pStyle w:val="BodyText"/>
-      </w:pPr>
-      <w:r>
-        <w:t xml:space="preserve">The monetary context for land extends well beyond the forest sector. Between 2013 and 2022, Ethiopia’s GDP grew from approximately USD 47.5 billion to USD 156 billion, which represents a near-tripling in nominal terms, while the agriculture, forestry, and fisheries aggregate expanded from USD 19.7 to USD 47.7 billion in nominal terms (or by 58 percent in real terms). Agriculture’s GDP share fell from approximately 43 percent to 35 percent, reflecting structural transformation, yet the sector continued to employ roughly 70 percent of the workforce. Coffee alone generates USD 1.4 billion in annual export earnings, representing 35 percent of total export revenue. Working against these gains, land degradation is estimated to reduce Ethiopia’s agricultural GDP by 2 to 6.75 percent annually</w:t>
-      </w:r>
-      <w:r>
-        <w:t xml:space="preserve"> </w:t>
-      </w:r>
-      <w:r>
-        <w:t xml:space="preserve">(Nkonya et al., 2016)</w:t>
-      </w:r>
-      <w:r>
-        <w:t xml:space="preserve">, implying a foregone value in the range of USD 1-3 billion per year based on 2022 sector size. This gap between the potential and actual productivity of Ethiopian land, visible spatially in the accounts, is precisely the type of information that monetary land asset accounts are designed to formalize and communicate to economic planners. Completing the transition from physical to monetary land accounts would give Ethiopia a tool to benchmark the cost of degradation against the returns from restoration investments such as those supported under the Ethiopia Strategic Investment Framework for Sustainable Land Management (ESIF-II).</w:t>
+        <w:t xml:space="preserve">The basin-level accounts also show the geographic concentration of Ethiopia’s most productive ecosystems. Southwest Ethiopia, Benishangul-Gumuz, and Gambela consistently emerge as high-capacity zones across multiple ecosystem service indicators; such as soil retention, water regulation, and carbon storage; while Somali, Afar, and Addis Ababa rank persistently below national averages. This spatial heterogeneity means that national-level figures mask significant distributional realities, where investments directed at high-capacity ecosystems in the southwest may yield disproportionately higher returns per hectare than equivalent investments in the lowland east. Initiatives working on watershed management or nature-based solutions under ESIF-II or similar programs can use the basin-level disaggregation in the accounts to target priority catchments.</w:t>
       </w:r>
     </w:p>
     <w:bookmarkEnd w:id="52"/>
-    <w:bookmarkStart w:id="53" w:name="X6298ff02da54ec4d880525fff9e726a84ede0ad"/>
-    <w:p>
-      <w:pPr>
-        <w:pStyle w:val="Heading3"/>
-      </w:pPr>
-      <w:r>
-        <w:t xml:space="preserve">4.2.2 Ecosystem Extent Accounts (SEEA Ecosystem Accounting)</w:t>
-      </w:r>
-    </w:p>
-    <w:p>
-      <w:pPr>
-        <w:pStyle w:val="FirstParagraph"/>
-      </w:pPr>
-      <w:r>
-        <w:t xml:space="preserve">The ecosystem extent accounts use land cover data as a proxy for ecosystem type distribution, following standard practice at this stage of SEEA-EA implementation. At the national level, the accounts confirm that shrublands, open and closed combined, remain the single largest ecosystem group, covering over 36 million hectares in 2022 despite a decline from 46 million in 2013. Croplands constitute the second largest category at 27 million hectares, followed by forests at 27.2 million hectares. Grasslands cover approximately 12.3 million hectares and wetlands and water bodies together account for a modest 1.5 million hectares. The spatial backbone of these accounts enables sub-national disaggregation that is policy-relevant in a country as ecologically diverse as Ethiopia. The Abay (Blue Nile) basin, for example, is 43 percent annual cropland, more than double the national share, making it the agricultural heartland of the country and the principal basin for soil erosion risk and watershed management investment (Figure 4.13,</w:t>
-      </w:r>
-      <w:r>
-        <w:t xml:space="preserve"> </w:t>
-      </w:r>
-      <w:r>
-        <w:t xml:space="preserve">Federal Democratic Republic of Ethiopia (2026)</w:t>
-      </w:r>
-      <w:r>
-        <w:t xml:space="preserve">). The Awash basin, by contrast, has 26 percent bare land, three times the national share, and the almost complete disappearance of closed grassland (from 91,000 ha in 2013 to just 66 ha in 2022) shows the severity of land degradation pressures in this basin. Both basins have Landscape Stability Index scores below 0.56, indicating that nearly half of the land changed class over nine years, a rate of change that warrants targeted monitoring.</w:t>
-      </w:r>
-    </w:p>
-    <w:p>
-      <w:pPr>
-        <w:pStyle w:val="BodyText"/>
-      </w:pPr>
-      <w:r>
-        <w:t xml:space="preserve">The basin-level accounts also show the geographic concentration of Ethiopia’s most productive ecosystems. Southwest Ethiopia, Benishangul-Gumuz, and Gambela consistently emerge as high-capacity zones across multiple ecosystem service indicators; such as soil retention, water regulation, and carbon storage; while Somali, Afar, and Addis Ababa rank persistently below national averages. This spatial heterogeneity means that national-level figures mask significant distributional realities, where investments directed at high-capacity ecosystems in the southwest may yield disproportionately higher returns per hectare than equivalent investments in the lowland east. Initiatives working on watershed management or nature-based solutions under ESIF-II or similar programs can use the basin-level disaggregation in the accounts to target priority catchments.</w:t>
-      </w:r>
-    </w:p>
-    <w:bookmarkEnd w:id="53"/>
-    <w:bookmarkStart w:id="54" w:name="Xaf444b6de6a5826c820a32d733ad12dfda1b2d5"/>
+    <w:bookmarkStart w:id="53" w:name="Xaf444b6de6a5826c820a32d733ad12dfda1b2d5"/>
     <w:p>
       <w:pPr>
         <w:pStyle w:val="Heading3"/>
@@ -4159,15 +4171,85 @@
         <w:t xml:space="preserve">The ecosystem services accounts currently lack monetary estimates for any service. The following services have the most established valuation pathways and the strongest policy demand: soil protection valuation, via avoided cost of productivity loss from erosion, building on the 2-6.75 percent GDP damage estimate; water regulation services, via avoided flood damage and water supply reliability for hydropower and irrigation; carbon sequestration, via carbon market prices and NDC compliance values; and biomass provisioning (fuelwood and grazing), given that over 90 percent of Ethiopian households rely on wood as their primary energy source, implying a very large but unmeasured contribution to household welfare. Completion of monetary ecosystem service accounts would allow Ethiopia to formally report ecosystem contributions alongside GDP, to assess the cost-effectiveness of ESIF-II investments in ecosystem terms, and to access a wider range of climate and biodiversity finance instruments.</w:t>
       </w:r>
     </w:p>
+    <w:bookmarkEnd w:id="53"/>
     <w:bookmarkEnd w:id="54"/>
+    <w:bookmarkStart w:id="61" w:name="kenya"/>
+    <w:p>
+      <w:pPr>
+        <w:pStyle w:val="Heading2"/>
+      </w:pPr>
+      <w:r>
+        <w:t xml:space="preserve">4.3 Kenya</w:t>
+      </w:r>
+    </w:p>
+    <w:p>
+      <w:pPr>
+        <w:pStyle w:val="FirstParagraph"/>
+      </w:pPr>
+      <w:r>
+        <w:t xml:space="preserve">Kenya has compiled the most comprehensive set of SEEA accounts in the AFE region, with ten accounts spanning five sectors and comprising water (physical supply and use tables and physical asset accounts), energy (physical and monetary supply and use tables), land (physical asset accounts), ecosystem accounts (extent, condition, physical services, and monetary services), and forest thematic accounts. These were produced through the Kenya National Bureau of Statistics (KNBS) in partnership with dedicated Technical Working Committees for each sector, under the National Plan for Advancing Environmental-Economic Accounting (NP-AEEA) 2025-2028, with financial and technical support from the World Bank Global Program on Sustainability. The accounts collectively provide a rare example of monetary ecosystem service valuation in the AFE region, spanning livestock production, sediment retention, and nature-based tourism. They position Kenya to integrate natural capital into fiscal planning through the Kenya Macroeconomic and Fiscal Model (KENMOD). As a background framing, 35 percent of Kenya’s total wealth has been estimated to derive from natural capital including cropland and pastureland, and 18 percent of Kenya’s GDP comes from counties where natural ecosystem services that underpin economic activity, sucha as water provision, soil fertility, pollination, climate regulation, are at high risk of degradation.</w:t>
+      </w:r>
+    </w:p>
+    <w:bookmarkStart w:id="55" w:name="X0266d963b2bd6bcc24eaa70c2f27b3f6b9bf949"/>
+    <w:p>
+      <w:pPr>
+        <w:pStyle w:val="Heading3"/>
+      </w:pPr>
+      <w:r>
+        <w:t xml:space="preserve">4.3.1 Water Supply and Use Tables and Asset Accounts (SEEA Central Framework)</w:t>
+      </w:r>
+    </w:p>
+    <w:p>
+      <w:pPr>
+        <w:pStyle w:val="FirstParagraph"/>
+      </w:pPr>
+      <w:r>
+        <w:t xml:space="preserve">Kenya’s physical water accounts cover supply and use tables for 2021 and 2023, and a physical asset account at both national and basin levels, compiled as part of the NP-AEEA implementation</w:t>
+      </w:r>
+      <w:r>
+        <w:t xml:space="preserve"> </w:t>
+      </w:r>
+      <w:r>
+        <w:t xml:space="preserve">(World Bank &amp; Prime Africa Consult, 2025)</w:t>
+      </w:r>
+      <w:r>
+        <w:t xml:space="preserve">. In 2023, total national water supply was estimated at 5,716 million m³, drawn predominantly from surface water, with groundwater abstraction increasing. Total precipitation over the accounting territory was close to 588,399 million m³ in 2023, but most of this water was lost to evapotranspiration, leaving a fraction available for economic use. Electricity generation was the single largest sectoral user of water in the accounts, followed by households and agriculture. Non-revenue water losses, which is water produced but lost before reaching the consumer through physical leaks, unauthorized abstraction, or metering errors, declined modestly over the period, a positive trend given the cost implications for water utilities.</w:t>
+      </w:r>
+    </w:p>
+    <w:p>
+      <w:pPr>
+        <w:pStyle w:val="BodyText"/>
+      </w:pPr>
+      <w:r>
+        <w:t xml:space="preserve">Basin-level disaggregation reveals highly uneven water availability and stress. In 2021, per capita water use ranged from just 8 m³ per person per year in the Lake Victoria South basin to 91 m³ per person per year in the Tana basin, against a national average of 26.6 m³. This is a difference of more than tenfold within the same national territory (Table 3-5,</w:t>
+      </w:r>
+      <w:r>
+        <w:t xml:space="preserve"> </w:t>
+      </w:r>
+      <w:r>
+        <w:t xml:space="preserve">World Bank &amp; Prime Africa Consult (2025)</w:t>
+      </w:r>
+      <w:r>
+        <w:t xml:space="preserve">). The Rift Valley basin showed the clearest signs of groundwater stress, with a groundwater use-to-availability ratio exceeding 100 percent, indicating that abstraction was surpassing the sustainable yield of the aquifer. This is a direct policy insight, showing that continued development in the Rift Valley without managed groundwater recharge or demand reduction risks compounding water insecurity in an already climate-stressed region. The Tana basin’s high per-capita use reflects the dominance of hydropower and irrigation demands in this catchment, and the basin accounts provide the baseline for linking any future change in ecosystem condition (sediment loads, dry-season flow regulation) to the economic costs of infrastructure degradation. The accounts also take an initial step toward water quality accounts, documenting that nutrient pollution, low dissolved oxygen, and naturally high fluoride levels pose challenges across basins, and proposing a SEEA water quality account structure for future compilation (Section 3.4,</w:t>
+      </w:r>
+      <w:r>
+        <w:t xml:space="preserve"> </w:t>
+      </w:r>
+      <w:r>
+        <w:t xml:space="preserve">World Bank &amp; Prime Africa Consult (2025)</w:t>
+      </w:r>
+      <w:r>
+        <w:t xml:space="preserve">).</w:t>
+      </w:r>
+    </w:p>
     <w:bookmarkEnd w:id="55"/>
-    <w:bookmarkStart w:id="62" w:name="kenya"/>
-    <w:p>
-      <w:pPr>
-        <w:pStyle w:val="Heading2"/>
-      </w:pPr>
-      <w:r>
-        <w:t xml:space="preserve">4.3 Kenya</w:t>
+    <w:bookmarkStart w:id="56" w:name="X072e9dd4f845d2ed23b8947a1cd089f85fa4f91"/>
+    <w:p>
+      <w:pPr>
+        <w:pStyle w:val="Heading3"/>
+      </w:pPr>
+      <w:r>
+        <w:t xml:space="preserve">4.3.2 Energy Supply and Use Tables (SEEA Central Framework)</w:t>
       </w:r>
     </w:p>
     <w:p>
@@ -4175,16 +4257,43 @@
         <w:pStyle w:val="FirstParagraph"/>
       </w:pPr>
       <w:r>
-        <w:t xml:space="preserve">Kenya has compiled the most comprehensive set of SEEA accounts in the AFE region, with ten accounts spanning five sectors and comprising water (physical supply and use tables and physical asset accounts), energy (physical and monetary supply and use tables), land (physical asset accounts), ecosystem accounts (extent, condition, physical services, and monetary services), and forest thematic accounts. These were produced through the Kenya National Bureau of Statistics (KNBS) in partnership with dedicated Technical Working Committees for each sector, under the National Plan for Advancing Environmental-Economic Accounting (NP-AEEA) 2025-2028, with financial and technical support from the World Bank Global Program on Sustainability. The accounts collectively provide a rare example of monetary ecosystem service valuation in the AFE region, spanning livestock production, sediment retention, and nature-based tourism. They position Kenya to integrate natural capital into fiscal planning through the Kenya Macroeconomic and Fiscal Model (KENMOD). As a background framing, 35 percent of Kenya’s total wealth has been estimated to derive from natural capital including cropland and pastureland, and 18 percent of Kenya’s GDP comes from counties where natural ecosystem services that underpin economic activity, sucha as water provision, soil fertility, pollination, climate regulation, are at high risk of degradation.</w:t>
-      </w:r>
-    </w:p>
-    <w:bookmarkStart w:id="56" w:name="X0266d963b2bd6bcc24eaa70c2f27b3f6b9bf949"/>
+        <w:t xml:space="preserve">Kenya has published physical energy supply and use tables annually in the KNBS Economic Survey since 2018. In 2025, the first monetary energy supply and use table (MSUT) was compiled for the year 2024, marking a significant milestone in the integration of physical and monetary information</w:t>
+      </w:r>
+      <w:r>
+        <w:t xml:space="preserve"> </w:t>
+      </w:r>
+      <w:r>
+        <w:t xml:space="preserve">(Kenya National Bureau of Statistics, 2026a; World Bank &amp; Prime Africa Consult, 2025)</w:t>
+      </w:r>
+      <w:r>
+        <w:t xml:space="preserve">. The physical accounts confirm Kenya’s heavy reliance on renewable sources for grid electricity, which shows that geothermal (19,984 TJ) leads, followed by hydropower (13,071 TJ), wind (6,472 TJ), and solar (1,658 TJ). However, these grid flows are dwarfed by biomass in the overall energy balance, because firewood and charcoal together account for more than 1.2 million TJ of household energy use, underscoring that Kenya remains a biomass-dependent economy for cooking and heating despite its renewable electricity steps forward.</w:t>
+      </w:r>
+    </w:p>
+    <w:p>
+      <w:pPr>
+        <w:pStyle w:val="BodyText"/>
+      </w:pPr>
+      <w:r>
+        <w:t xml:space="preserve">The monetary energy accounts reveal a fundamentally different picture from the physical accounts. Total monetary supply of energy products was valued at KES 580.5 billion in 2024, while recorded uses amounted to KES 672.9 billion. This constitutes a gap of KES 174 billion attributable to statistical residuals and the accumulation of distribution margins and taxes across the energy supply chain (Table 2-1,</w:t>
+      </w:r>
+      <w:r>
+        <w:t xml:space="preserve"> </w:t>
+      </w:r>
+      <w:r>
+        <w:t xml:space="preserve">World Bank &amp; Prime Africa Consult (2025)</w:t>
+      </w:r>
+      <w:r>
+        <w:t xml:space="preserve">). Households dominate in monetary terms, with energy expenditures of approximately KES 749.8 billion. This stands in sharp contrast to the physical accounts, where households appear primarily as high-volume biomass users. In monetary terms, electricity and petroleum products drive household energy spending. Energy exports were valued at KES 55.2 billion. The monetary accounts expose that the predominance of biomass in physical terms masks a much larger electricity and petroleum market that has not historically been captured in environmental accounts. For initiatives advising on Kenya’s energy transition, the accounts provide the first integrated picture of where value is generated and consumed along the energy chain.</w:t>
+      </w:r>
+    </w:p>
+    <w:bookmarkEnd w:id="56"/>
+    <w:bookmarkStart w:id="57" w:name="X8dbb0da64ce0f295e0cea26f12335157cdb0000"/>
     <w:p>
       <w:pPr>
         <w:pStyle w:val="Heading3"/>
       </w:pPr>
       <w:r>
-        <w:t xml:space="preserve">4.3.1 Water Supply and Use Tables and Asset Accounts (SEEA Central Framework)</w:t>
+        <w:t xml:space="preserve">4.3.3 Physical Asset Accounts for Land (SEEA Central Framework)</w:t>
       </w:r>
     </w:p>
     <w:p>
@@ -4192,16 +4301,61 @@
         <w:pStyle w:val="FirstParagraph"/>
       </w:pPr>
       <w:r>
-        <w:t xml:space="preserve">Kenya’s physical water accounts cover supply and use tables for 2021 and 2023, and a physical asset account at both national and basin levels, compiled as part of the NP-AEEA implementation</w:t>
-      </w:r>
-      <w:r>
-        <w:t xml:space="preserve"> </w:t>
-      </w:r>
-      <w:r>
-        <w:t xml:space="preserve">(World Bank &amp; Prime Africa Consult, 2025)</w:t>
-      </w:r>
-      <w:r>
-        <w:t xml:space="preserve">. In 2023, total national water supply was estimated at 5,716 million m³, drawn predominantly from surface water, with groundwater abstraction increasing. Total precipitation over the accounting territory was close to 588,399 million m³ in 2023, but most of this water was lost to evapotranspiration, leaving a fraction available for economic use. Electricity generation was the single largest sectoral user of water in the accounts, followed by households and agriculture. Non-revenue water losses, which is water produced but lost before reaching the consumer through physical leaks, unauthorized abstraction, or metering errors, declined modestly over the period, a positive trend given the cost implications for water utilities.</w:t>
+        <w:t xml:space="preserve">Kenya’s physical land asset accounts, compiled by the World Bank GPS team with KNBS, use the System for Land-based Emissions Estimation in Kenya (SLEEK) programme’s 30-metre satellite time series as the primary data source, supplemented by IMPRESS project land cover maps for 2015-2023</w:t>
+      </w:r>
+      <w:r>
+        <w:t xml:space="preserve"> </w:t>
+      </w:r>
+      <w:r>
+        <w:t xml:space="preserve">(Soulard, 2025)</w:t>
+      </w:r>
+      <w:r>
+        <w:t xml:space="preserve">. The accounts cover the period 1990-2024, providing one of the longer continuous land cover time series available for any country in the AFE region. Kenya’s total land area is approximately 59 million hectares. Forest cover declined from 3,934,279 ha (6.65 percent of national area) in 1990 to 3,591,486 ha (6.07 percent) in 2024, a net loss of 342,793 ha over 34 years (Section 3.1,</w:t>
+      </w:r>
+      <w:r>
+        <w:t xml:space="preserve"> </w:t>
+      </w:r>
+      <w:r>
+        <w:t xml:space="preserve">Kenya National Bureau of Statistics (2026b)</w:t>
+      </w:r>
+      <w:r>
+        <w:t xml:space="preserve">). Using the FAO methodology restricted to land area only, the decline is from 6.78 percent to 6.19 percent over the same period. This reduction is concentrated in coastal and dryland forests, while montane forests within protected areas have been more stable. The ecosystem extent accounts extend this analysis to a broader ecosystem typology, showing that the 2002-2018 period saw annual cropland grow by approximately 1.4 million hectares (+29.5 percent), built-up areas double in extent, and all natural terrestrial ecosystem types decline in area.</w:t>
+      </w:r>
+    </w:p>
+    <w:bookmarkEnd w:id="57"/>
+    <w:bookmarkStart w:id="58" w:name="X5be0302abf7d30630396298cc38d1ae4e38e507"/>
+    <w:p>
+      <w:pPr>
+        <w:pStyle w:val="Heading3"/>
+      </w:pPr>
+      <w:r>
+        <w:t xml:space="preserve">4.3.4 Ecosystem Extent and Condition Accounts (SEEA Ecosystem Accounting)</w:t>
+      </w:r>
+    </w:p>
+    <w:p>
+      <w:pPr>
+        <w:pStyle w:val="FirstParagraph"/>
+      </w:pPr>
+      <w:r>
+        <w:t xml:space="preserve">Kenya’s ecosystem extent accounts cover terrestrial and mangrove ecosystems for 2002 and 2018</w:t>
+      </w:r>
+      <w:r>
+        <w:t xml:space="preserve"> </w:t>
+      </w:r>
+      <w:r>
+        <w:t xml:space="preserve">(Turpie, Wilson, Hickinbotham, et al., 2025)</w:t>
+      </w:r>
+      <w:r>
+        <w:t xml:space="preserve">. Savanna ecosystem types, such as Acacia-Commiphora bushland, wooded grassland, and grassland, dominate the national landscape, collectively covering 66 percent of Kenya in 2018. Acacia-Commiphora bushland alone occupies approximately 46 percent of the national territory. Forests account for only 6 percent of land area, concentrated in the more humid, mountainous central and western regions. Between 2002 and 2018, all natural terrestrial ecosystem types declined in extent, with moist wooded grassland recording the steepest percentage loss (28.9 percent), followed by plantations (19.7 percent decline), Masai xeric shrubland (15.6 percent), montane forest (8.2 percent), and coastal wooded grassland (8.0 percent). These losses were driven principally by cropland expansion and, to a lesser extent, by built-up area growth, which are the two human-modified categories that together increased their national coverage from 8.8 to 11.3 percent over the accounting period (Table 3.2,</w:t>
+      </w:r>
+      <w:r>
+        <w:t xml:space="preserve"> </w:t>
+      </w:r>
+      <w:r>
+        <w:t xml:space="preserve">Turpie, Wilson, Hickinbotham, et al. (2025)</w:t>
+      </w:r>
+      <w:r>
+        <w:t xml:space="preserve">).</w:t>
       </w:r>
     </w:p>
     <w:p>
@@ -4209,171 +4363,29 @@
         <w:pStyle w:val="BodyText"/>
       </w:pPr>
       <w:r>
-        <w:t xml:space="preserve">Basin-level disaggregation reveals highly uneven water availability and stress. In 2021, per capita water use ranged from just 8 m³ per person per year in the Lake Victoria South basin to 91 m³ per person per year in the Tana basin, against a national average of 26.6 m³. This is a difference of more than tenfold within the same national territory (Table 3-5,</w:t>
-      </w:r>
-      <w:r>
-        <w:t xml:space="preserve"> </w:t>
-      </w:r>
-      <w:r>
-        <w:t xml:space="preserve">World Bank &amp; Prime Africa Consult (2025)</w:t>
-      </w:r>
-      <w:r>
-        <w:t xml:space="preserve">). The Rift Valley basin showed the clearest signs of groundwater stress, with a groundwater use-to-availability ratio exceeding 100 percent, indicating that abstraction was surpassing the sustainable yield of the aquifer. This is a direct policy insight, showing that continued development in the Rift Valley without managed groundwater recharge or demand reduction risks compounding water insecurity in an already climate-stressed region. The Tana basin’s high per-capita use reflects the dominance of hydropower and irrigation demands in this catchment, and the basin accounts provide the baseline for linking any future change in ecosystem condition (sediment loads, dry-season flow regulation) to the economic costs of infrastructure degradation. The accounts also take an initial step toward water quality accounts, documenting that nutrient pollution, low dissolved oxygen, and naturally high fluoride levels pose challenges across basins, and proposing a SEEA water quality account structure for future compilation (Section 3.4,</w:t>
-      </w:r>
-      <w:r>
-        <w:t xml:space="preserve"> </w:t>
-      </w:r>
-      <w:r>
-        <w:t xml:space="preserve">World Bank &amp; Prime Africa Consult (2025)</w:t>
-      </w:r>
-      <w:r>
-        <w:t xml:space="preserve">).</w:t>
-      </w:r>
-    </w:p>
-    <w:bookmarkEnd w:id="56"/>
-    <w:bookmarkStart w:id="57" w:name="X072e9dd4f845d2ed23b8947a1cd089f85fa4f91"/>
-    <w:p>
-      <w:pPr>
-        <w:pStyle w:val="Heading3"/>
-      </w:pPr>
-      <w:r>
-        <w:t xml:space="preserve">4.3.2 Energy Supply and Use Tables (SEEA Central Framework)</w:t>
-      </w:r>
-    </w:p>
-    <w:p>
-      <w:pPr>
-        <w:pStyle w:val="FirstParagraph"/>
-      </w:pPr>
-      <w:r>
-        <w:t xml:space="preserve">Kenya has published physical energy supply and use tables annually in the KNBS Economic Survey since 2018. In 2025, the first monetary energy supply and use table (MSUT) was compiled for the year 2024, marking a significant milestone in the integration of physical and monetary information</w:t>
-      </w:r>
-      <w:r>
-        <w:t xml:space="preserve"> </w:t>
-      </w:r>
-      <w:r>
-        <w:t xml:space="preserve">(Kenya National Bureau of Statistics, 2026a; World Bank &amp; Prime Africa Consult, 2025)</w:t>
-      </w:r>
-      <w:r>
-        <w:t xml:space="preserve">. The physical accounts confirm Kenya’s heavy reliance on renewable sources for grid electricity, which shows that geothermal (19,984 TJ) leads, followed by hydropower (13,071 TJ), wind (6,472 TJ), and solar (1,658 TJ). However, these grid flows are dwarfed by biomass in the overall energy balance, because firewood and charcoal together account for more than 1.2 million TJ of household energy use, underscoring that Kenya remains a biomass-dependent economy for cooking and heating despite its renewable electricity steps forward.</w:t>
-      </w:r>
-    </w:p>
-    <w:p>
-      <w:pPr>
-        <w:pStyle w:val="BodyText"/>
-      </w:pPr>
-      <w:r>
-        <w:t xml:space="preserve">The monetary energy accounts reveal a fundamentally different picture from the physical accounts. Total monetary supply of energy products was valued at KES 580.5 billion in 2024, while recorded uses amounted to KES 672.9 billion. This constitutes a gap of KES 174 billion attributable to statistical residuals and the accumulation of distribution margins and taxes across the energy supply chain (Table 2-1,</w:t>
-      </w:r>
-      <w:r>
-        <w:t xml:space="preserve"> </w:t>
-      </w:r>
-      <w:r>
-        <w:t xml:space="preserve">World Bank &amp; Prime Africa Consult (2025)</w:t>
-      </w:r>
-      <w:r>
-        <w:t xml:space="preserve">). Households dominate in monetary terms, with energy expenditures of approximately KES 749.8 billion. This stands in sharp contrast to the physical accounts, where households appear primarily as high-volume biomass users. In monetary terms, electricity and petroleum products drive household energy spending. Energy exports were valued at KES 55.2 billion. The monetary accounts expose that the predominance of biomass in physical terms masks a much larger electricity and petroleum market that has not historically been captured in environmental accounts. For initiatives advising on Kenya’s energy transition, the accounts provide the first integrated picture of where value is generated and consumed along the energy chain.</w:t>
-      </w:r>
-    </w:p>
-    <w:bookmarkEnd w:id="57"/>
-    <w:bookmarkStart w:id="58" w:name="X8dbb0da64ce0f295e0cea26f12335157cdb0000"/>
-    <w:p>
-      <w:pPr>
-        <w:pStyle w:val="Heading3"/>
-      </w:pPr>
-      <w:r>
-        <w:t xml:space="preserve">4.3.3 Physical Asset Accounts for Land (SEEA Central Framework)</w:t>
-      </w:r>
-    </w:p>
-    <w:p>
-      <w:pPr>
-        <w:pStyle w:val="FirstParagraph"/>
-      </w:pPr>
-      <w:r>
-        <w:t xml:space="preserve">Kenya’s physical land asset accounts, compiled by the World Bank GPS team with KNBS, use the System for Land-based Emissions Estimation in Kenya (SLEEK) programme’s 30-metre satellite time series as the primary data source, supplemented by IMPRESS project land cover maps for 2015-2023</w:t>
-      </w:r>
-      <w:r>
-        <w:t xml:space="preserve"> </w:t>
-      </w:r>
-      <w:r>
-        <w:t xml:space="preserve">(Soulard, 2025)</w:t>
-      </w:r>
-      <w:r>
-        <w:t xml:space="preserve">. The accounts cover the period 1990-2024, providing one of the longer continuous land cover time series available for any country in the AFE region. Kenya’s total land area is approximately 59 million hectares. Forest cover declined from 3,934,279 ha (6.65 percent of national area) in 1990 to 3,591,486 ha (6.07 percent) in 2024, a net loss of 342,793 ha over 34 years (Section 3.1,</w:t>
-      </w:r>
-      <w:r>
-        <w:t xml:space="preserve"> </w:t>
-      </w:r>
-      <w:r>
-        <w:t xml:space="preserve">Kenya National Bureau of Statistics (2026b)</w:t>
-      </w:r>
-      <w:r>
-        <w:t xml:space="preserve">). Using the FAO methodology restricted to land area only, the decline is from 6.78 percent to 6.19 percent over the same period. This reduction is concentrated in coastal and dryland forests, while montane forests within protected areas have been more stable. The ecosystem extent accounts extend this analysis to a broader ecosystem typology, showing that the 2002-2018 period saw annual cropland grow by approximately 1.4 million hectares (+29.5 percent), built-up areas double in extent, and all natural terrestrial ecosystem types decline in area.</w:t>
+        <w:t xml:space="preserve">The ecosystem condition accounts assess the quality of forest and savanna ecosystems against pristine reference states, using remotely sensed indicators of tree height, tree cover, leaf area index, landscape connectivity, and vegetation indices. A key finding is that no forest ecosystem in Kenya achieved a condition score above 60 percent at the national level across either accounting year, indicating that a significant proportion of the forest estate is in degraded condition relative to a pristine reference state (Table 3.6,</w:t>
+      </w:r>
+      <w:r>
+        <w:t xml:space="preserve"> </w:t>
+      </w:r>
+      <w:r>
+        <w:t xml:space="preserve">Turpie, Wilson, Hickinbotham, et al. (2025)</w:t>
+      </w:r>
+      <w:r>
+        <w:t xml:space="preserve">). Within this picture, montane and western rainforests within protected areas remain comparatively intact, showing that approximately 30 percent of montane forest area was in good or pristine condition in 2018, while coastal forests fared worst, with no pristine areas remaining and over 80 percent falling into the moderate-to-extreme degradation classes. Over 40 percent of Kenya’s remaining natural areas are estimated to be degraded (SPACES, 2023, as cited in</w:t>
+      </w:r>
+      <w:r>
+        <w:t xml:space="preserve"> </w:t>
+      </w:r>
+      <w:r>
+        <w:t xml:space="preserve">Turpie, Wilson, Hickinbotham, et al. (2025)</w:t>
+      </w:r>
+      <w:r>
+        <w:t xml:space="preserve">). The condition accounts provide the spatial diagnostic needed to prioritize conservation and restoration investment. The contrast between well-functioning montane water towers (Mt. Kenya, Aberdares, Mau Complex) and critically degraded coastal and dryland forests is visible in the accounts and can be directly linked to the distribution of ecosystem service values.</w:t>
       </w:r>
     </w:p>
     <w:bookmarkEnd w:id="58"/>
-    <w:bookmarkStart w:id="59" w:name="X5be0302abf7d30630396298cc38d1ae4e38e507"/>
-    <w:p>
-      <w:pPr>
-        <w:pStyle w:val="Heading3"/>
-      </w:pPr>
-      <w:r>
-        <w:t xml:space="preserve">4.3.4 Ecosystem Extent and Condition Accounts (SEEA Ecosystem Accounting)</w:t>
-      </w:r>
-    </w:p>
-    <w:p>
-      <w:pPr>
-        <w:pStyle w:val="FirstParagraph"/>
-      </w:pPr>
-      <w:r>
-        <w:t xml:space="preserve">Kenya’s ecosystem extent accounts cover terrestrial and mangrove ecosystems for 2002 and 2018</w:t>
-      </w:r>
-      <w:r>
-        <w:t xml:space="preserve"> </w:t>
-      </w:r>
-      <w:r>
-        <w:t xml:space="preserve">(Turpie, Wilson, Hickinbotham, et al., 2025)</w:t>
-      </w:r>
-      <w:r>
-        <w:t xml:space="preserve">. Savanna ecosystem types, such as Acacia-Commiphora bushland, wooded grassland, and grassland, dominate the national landscape, collectively covering 66 percent of Kenya in 2018. Acacia-Commiphora bushland alone occupies approximately 46 percent of the national territory. Forests account for only 6 percent of land area, concentrated in the more humid, mountainous central and western regions. Between 2002 and 2018, all natural terrestrial ecosystem types declined in extent, with moist wooded grassland recording the steepest percentage loss (28.9 percent), followed by plantations (19.7 percent decline), Masai xeric shrubland (15.6 percent), montane forest (8.2 percent), and coastal wooded grassland (8.0 percent). These losses were driven principally by cropland expansion and, to a lesser extent, by built-up area growth, which are the two human-modified categories that together increased their national coverage from 8.8 to 11.3 percent over the accounting period (Table 3.2,</w:t>
-      </w:r>
-      <w:r>
-        <w:t xml:space="preserve"> </w:t>
-      </w:r>
-      <w:r>
-        <w:t xml:space="preserve">Turpie, Wilson, Hickinbotham, et al. (2025)</w:t>
-      </w:r>
-      <w:r>
-        <w:t xml:space="preserve">).</w:t>
-      </w:r>
-    </w:p>
-    <w:p>
-      <w:pPr>
-        <w:pStyle w:val="BodyText"/>
-      </w:pPr>
-      <w:r>
-        <w:t xml:space="preserve">The ecosystem condition accounts assess the quality of forest and savanna ecosystems against pristine reference states, using remotely sensed indicators of tree height, tree cover, leaf area index, landscape connectivity, and vegetation indices. A key finding is that no forest ecosystem in Kenya achieved a condition score above 60 percent at the national level across either accounting year, indicating that a significant proportion of the forest estate is in degraded condition relative to a pristine reference state (Table 3.6,</w:t>
-      </w:r>
-      <w:r>
-        <w:t xml:space="preserve"> </w:t>
-      </w:r>
-      <w:r>
-        <w:t xml:space="preserve">Turpie, Wilson, Hickinbotham, et al. (2025)</w:t>
-      </w:r>
-      <w:r>
-        <w:t xml:space="preserve">). Within this picture, montane and western rainforests within protected areas remain comparatively intact, showing that approximately 30 percent of montane forest area was in good or pristine condition in 2018, while coastal forests fared worst, with no pristine areas remaining and over 80 percent falling into the moderate-to-extreme degradation classes. Over 40 percent of Kenya’s remaining natural areas are estimated to be degraded (SPACES, 2023, as cited in</w:t>
-      </w:r>
-      <w:r>
-        <w:t xml:space="preserve"> </w:t>
-      </w:r>
-      <w:r>
-        <w:t xml:space="preserve">Turpie, Wilson, Hickinbotham, et al. (2025)</w:t>
-      </w:r>
-      <w:r>
-        <w:t xml:space="preserve">). The condition accounts provide the spatial diagnostic needed to prioritize conservation and restoration investment. The contrast between well-functioning montane water towers (Mt. Kenya, Aberdares, Mau Complex) and critically degraded coastal and dryland forests is visible in the accounts and can be directly linked to the distribution of ecosystem service values.</w:t>
-      </w:r>
-    </w:p>
-    <w:bookmarkEnd w:id="59"/>
-    <w:bookmarkStart w:id="60" w:name="X003dded87019dbca8c9560b81e8f7ef20833a5a"/>
+    <w:bookmarkStart w:id="59" w:name="X003dded87019dbca8c9560b81e8f7ef20833a5a"/>
     <w:p>
       <w:pPr>
         <w:pStyle w:val="Heading3"/>
@@ -4525,14 +4537,59 @@
         <w:t xml:space="preserve">).</w:t>
       </w:r>
     </w:p>
+    <w:bookmarkEnd w:id="59"/>
+    <w:bookmarkStart w:id="60" w:name="forest-accounts-thematic"/>
+    <w:p>
+      <w:pPr>
+        <w:pStyle w:val="Heading3"/>
+      </w:pPr>
+      <w:r>
+        <w:t xml:space="preserve">4.3.6 Forest Accounts (Thematic)</w:t>
+      </w:r>
+    </w:p>
+    <w:p>
+      <w:pPr>
+        <w:pStyle w:val="FirstParagraph"/>
+      </w:pPr>
+      <w:r>
+        <w:t xml:space="preserve">Kenya’s forest accounts, published as a draft in January 2026, integrate physical asset accounts, supply and use tables for wood products, and an initial framework for monetary forest accounts</w:t>
+      </w:r>
+      <w:r>
+        <w:t xml:space="preserve"> </w:t>
+      </w:r>
+      <w:r>
+        <w:t xml:space="preserve">(Kenya National Bureau of Statistics, 2026b)</w:t>
+      </w:r>
+      <w:r>
+        <w:t xml:space="preserve">. The accounts are anchored in the Kenya Forest Service’s forest estate data and SLEEK-IMPRESS land cover time series, and are designed to inform Kenya’s Vision 2030, NDC commitments, and REDD+ reporting. Forest cover was recorded at 3,591,486 ha (6.07 percent of national land area) in 2024, reduced from 3,934,279 ha (6.65 percent) in 1990. The six forest strata, comprising montane, western rainforest, coastal, mangrove, dryland, and public plantations, reflect Kenya’s full ecological gradient from highland water towers to arid coastal belts. Public plantation forests managed by the Kenya Forest Service cover 152,790 hectares and are the primary source of commercial timber, poles, and charcoal. The Plantation Establishment and Livelihood Improvement Scheme (PELIS) allocates forest-adjacent land to communities for intercropping; profitability of PELIS arrangements was estimated at KSh 50,000 per hectare per year in the accounts, providing a measurable community benefit from forest management (Section 2e,</w:t>
+      </w:r>
+      <w:r>
+        <w:t xml:space="preserve"> </w:t>
+      </w:r>
+      <w:r>
+        <w:t xml:space="preserve">Kenya National Bureau of Statistics (2026b)</w:t>
+      </w:r>
+      <w:r>
+        <w:t xml:space="preserve">).</w:t>
+      </w:r>
+    </w:p>
+    <w:p>
+      <w:pPr>
+        <w:pStyle w:val="BodyText"/>
+      </w:pPr>
+      <w:r>
+        <w:t xml:space="preserve">A distinguishing feature of Kenya’s forest accounts is their integration with the Kenya Macroeconomic and Fiscal Model (KENMOD), which allows forest-related scenarios that include climate shocks to forest extent and the macroeconomic impact of forest restoration investments, to be translated directly into projections for GDP, fiscal revenues, and employment. This link to a macro-fiscal model is rare in the AFE region and positions Kenya to make concrete budget-level arguments for forest conservation that are directly comparable to those of any other economic sector. Monetary accounts for forest ecosystem services remain incomplete at this draft stage, with specific data gaps noted for informal timber flows from private forests and for non-timber forest products. The supply and use table structure for wood products is established, setting the framework for completing monetary valuation in the next edition. As in the ecosystem accounts, the most immediate valuation priorities are carbon sequestration (linked to Kenya’s Climate Change Carbon Markets Regulations 2024), water regulation services from the water towers, and fuelwood valuation given that biomass accounts for more than 1.2 million TJ of Kenya’s annual energy use; a flow that currently passes through the national accounts as essentially unpriced natural input.</w:t>
+      </w:r>
+    </w:p>
     <w:bookmarkEnd w:id="60"/>
-    <w:bookmarkStart w:id="61" w:name="forest-accounts-thematic"/>
-    <w:p>
-      <w:pPr>
-        <w:pStyle w:val="Heading3"/>
-      </w:pPr>
-      <w:r>
-        <w:t xml:space="preserve">4.3.6 Forest Accounts (Thematic)</w:t>
+    <w:bookmarkEnd w:id="61"/>
+    <w:bookmarkStart w:id="63" w:name="madagascar"/>
+    <w:p>
+      <w:pPr>
+        <w:pStyle w:val="Heading2"/>
+      </w:pPr>
+      <w:r>
+        <w:t xml:space="preserve">4.4 Madagascar</w:t>
       </w:r>
     </w:p>
     <w:p>
@@ -4540,51 +4597,6 @@
         <w:pStyle w:val="FirstParagraph"/>
       </w:pPr>
       <w:r>
-        <w:t xml:space="preserve">Kenya’s forest accounts, published as a draft in January 2026, integrate physical asset accounts, supply and use tables for wood products, and an initial framework for monetary forest accounts</w:t>
-      </w:r>
-      <w:r>
-        <w:t xml:space="preserve"> </w:t>
-      </w:r>
-      <w:r>
-        <w:t xml:space="preserve">(Kenya National Bureau of Statistics, 2026b)</w:t>
-      </w:r>
-      <w:r>
-        <w:t xml:space="preserve">. The accounts are anchored in the Kenya Forest Service’s forest estate data and SLEEK-IMPRESS land cover time series, and are designed to inform Kenya’s Vision 2030, NDC commitments, and REDD+ reporting. Forest cover was recorded at 3,591,486 ha (6.07 percent of national land area) in 2024, reduced from 3,934,279 ha (6.65 percent) in 1990. The six forest strata, comprising montane, western rainforest, coastal, mangrove, dryland, and public plantations, reflect Kenya’s full ecological gradient from highland water towers to arid coastal belts. Public plantation forests managed by the Kenya Forest Service cover 152,790 hectares and are the primary source of commercial timber, poles, and charcoal. The Plantation Establishment and Livelihood Improvement Scheme (PELIS) allocates forest-adjacent land to communities for intercropping; profitability of PELIS arrangements was estimated at KSh 50,000 per hectare per year in the accounts, providing a measurable community benefit from forest management (Section 2e,</w:t>
-      </w:r>
-      <w:r>
-        <w:t xml:space="preserve"> </w:t>
-      </w:r>
-      <w:r>
-        <w:t xml:space="preserve">Kenya National Bureau of Statistics (2026b)</w:t>
-      </w:r>
-      <w:r>
-        <w:t xml:space="preserve">).</w:t>
-      </w:r>
-    </w:p>
-    <w:p>
-      <w:pPr>
-        <w:pStyle w:val="BodyText"/>
-      </w:pPr>
-      <w:r>
-        <w:t xml:space="preserve">A distinguishing feature of Kenya’s forest accounts is their integration with the Kenya Macroeconomic and Fiscal Model (KENMOD), which allows forest-related scenarios that include climate shocks to forest extent and the macroeconomic impact of forest restoration investments, to be translated directly into projections for GDP, fiscal revenues, and employment. This link to a macro-fiscal model is rare in the AFE region and positions Kenya to make concrete budget-level arguments for forest conservation that are directly comparable to those of any other economic sector. Monetary accounts for forest ecosystem services remain incomplete at this draft stage, with specific data gaps noted for informal timber flows from private forests and for non-timber forest products. The supply and use table structure for wood products is established, setting the framework for completing monetary valuation in the next edition. As in the ecosystem accounts, the most immediate valuation priorities are carbon sequestration (linked to Kenya’s Climate Change Carbon Markets Regulations 2024), water regulation services from the water towers, and fuelwood valuation given that biomass accounts for more than 1.2 million TJ of Kenya’s annual energy use; a flow that currently passes through the national accounts as essentially unpriced natural input.</w:t>
-      </w:r>
-    </w:p>
-    <w:bookmarkEnd w:id="61"/>
-    <w:bookmarkEnd w:id="62"/>
-    <w:bookmarkStart w:id="64" w:name="madagascar"/>
-    <w:p>
-      <w:pPr>
-        <w:pStyle w:val="Heading2"/>
-      </w:pPr>
-      <w:r>
-        <w:t xml:space="preserve">4.4 Madagascar</w:t>
-      </w:r>
-    </w:p>
-    <w:p>
-      <w:pPr>
-        <w:pStyle w:val="FirstParagraph"/>
-      </w:pPr>
-      <w:r>
         <w:t xml:space="preserve">Madagascar has compiled two SEEA Ecosystem Accounting accounts, covering ecosystem extent and ecosystem condition, based on an integrated landscape assessment covering the period 1992 to 2020</w:t>
       </w:r>
       <w:r>
@@ -4606,7 +4618,7 @@
         <w:t xml:space="preserve">. The accounts nonetheless provide a rich physical baseline with direct policy relevance for investments in nature-based solutions (NBS), watershed management, hydropower protection, and climate finance.</w:t>
       </w:r>
     </w:p>
-    <w:bookmarkStart w:id="63" w:name="X4bd7719fc6def64fe2d6dcb9a1f17d1521418c3"/>
+    <w:bookmarkStart w:id="62" w:name="X4bd7719fc6def64fe2d6dcb9a1f17d1521418c3"/>
     <w:p>
       <w:pPr>
         <w:pStyle w:val="Heading3"/>
@@ -4811,9 +4823,9 @@
         <w:t xml:space="preserve">The accounts do not yet include monetary valuation, and there are no physical supply and use tables disaggregating ecosystem service flows by sector or user group. The economic analysis of hydropower losses, agricultural productivity costs, and carbon opportunity costs was computed as part of the broader BELA landscape assessment (2022-2023) but is presented in a companion report not available in the current data repository. The immediate priorities for completing Madagascar’s ecosystem accounts include publishing the full economic results from the landscape assessment to make the monetary estimates of land degradation costs formally available; disaggregating ecosystem service flows by basin and administrative region using the 22-region database already compiled in the supporting Excel data; extending the analysis beyond 2020 with updated land cover data; and institutionalizing the accounts within INSTAT (Madagascar’s national statistics institute) to enable regular production.</w:t>
       </w:r>
     </w:p>
+    <w:bookmarkEnd w:id="62"/>
     <w:bookmarkEnd w:id="63"/>
-    <w:bookmarkEnd w:id="64"/>
-    <w:bookmarkStart w:id="67" w:name="mauritius"/>
+    <w:bookmarkStart w:id="66" w:name="mauritius"/>
     <w:p>
       <w:pPr>
         <w:pStyle w:val="Heading2"/>
@@ -4855,7 +4867,7 @@
         <w:t xml:space="preserve">. The series covers the years 2021 to 2022 with a time series of selected indicators extending back to 2013. The accounts are based on the SEEA-Water framework and the International Recommendations for Water Statistics (IRWS), and are produced in collaboration with the Water Resources Unit (Ministry of Energy and Public Utilities), the Central Water Authority (CWA), and the Waste Management Authority (WMA). The fact that this is the fifth edition shows that Mauritius has the most institutionalized and regularly produced water accounting system in the AFE region; a model for countries earlier in the SEEA implementation path.</w:t>
       </w:r>
     </w:p>
-    <w:bookmarkStart w:id="65" w:name="X064f4c8ce12b9eb0ca6bbfd741adb1c7657767f"/>
+    <w:bookmarkStart w:id="64" w:name="X064f4c8ce12b9eb0ca6bbfd741adb1c7657767f"/>
     <w:p>
       <w:pPr>
         <w:pStyle w:val="Heading3"/>
@@ -5011,8 +5023,8 @@
         <w:t xml:space="preserve">). The gap between abstraction for drinking water per capita per day (719 L in 2022) and water actually received by households (197 L/day) is almost entirely explained by the UFW rate. Quantifying the economic cost of UFW, in terms of treatment cost, pumping energy, and foregone revenue, would be a natural first application of monetary water accounts in Mauritius, and a compelling policy argument for infrastructure investment.</w:t>
       </w:r>
     </w:p>
-    <w:bookmarkEnd w:id="65"/>
-    <w:bookmarkStart w:id="66" w:name="X38d88034afd71ada4a40f2993d7be217c02cbf4"/>
+    <w:bookmarkEnd w:id="64"/>
+    <w:bookmarkStart w:id="65" w:name="X38d88034afd71ada4a40f2993d7be217c02cbf4"/>
     <w:p>
       <w:pPr>
         <w:pStyle w:val="Heading3"/>
@@ -5065,9 +5077,9 @@
         <w:t xml:space="preserve">Mauritius’s water accounts are physical-only and no monetary water accounts have been compiled. The most obvious extension is the monetisation of UFW losses, which would quantify the annual financial cost to the utility of distribution infrastructure deterioration. A second priority is developing monetary supply and use tables that assign the economic value of water abstraction to each sector, with particular emphasis on agriculture, which consumes the largest net volume, and hydropower, whose share of the electricity mix is growing. The accounts also do not yet extend to the outer islands of Mauritius (Rodrigues, Agaléga, and St Brandon), all of which face distinct water availability challenges given their remote location and limited groundwater resources.</w:t>
       </w:r>
     </w:p>
+    <w:bookmarkEnd w:id="65"/>
     <w:bookmarkEnd w:id="66"/>
-    <w:bookmarkEnd w:id="67"/>
-    <w:bookmarkStart w:id="71" w:name="rwanda"/>
+    <w:bookmarkStart w:id="70" w:name="rwanda"/>
     <w:p>
       <w:pPr>
         <w:pStyle w:val="Heading2"/>
@@ -5102,7 +5114,7 @@
         <w:t xml:space="preserve">).</w:t>
       </w:r>
     </w:p>
-    <w:bookmarkStart w:id="68" w:name="Xf0a52a84dd0c279817148ae15f950b7ab87f8c7"/>
+    <w:bookmarkStart w:id="67" w:name="Xf0a52a84dd0c279817148ae15f950b7ab87f8c7"/>
     <w:p>
       <w:pPr>
         <w:pStyle w:val="Heading3"/>
@@ -5327,8 +5339,8 @@
         <w:t xml:space="preserve">), indicating that sedimentation from watershed erosion is already materially reducing storage capacity.</w:t>
       </w:r>
     </w:p>
-    <w:bookmarkEnd w:id="68"/>
-    <w:bookmarkStart w:id="69" w:name="physical-asset-accounts-for-land-seea-cf"/>
+    <w:bookmarkEnd w:id="67"/>
+    <w:bookmarkStart w:id="68" w:name="physical-asset-accounts-for-land-seea-cf"/>
     <w:p>
       <w:pPr>
         <w:pStyle w:val="Heading3"/>
@@ -5486,8 +5498,8 @@
         <w:t xml:space="preserve">), providing direct motivation for accounting for the degradation of the land asset.</w:t>
       </w:r>
     </w:p>
-    <w:bookmarkEnd w:id="69"/>
-    <w:bookmarkStart w:id="70" w:name="Xb7303c525ee1274e0d4b80db39358361130d422"/>
+    <w:bookmarkEnd w:id="68"/>
+    <w:bookmarkStart w:id="69" w:name="Xb7303c525ee1274e0d4b80db39358361130d422"/>
     <w:p>
       <w:pPr>
         <w:pStyle w:val="Heading3"/>
@@ -5648,9 +5660,9 @@
         <w:t xml:space="preserve">).</w:t>
       </w:r>
     </w:p>
+    <w:bookmarkEnd w:id="69"/>
     <w:bookmarkEnd w:id="70"/>
-    <w:bookmarkEnd w:id="71"/>
-    <w:bookmarkStart w:id="74" w:name="sec-annex-uga"/>
+    <w:bookmarkStart w:id="73" w:name="sec-annex-uga"/>
     <w:p>
       <w:pPr>
         <w:pStyle w:val="Heading2"/>
@@ -5685,7 +5697,7 @@
         <w:t xml:space="preserve">, yet forest cover fell by 60 percent between 1990 and 2015. Uganda’s water resources are enormous, with total abstraction reaching approximately 499 billion m³ per year including rainfed agriculture, but institutional use efficiency is declining and distribution losses remain high.</w:t>
       </w:r>
     </w:p>
-    <w:bookmarkStart w:id="72" w:name="X822d7b1234310ce029b9591d664c3145da3de92"/>
+    <w:bookmarkStart w:id="71" w:name="X822d7b1234310ce029b9591d664c3145da3de92"/>
     <w:p>
       <w:pPr>
         <w:pStyle w:val="Heading3"/>
@@ -5831,8 +5843,8 @@
         <w:t xml:space="preserve">).</w:t>
       </w:r>
     </w:p>
-    <w:bookmarkEnd w:id="72"/>
-    <w:bookmarkStart w:id="73" w:name="X29de7f446b55781823283ba92c3d64aad25d046"/>
+    <w:bookmarkEnd w:id="71"/>
+    <w:bookmarkStart w:id="72" w:name="X29de7f446b55781823283ba92c3d64aad25d046"/>
     <w:p>
       <w:pPr>
         <w:pStyle w:val="Heading3"/>
@@ -6115,9 +6127,9 @@
         <w:t xml:space="preserve">), indicating very large informal and subsistence flows that are accounted for but not commercially intermediated.</w:t>
       </w:r>
     </w:p>
+    <w:bookmarkEnd w:id="72"/>
     <w:bookmarkEnd w:id="73"/>
-    <w:bookmarkEnd w:id="74"/>
-    <w:bookmarkStart w:id="79" w:name="sec-annex-zaf"/>
+    <w:bookmarkStart w:id="78" w:name="sec-annex-zaf"/>
     <w:p>
       <w:pPr>
         <w:pStyle w:val="Heading2"/>
@@ -6134,7 +6146,7 @@
         <w:t xml:space="preserve">South Africa operates the most comprehensive natural capital accounting programme in the AFE region. Statistics South Africa (Stats SA) has published seven volumes in its Natural Capital Series, with accounts covering water (including the unique distinction of water emission accounts), energy, land, ecosystem extent, ecosystem services, and protected areas. South Africa’s seven compiled accounts span 1990-2022 and collectively demonstrate a country in which physical natural capital trends are mixed. For example, natural vegetation is largely stable nationally but under acute pressure in water-producing highlands, while energy accounts reveal extreme coal dependency alongside accelerating oil import exposure. Biodiversity-based tourism has been quantified and linked to GDP, providing the only monetary ecosystem services estimate in the AFE region outside Kenya.</w:t>
       </w:r>
     </w:p>
-    <w:bookmarkStart w:id="75" w:name="X5e96fa576f4ec963475a7cee9c19c21cfbbdba8"/>
+    <w:bookmarkStart w:id="74" w:name="X5e96fa576f4ec963475a7cee9c19c21cfbbdba8"/>
     <w:p>
       <w:pPr>
         <w:pStyle w:val="Heading3"/>
@@ -6277,8 +6289,8 @@
         <w:t xml:space="preserve">). Forests cover 2.2 percent but account for 47.8 percent of the national forest biome within SWSAs, underscoring the water-provisioning role of afforested landscapes. The accounts note that no single TRWR or sector abstraction table is reported within the SWSA accounts, because these are addressed in the parallel national water accounts.</w:t>
       </w:r>
     </w:p>
-    <w:bookmarkEnd w:id="75"/>
-    <w:bookmarkStart w:id="76" w:name="Xb48975ff9bee3588d04c86335a4c1c6bb1a6b7b"/>
+    <w:bookmarkEnd w:id="74"/>
+    <w:bookmarkStart w:id="75" w:name="Xb48975ff9bee3588d04c86335a4c1c6bb1a6b7b"/>
     <w:p>
       <w:pPr>
         <w:pStyle w:val="Heading3"/>
@@ -6412,8 +6424,8 @@
         <w:t xml:space="preserve">). Mining energy intensity reached 1.21 TJ per R million of GVA in 2022, the highest intensity among all sectors, highlighting the resource-intensive nature of the economy’s dominant export industry.</w:t>
       </w:r>
     </w:p>
-    <w:bookmarkEnd w:id="76"/>
-    <w:bookmarkStart w:id="77" w:name="Xdd8c2de368b25a1ded124bfd8265f90c8b3316b"/>
+    <w:bookmarkEnd w:id="75"/>
+    <w:bookmarkStart w:id="76" w:name="Xdd8c2de368b25a1ded124bfd8265f90c8b3316b"/>
     <w:p>
       <w:pPr>
         <w:pStyle w:val="Heading3"/>
@@ -6556,8 +6568,8 @@
         <w:t xml:space="preserve">).</w:t>
       </w:r>
     </w:p>
-    <w:bookmarkEnd w:id="77"/>
-    <w:bookmarkStart w:id="78" w:name="X4389d65ac4b60d33cc39a341a8500bca1625c5f"/>
+    <w:bookmarkEnd w:id="76"/>
+    <w:bookmarkStart w:id="77" w:name="X4389d65ac4b60d33cc39a341a8500bca1625c5f"/>
     <w:p>
       <w:pPr>
         <w:pStyle w:val="Heading3"/>
@@ -6704,7 +6716,13 @@
         <w:t xml:space="preserve"> </w:t>
       </w:r>
       <w:r>
-        <w:t xml:space="preserve">(Niekerk et al., 2020)</w:t>
+        <w:t xml:space="preserve">(</w:t>
+      </w:r>
+      <w:r>
+        <w:t xml:space="preserve">Niekerk et al.</w:t>
+      </w:r>
+      <w:r>
+        <w:t xml:space="preserve">, 2020)</w:t>
       </w:r>
       <w:r>
         <w:t xml:space="preserve"> </w:t>
@@ -6716,7 +6734,13 @@
         <w:t xml:space="preserve"> </w:t>
       </w:r>
       <w:r>
-        <w:t xml:space="preserve">Niekerk et al. (2020)</w:t>
+        <w:t xml:space="preserve">Niekerk et al.</w:t>
+      </w:r>
+      <w:r>
+        <w:t xml:space="preserve"> </w:t>
+      </w:r>
+      <w:r>
+        <w:t xml:space="preserve">(2020)</w:t>
       </w:r>
       <w:r>
         <w:t xml:space="preserve">). The accounts report that approximately 12,000 million m³ per year of freshwater is abstracted upstream of estuaries, with only 67 percent of natural flows now reaching estuarine systems (Table 6.1,</w:t>
@@ -6725,7 +6749,13 @@
         <w:t xml:space="preserve"> </w:t>
       </w:r>
       <w:r>
-        <w:t xml:space="preserve">Niekerk et al. (2020)</w:t>
+        <w:t xml:space="preserve">Niekerk et al.</w:t>
+      </w:r>
+      <w:r>
+        <w:t xml:space="preserve"> </w:t>
+      </w:r>
+      <w:r>
+        <w:t xml:space="preserve">(2020)</w:t>
       </w:r>
       <w:r>
         <w:t xml:space="preserve">). Key physical ecosystem services findings include net blue carbon sequestration potential lost since 1750 is approximately 1.37 million tonnes (Table 7.1,</w:t>
@@ -6734,7 +6764,13 @@
         <w:t xml:space="preserve"> </w:t>
       </w:r>
       <w:r>
-        <w:t xml:space="preserve">Niekerk et al. (2020)</w:t>
+        <w:t xml:space="preserve">Niekerk et al.</w:t>
+      </w:r>
+      <w:r>
+        <w:t xml:space="preserve"> </w:t>
+      </w:r>
+      <w:r>
+        <w:t xml:space="preserve">(2020)</w:t>
       </w:r>
       <w:r>
         <w:t xml:space="preserve">); fish nursery function is severely degraded, where dusky kob spawner biomass per recruit (SBPR) is below 2 percent of pristine, and 70-94 percent of key nursery habitats are under high or very high fishing pressure (Table 7.2,</w:t>
@@ -6743,7 +6779,13 @@
         <w:t xml:space="preserve"> </w:t>
       </w:r>
       <w:r>
-        <w:t xml:space="preserve">Niekerk et al. (2020)</w:t>
+        <w:t xml:space="preserve">Niekerk et al.</w:t>
+      </w:r>
+      <w:r>
+        <w:t xml:space="preserve"> </w:t>
+      </w:r>
+      <w:r>
+        <w:t xml:space="preserve">(2020)</w:t>
       </w:r>
       <w:r>
         <w:t xml:space="preserve">); and sawfish are now extinct in South Africa, with genetic exchange declining 15-21 percent for listed endemic species (Table 7.3,</w:t>
@@ -6752,7 +6794,13 @@
         <w:t xml:space="preserve"> </w:t>
       </w:r>
       <w:r>
-        <w:t xml:space="preserve">Niekerk et al. (2020)</w:t>
+        <w:t xml:space="preserve">Niekerk et al.</w:t>
+      </w:r>
+      <w:r>
+        <w:t xml:space="preserve"> </w:t>
+      </w:r>
+      <w:r>
+        <w:t xml:space="preserve">(2020)</w:t>
       </w:r>
       <w:r>
         <w:t xml:space="preserve">). The accounts flag that fish condition is</w:t>
@@ -6770,9 +6818,9 @@
         <w:t xml:space="preserve">in only 4 percent of assessed estuaries, with alien fish present in 25 percent, underscoring the dual pressures of flow reduction and biological degradation.</w:t>
       </w:r>
     </w:p>
+    <w:bookmarkEnd w:id="77"/>
     <w:bookmarkEnd w:id="78"/>
-    <w:bookmarkEnd w:id="79"/>
-    <w:bookmarkStart w:id="114" w:name="sec-annex-zmb"/>
+    <w:bookmarkStart w:id="113" w:name="sec-annex-zmb"/>
     <w:p>
       <w:pPr>
         <w:pStyle w:val="Heading2"/>
@@ -6833,7 +6881,7 @@
         <w:t xml:space="preserve">. Both were produced by the Ministry of Finance and National Planning with World Bank support under the Global Program on Sustainability (GPS). The government notes that approximately 40 percent of Zambia’s national income derives from natural resources, motivating the full integration of natural capital accounts into the Eighth National Development Plan. The accounting period covers 2018-2023, a window defined by major floods and culminating in the catastrophic 2023/24 El Niño drought, which was declared a national disaster, affected more than one million farming households, and caused near-total failure of the staple maize crop.</w:t>
       </w:r>
     </w:p>
-    <w:bookmarkStart w:id="80" w:name="Xc097e6bcce429a89bc1330e173bda51075fdde8"/>
+    <w:bookmarkStart w:id="79" w:name="Xc097e6bcce429a89bc1330e173bda51075fdde8"/>
     <w:p>
       <w:pPr>
         <w:pStyle w:val="Heading3"/>
@@ -6976,8 +7024,8 @@
         <w:t xml:space="preserve">).</w:t>
       </w:r>
     </w:p>
-    <w:bookmarkEnd w:id="80"/>
-    <w:bookmarkStart w:id="81" w:name="X91635b0beeda506739c2fb2f0557667695f4427"/>
+    <w:bookmarkEnd w:id="79"/>
+    <w:bookmarkStart w:id="80" w:name="X91635b0beeda506739c2fb2f0557667695f4427"/>
     <w:p>
       <w:pPr>
         <w:pStyle w:val="Heading3"/>
@@ -7039,8 +7087,8 @@
         <w:t xml:space="preserve">). The accounts note that the reduction in pole supply corresponds to declining net primary productivity and carbon storage.</w:t>
       </w:r>
     </w:p>
-    <w:bookmarkEnd w:id="81"/>
-    <w:bookmarkStart w:id="82" w:name="Xfda2b39fe8d3c04e8700f26d462793e51bbf9da"/>
+    <w:bookmarkEnd w:id="80"/>
+    <w:bookmarkStart w:id="81" w:name="Xfda2b39fe8d3c04e8700f26d462793e51bbf9da"/>
     <w:p>
       <w:pPr>
         <w:pStyle w:val="Heading3"/>
@@ -7129,8 +7177,8 @@
         <w:t xml:space="preserve">). Water quality hotspots are documented in the Copperbelt (Kafue River, heavy metals from mining acid drainage) and Lusaka (pathogen contamination from septic systems and urban effluents contributing to cholera outbreaks).</w:t>
       </w:r>
     </w:p>
-    <w:bookmarkEnd w:id="82"/>
-    <w:bookmarkStart w:id="83" w:name="ecosystem-extent-accounts-seea-ea"/>
+    <w:bookmarkEnd w:id="81"/>
+    <w:bookmarkStart w:id="82" w:name="ecosystem-extent-accounts-seea-ea"/>
     <w:p>
       <w:pPr>
         <w:pStyle w:val="Heading3"/>
@@ -7183,8 +7231,8 @@
         <w:t xml:space="preserve">). The Net Present Value of this carbon loss is estimated at USD 46 million (2018-2023), providing the only monetary ecosystem services estimate available for Zambia. Average annual Net Primary Productivity (NPP) declined by 150 kgC/m²/year and GPP by 233 kgC/m²/year over the same period, which can be interpreted from an ecological standpoint as reduced vegetation health linked to woodland degradation and drought stress.</w:t>
       </w:r>
     </w:p>
-    <w:bookmarkEnd w:id="83"/>
-    <w:bookmarkStart w:id="113" w:name="protected-areas-accounts-thematic"/>
+    <w:bookmarkEnd w:id="82"/>
+    <w:bookmarkStart w:id="112" w:name="protected-areas-accounts-thematic"/>
     <w:p>
       <w:pPr>
         <w:pStyle w:val="Heading3"/>
@@ -7219,8 +7267,8 @@
         <w:t xml:space="preserve">). Safari hunting accounts for between 70 and 80 percent of total bush meat supply and more than 90 percent of revenue. The accounts note that Zambia’s national parks (South Luangwa, Kafue, and Lower Zambezi) anchor an eco-tourism industry that contributes to GDP and provides rural employment, but quantitative national totals for tourism revenue have not yet been compiled within the formal NCA framework.</w:t>
       </w:r>
     </w:p>
-    <w:bookmarkStart w:id="112" w:name="refs"/>
-    <w:bookmarkStart w:id="84" w:name="ref-zambia_ecosystem_account_2026"/>
+    <w:bookmarkStart w:id="111" w:name="refs"/>
+    <w:bookmarkStart w:id="83" w:name="ref-zambia_ecosystem_account_2026"/>
     <w:p>
       <w:pPr>
         <w:pStyle w:val="Bibliography"/>
@@ -7242,8 +7290,8 @@
         <w:t xml:space="preserve">. Ministry of Finance; National Planning, Government of the Republic of Zambia / World Bank.</w:t>
       </w:r>
     </w:p>
-    <w:bookmarkEnd w:id="84"/>
-    <w:bookmarkStart w:id="85" w:name="ref-zambia_nca_compendium_2026"/>
+    <w:bookmarkEnd w:id="83"/>
+    <w:bookmarkStart w:id="84" w:name="ref-zambia_nca_compendium_2026"/>
     <w:p>
       <w:pPr>
         <w:pStyle w:val="Bibliography"/>
@@ -7265,8 +7313,8 @@
         <w:t xml:space="preserve">. Ministry of Finance; National Planning, Government of the Republic of Zambia / World Bank.</w:t>
       </w:r>
     </w:p>
-    <w:bookmarkEnd w:id="85"/>
-    <w:bookmarkStart w:id="86" w:name="ref-european_commission_system_2013"/>
+    <w:bookmarkEnd w:id="84"/>
+    <w:bookmarkStart w:id="85" w:name="ref-european_commission_system_2013"/>
     <w:p>
       <w:pPr>
         <w:pStyle w:val="Bibliography"/>
@@ -7344,8 +7392,8 @@
         <w:t xml:space="preserve">. United Nations.</w:t>
       </w:r>
     </w:p>
-    <w:bookmarkEnd w:id="86"/>
-    <w:bookmarkStart w:id="87" w:name="ref-government_of_ethiopia_land_2026"/>
+    <w:bookmarkEnd w:id="85"/>
+    <w:bookmarkStart w:id="86" w:name="ref-government_of_ethiopia_land_2026"/>
     <w:p>
       <w:pPr>
         <w:pStyle w:val="Bibliography"/>
@@ -7430,8 +7478,8 @@
         <w:t xml:space="preserve">. Ministry of Planning; Development, Federal Democratic Republic of Ethiopia.</w:t>
       </w:r>
     </w:p>
-    <w:bookmarkEnd w:id="87"/>
-    <w:bookmarkStart w:id="88" w:name="ref-nisr_rwanda_land_2018"/>
+    <w:bookmarkEnd w:id="86"/>
+    <w:bookmarkStart w:id="87" w:name="ref-nisr_rwanda_land_2018"/>
     <w:p>
       <w:pPr>
         <w:pStyle w:val="Bibliography"/>
@@ -7453,8 +7501,8 @@
         <w:t xml:space="preserve">. National Institute of Statistics of Rwanda / Ministry of Environment / MINILAF.</w:t>
       </w:r>
     </w:p>
-    <w:bookmarkEnd w:id="88"/>
-    <w:bookmarkStart w:id="89" w:name="ref-nisr_rwanda_ecosystem_2019"/>
+    <w:bookmarkEnd w:id="87"/>
+    <w:bookmarkStart w:id="88" w:name="ref-nisr_rwanda_ecosystem_2019"/>
     <w:p>
       <w:pPr>
         <w:pStyle w:val="Bibliography"/>
@@ -7476,8 +7524,8 @@
         <w:t xml:space="preserve">. National Institute of Statistics of Rwanda / Ministry of Environment / MINECOFIN.</w:t>
       </w:r>
     </w:p>
-    <w:bookmarkEnd w:id="89"/>
-    <w:bookmarkStart w:id="90" w:name="ref-nisr_rwanda_water_2019"/>
+    <w:bookmarkEnd w:id="88"/>
+    <w:bookmarkStart w:id="89" w:name="ref-nisr_rwanda_water_2019"/>
     <w:p>
       <w:pPr>
         <w:pStyle w:val="Bibliography"/>
@@ -7499,8 +7547,8 @@
         <w:t xml:space="preserve">. National Institute of Statistics of Rwanda / Ministry of Environment.</w:t>
       </w:r>
     </w:p>
-    <w:bookmarkEnd w:id="90"/>
-    <w:bookmarkStart w:id="91" w:name="ref-knbs_energy_2026"/>
+    <w:bookmarkEnd w:id="89"/>
+    <w:bookmarkStart w:id="90" w:name="ref-knbs_energy_2026"/>
     <w:p>
       <w:pPr>
         <w:pStyle w:val="Bibliography"/>
@@ -7522,8 +7570,8 @@
         <w:t xml:space="preserve">. Kenya National Bureau of Statistics.</w:t>
       </w:r>
     </w:p>
-    <w:bookmarkEnd w:id="91"/>
-    <w:bookmarkStart w:id="92" w:name="ref-knbs_forest_2026"/>
+    <w:bookmarkEnd w:id="90"/>
+    <w:bookmarkStart w:id="91" w:name="ref-knbs_forest_2026"/>
     <w:p>
       <w:pPr>
         <w:pStyle w:val="Bibliography"/>
@@ -7545,8 +7593,8 @@
         <w:t xml:space="preserve">. Kenya National Bureau of Statistics.</w:t>
       </w:r>
     </w:p>
-    <w:bookmarkEnd w:id="92"/>
-    <w:bookmarkStart w:id="93" w:name="ref-mefcc_forest_2017"/>
+    <w:bookmarkEnd w:id="91"/>
+    <w:bookmarkStart w:id="92" w:name="ref-mefcc_forest_2017"/>
     <w:p>
       <w:pPr>
         <w:pStyle w:val="Bibliography"/>
@@ -7568,14 +7616,17 @@
         <w:t xml:space="preserve">. Ministry of Environment, Forest; Climate Change, Federal Democratic Republic of Ethiopia.</w:t>
       </w:r>
     </w:p>
-    <w:bookmarkEnd w:id="93"/>
-    <w:bookmarkStart w:id="94" w:name="ref-csir_estuaries_2020"/>
+    <w:bookmarkEnd w:id="92"/>
+    <w:bookmarkStart w:id="93" w:name="ref-csir_estuaries_2020"/>
     <w:p>
       <w:pPr>
         <w:pStyle w:val="Bibliography"/>
       </w:pPr>
       <w:r>
-        <w:t xml:space="preserve">Niekerk, L. van, Taljaard, S., et al. (2020).</w:t>
+        <w:t xml:space="preserve">Niekerk, L. van, Taljaard, S., et al.</w:t>
+      </w:r>
+      <w:r>
+        <w:t xml:space="preserve"> (2020).</w:t>
       </w:r>
       <w:r>
         <w:t xml:space="preserve"> </w:t>
@@ -7594,14 +7645,17 @@
         <w:t xml:space="preserve">(CSIR/SPLA/SECO/IR/2020/0026/A). CSIR Smart Places.</w:t>
       </w:r>
     </w:p>
-    <w:bookmarkEnd w:id="94"/>
-    <w:bookmarkStart w:id="96" w:name="ref-nkonya_economics_2016"/>
+    <w:bookmarkEnd w:id="93"/>
+    <w:bookmarkStart w:id="95" w:name="ref-nkonya_economics_2016"/>
     <w:p>
       <w:pPr>
         <w:pStyle w:val="Bibliography"/>
       </w:pPr>
       <w:r>
-        <w:t xml:space="preserve">Nkonya, E., Mirzabaev, A., &amp; von Braun, J. (Eds.). (2016).</w:t>
+        <w:t xml:space="preserve">Nkonya, E., Mirzabaev, A., &amp; von Braun, J. (Eds.)</w:t>
+      </w:r>
+      <w:r>
+        <w:t xml:space="preserve">. (2016).</w:t>
       </w:r>
       <w:r>
         <w:t xml:space="preserve"> </w:t>
@@ -7647,7 +7701,7 @@
       <w:r>
         <w:t xml:space="preserve"> </w:t>
       </w:r>
-      <w:hyperlink r:id="rId95">
+      <w:hyperlink r:id="rId94">
         <w:r>
           <w:rPr>
             <w:rStyle w:val="Hyperlink"/>
@@ -7656,8 +7710,8 @@
         </w:r>
       </w:hyperlink>
     </w:p>
-    <w:bookmarkEnd w:id="96"/>
-    <w:bookmarkStart w:id="97" w:name="ref-rutebuka_ethiopia_2025"/>
+    <w:bookmarkEnd w:id="95"/>
+    <w:bookmarkStart w:id="96" w:name="ref-rutebuka_ethiopia_2025"/>
     <w:p>
       <w:pPr>
         <w:pStyle w:val="Bibliography"/>
@@ -7700,8 +7754,8 @@
         <w:t xml:space="preserve">. NatCap Insights.</w:t>
       </w:r>
     </w:p>
-    <w:bookmarkEnd w:id="97"/>
-    <w:bookmarkStart w:id="98" w:name="ref-soulard_kenya_land_2025"/>
+    <w:bookmarkEnd w:id="96"/>
+    <w:bookmarkStart w:id="97" w:name="ref-soulard_kenya_land_2025"/>
     <w:p>
       <w:pPr>
         <w:pStyle w:val="Bibliography"/>
@@ -7765,8 +7819,8 @@
         <w:t xml:space="preserve">. World Bank Global Program on Sustainability.</w:t>
       </w:r>
     </w:p>
-    <w:bookmarkEnd w:id="98"/>
-    <w:bookmarkStart w:id="99" w:name="ref-statsmauritius_water_2024"/>
+    <w:bookmarkEnd w:id="97"/>
+    <w:bookmarkStart w:id="98" w:name="ref-statsmauritius_water_2024"/>
     <w:p>
       <w:pPr>
         <w:pStyle w:val="Bibliography"/>
@@ -7788,8 +7842,8 @@
         <w:t xml:space="preserve">. Statistics Mauritius, Ministry of Finance.</w:t>
       </w:r>
     </w:p>
-    <w:bookmarkEnd w:id="99"/>
-    <w:bookmarkStart w:id="100" w:name="ref-statssa_land_2020"/>
+    <w:bookmarkEnd w:id="98"/>
+    <w:bookmarkStart w:id="99" w:name="ref-statssa_land_2020"/>
     <w:p>
       <w:pPr>
         <w:pStyle w:val="Bibliography"/>
@@ -7814,8 +7868,8 @@
         <w:t xml:space="preserve">(D0401.1). Statistics South Africa.</w:t>
       </w:r>
     </w:p>
-    <w:bookmarkEnd w:id="100"/>
-    <w:bookmarkStart w:id="101" w:name="ref-statssa_protected_areas_2021"/>
+    <w:bookmarkEnd w:id="99"/>
+    <w:bookmarkStart w:id="100" w:name="ref-statssa_protected_areas_2021"/>
     <w:p>
       <w:pPr>
         <w:pStyle w:val="Bibliography"/>
@@ -7840,8 +7894,8 @@
         <w:t xml:space="preserve">(D0401.2). Statistics South Africa.</w:t>
       </w:r>
     </w:p>
-    <w:bookmarkEnd w:id="101"/>
-    <w:bookmarkStart w:id="102" w:name="ref-statssa_water_swsa_2023"/>
+    <w:bookmarkEnd w:id="100"/>
+    <w:bookmarkStart w:id="101" w:name="ref-statssa_water_swsa_2023"/>
     <w:p>
       <w:pPr>
         <w:pStyle w:val="Bibliography"/>
@@ -7866,8 +7920,8 @@
         <w:t xml:space="preserve">(D0401.3). Statistics South Africa.</w:t>
       </w:r>
     </w:p>
-    <w:bookmarkEnd w:id="102"/>
-    <w:bookmarkStart w:id="103" w:name="ref-statssa_biodiversity_tourism_2024"/>
+    <w:bookmarkEnd w:id="101"/>
+    <w:bookmarkStart w:id="102" w:name="ref-statssa_biodiversity_tourism_2024"/>
     <w:p>
       <w:pPr>
         <w:pStyle w:val="Bibliography"/>
@@ -7892,8 +7946,8 @@
         <w:t xml:space="preserve">(D0401.5). Statistics South Africa.</w:t>
       </w:r>
     </w:p>
-    <w:bookmarkEnd w:id="103"/>
-    <w:bookmarkStart w:id="104" w:name="ref-statssa_energy_2025"/>
+    <w:bookmarkEnd w:id="102"/>
+    <w:bookmarkStart w:id="103" w:name="ref-statssa_energy_2025"/>
     <w:p>
       <w:pPr>
         <w:pStyle w:val="Bibliography"/>
@@ -7918,8 +7972,8 @@
         <w:t xml:space="preserve">(D0401.7). Statistics South Africa.</w:t>
       </w:r>
     </w:p>
-    <w:bookmarkEnd w:id="104"/>
-    <w:bookmarkStart w:id="105" w:name="ref-worldbank_drc_forest_2025"/>
+    <w:bookmarkEnd w:id="103"/>
+    <w:bookmarkStart w:id="104" w:name="ref-worldbank_drc_forest_2025"/>
     <w:p>
       <w:pPr>
         <w:pStyle w:val="Bibliography"/>
@@ -7941,8 +7995,8 @@
         <w:t xml:space="preserve">. World Bank Group.</w:t>
       </w:r>
     </w:p>
-    <w:bookmarkEnd w:id="105"/>
-    <w:bookmarkStart w:id="106" w:name="ref-turpie_kenya_ecosystem_2025"/>
+    <w:bookmarkEnd w:id="104"/>
+    <w:bookmarkStart w:id="105" w:name="ref-turpie_kenya_ecosystem_2025"/>
     <w:p>
       <w:pPr>
         <w:pStyle w:val="Bibliography"/>
@@ -7985,8 +8039,8 @@
         <w:t xml:space="preserve">. Kenya National Bureau of Statistics / Anchor Environmental Consultants.</w:t>
       </w:r>
     </w:p>
-    <w:bookmarkEnd w:id="106"/>
-    <w:bookmarkStart w:id="107" w:name="ref-ubos_uganda_forest_2020"/>
+    <w:bookmarkEnd w:id="105"/>
+    <w:bookmarkStart w:id="106" w:name="ref-ubos_uganda_forest_2020"/>
     <w:p>
       <w:pPr>
         <w:pStyle w:val="Bibliography"/>
@@ -8008,8 +8062,8 @@
         <w:t xml:space="preserve">. Uganda Bureau of Statistics / Ministry of Finance, Planning; Economic Development / Ministry of Water; Environment / National Planning Authority.</w:t>
       </w:r>
     </w:p>
-    <w:bookmarkEnd w:id="107"/>
-    <w:bookmarkStart w:id="108" w:name="ref-ubos_uganda_water_2025"/>
+    <w:bookmarkEnd w:id="106"/>
+    <w:bookmarkStart w:id="107" w:name="ref-ubos_uganda_water_2025"/>
     <w:p>
       <w:pPr>
         <w:pStyle w:val="Bibliography"/>
@@ -8031,8 +8085,8 @@
         <w:t xml:space="preserve">. Uganda Bureau of Statistics.</w:t>
       </w:r>
     </w:p>
-    <w:bookmarkEnd w:id="108"/>
-    <w:bookmarkStart w:id="109" w:name="ref-unep_contribution_2016"/>
+    <w:bookmarkEnd w:id="107"/>
+    <w:bookmarkStart w:id="108" w:name="ref-unep_contribution_2016"/>
     <w:p>
       <w:pPr>
         <w:pStyle w:val="Bibliography"/>
@@ -8082,8 +8136,8 @@
         <w:t xml:space="preserve">. United Nations Environment Programme.</w:t>
       </w:r>
     </w:p>
-    <w:bookmarkEnd w:id="109"/>
-    <w:bookmarkStart w:id="110" w:name="ref-vogl_madagascar_2022"/>
+    <w:bookmarkEnd w:id="108"/>
+    <w:bookmarkStart w:id="109" w:name="ref-vogl_madagascar_2022"/>
     <w:p>
       <w:pPr>
         <w:pStyle w:val="Bibliography"/>
@@ -8105,8 +8159,8 @@
         <w:t xml:space="preserve">. World Bank.</w:t>
       </w:r>
     </w:p>
-    <w:bookmarkEnd w:id="110"/>
-    <w:bookmarkStart w:id="111" w:name="ref-worldbank_kenya_water_energy_2025"/>
+    <w:bookmarkEnd w:id="109"/>
+    <w:bookmarkStart w:id="110" w:name="ref-worldbank_kenya_water_energy_2025"/>
     <w:p>
       <w:pPr>
         <w:pStyle w:val="Bibliography"/>
@@ -8128,13 +8182,13 @@
         <w:t xml:space="preserve">. World Bank Global Program on Sustainability.</w:t>
       </w:r>
     </w:p>
+    <w:bookmarkEnd w:id="110"/>
     <w:bookmarkEnd w:id="111"/>
     <w:bookmarkEnd w:id="112"/>
     <w:bookmarkEnd w:id="113"/>
     <w:bookmarkEnd w:id="114"/>
-    <w:bookmarkEnd w:id="115"/>
     <w:sectPr>
-      <w:footerReference r:id="rId9" w:type="default"/>
+      <w:footerReference r:id="rId10" w:type="default"/>
       <w:footnotePr>
         <w:numRestart w:val="eachSect"/>
       </w:footnotePr>

</xml_diff>